<commit_message>
Quitar descripción de casos de uso de la documentación
Co-Authored-By: Claude Opus 5.5 <noreply@anthropic.com>
Claude-Session: https://claude.ai/code/session_01WUZ6iRk4AHLpaQU9ro5Qut
</commit_message>
<xml_diff>
--- a/ClinicaMiniPtc/Documentacion/Documentacion_ClinicaMiniPtc.docx
+++ b/ClinicaMiniPtc/Documentacion/Documentacion_ClinicaMiniPtc.docx
@@ -477,1171 +477,6 @@
         <w:t>Figura 3. Casos de uso — Administrador.</w:t>
       </w:r>
     </w:p>
-    <w:p>
-      <w:r>
-        <w:br w:type="page"/>
-      </w:r>
-    </w:p>
-    <w:p>
-      <w:pPr>
-        <w:pStyle w:val="Heading2"/>
-      </w:pPr>
-      <w:r>
-        <w:t>2.4 Descripción de los casos de uso</w:t>
-      </w:r>
-    </w:p>
-    <w:tbl>
-      <w:tblPr>
-        <w:tblStyle w:val="TableGrid"/>
-        <w:tblW w:type="auto" w:w="0"/>
-        <w:jc w:val="center"/>
-        <w:tblLayout w:type="fixed"/>
-        <w:tblLook w:firstColumn="1" w:firstRow="1" w:lastColumn="0" w:lastRow="0" w:noHBand="0" w:noVBand="1" w:val="04A0"/>
-      </w:tblPr>
-      <w:tblGrid>
-        <w:gridCol w:w="907"/>
-        <w:gridCol w:w="1927"/>
-        <w:gridCol w:w="1871"/>
-        <w:gridCol w:w="4365"/>
-      </w:tblGrid>
-      <w:tr>
-        <w:trPr>
-          <w:cantSplit/>
-          <w:tblHeader/>
-        </w:trPr>
-        <w:tc>
-          <w:tcPr>
-            <w:tcW w:type="dxa" w:w="907"/>
-            <w:shd w:val="clear" w:color="auto" w:fill="9B1C1F"/>
-          </w:tcPr>
-          <w:p>
-            <w:pPr>
-              <w:jc w:val="left"/>
-            </w:pPr>
-            <w:r/>
-            <w:r>
-              <w:rPr>
-                <w:b/>
-                <w:color w:val="FFFFFF"/>
-                <w:sz w:val="21"/>
-              </w:rPr>
-              <w:t>Código</w:t>
-            </w:r>
-          </w:p>
-        </w:tc>
-        <w:tc>
-          <w:tcPr>
-            <w:tcW w:type="dxa" w:w="1928"/>
-            <w:shd w:val="clear" w:color="auto" w:fill="9B1C1F"/>
-          </w:tcPr>
-          <w:p>
-            <w:pPr>
-              <w:jc w:val="left"/>
-            </w:pPr>
-            <w:r/>
-            <w:r>
-              <w:rPr>
-                <w:b/>
-                <w:color w:val="FFFFFF"/>
-                <w:sz w:val="21"/>
-              </w:rPr>
-              <w:t>Caso de uso</w:t>
-            </w:r>
-          </w:p>
-        </w:tc>
-        <w:tc>
-          <w:tcPr>
-            <w:tcW w:type="dxa" w:w="1871"/>
-            <w:shd w:val="clear" w:color="auto" w:fill="9B1C1F"/>
-          </w:tcPr>
-          <w:p>
-            <w:pPr>
-              <w:jc w:val="left"/>
-            </w:pPr>
-            <w:r/>
-            <w:r>
-              <w:rPr>
-                <w:b/>
-                <w:color w:val="FFFFFF"/>
-                <w:sz w:val="21"/>
-              </w:rPr>
-              <w:t>Actor(es)</w:t>
-            </w:r>
-          </w:p>
-        </w:tc>
-        <w:tc>
-          <w:tcPr>
-            <w:tcW w:type="dxa" w:w="4365"/>
-            <w:shd w:val="clear" w:color="auto" w:fill="9B1C1F"/>
-          </w:tcPr>
-          <w:p>
-            <w:pPr>
-              <w:jc w:val="left"/>
-            </w:pPr>
-            <w:r/>
-            <w:r>
-              <w:rPr>
-                <w:b/>
-                <w:color w:val="FFFFFF"/>
-                <w:sz w:val="21"/>
-              </w:rPr>
-              <w:t>Descripción</w:t>
-            </w:r>
-          </w:p>
-        </w:tc>
-      </w:tr>
-      <w:tr>
-        <w:trPr>
-          <w:cantSplit/>
-        </w:trPr>
-        <w:tc>
-          <w:tcPr>
-            <w:tcW w:type="dxa" w:w="907"/>
-          </w:tcPr>
-          <w:p>
-            <w:pPr>
-              <w:jc w:val="left"/>
-            </w:pPr>
-            <w:r/>
-            <w:r>
-              <w:rPr>
-                <w:sz w:val="21"/>
-              </w:rPr>
-              <w:t>CU-01</w:t>
-            </w:r>
-          </w:p>
-        </w:tc>
-        <w:tc>
-          <w:tcPr>
-            <w:tcW w:type="dxa" w:w="1928"/>
-          </w:tcPr>
-          <w:p>
-            <w:pPr>
-              <w:jc w:val="left"/>
-            </w:pPr>
-            <w:r/>
-            <w:r>
-              <w:rPr>
-                <w:sz w:val="21"/>
-              </w:rPr>
-              <w:t>Iniciar sesión</w:t>
-            </w:r>
-          </w:p>
-        </w:tc>
-        <w:tc>
-          <w:tcPr>
-            <w:tcW w:type="dxa" w:w="1871"/>
-          </w:tcPr>
-          <w:p>
-            <w:pPr>
-              <w:jc w:val="left"/>
-            </w:pPr>
-            <w:r/>
-            <w:r>
-              <w:rPr>
-                <w:sz w:val="21"/>
-              </w:rPr>
-              <w:t>Todos</w:t>
-            </w:r>
-          </w:p>
-        </w:tc>
-        <w:tc>
-          <w:tcPr>
-            <w:tcW w:type="dxa" w:w="4365"/>
-          </w:tcPr>
-          <w:p>
-            <w:pPr>
-              <w:jc w:val="left"/>
-            </w:pPr>
-            <w:r/>
-            <w:r>
-              <w:rPr>
-                <w:sz w:val="21"/>
-              </w:rPr>
-              <w:t>Valida usuario y contraseña con BCrypt y carga los permisos del rol.</w:t>
-            </w:r>
-          </w:p>
-        </w:tc>
-      </w:tr>
-      <w:tr>
-        <w:trPr>
-          <w:cantSplit/>
-        </w:trPr>
-        <w:tc>
-          <w:tcPr>
-            <w:tcW w:type="dxa" w:w="907"/>
-            <w:shd w:val="clear" w:color="auto" w:fill="F2F0F0"/>
-          </w:tcPr>
-          <w:p>
-            <w:pPr>
-              <w:jc w:val="left"/>
-            </w:pPr>
-            <w:r/>
-            <w:r>
-              <w:rPr>
-                <w:sz w:val="21"/>
-              </w:rPr>
-              <w:t>CU-02</w:t>
-            </w:r>
-          </w:p>
-        </w:tc>
-        <w:tc>
-          <w:tcPr>
-            <w:tcW w:type="dxa" w:w="1928"/>
-            <w:shd w:val="clear" w:color="auto" w:fill="F2F0F0"/>
-          </w:tcPr>
-          <w:p>
-            <w:pPr>
-              <w:jc w:val="left"/>
-            </w:pPr>
-            <w:r/>
-            <w:r>
-              <w:rPr>
-                <w:sz w:val="21"/>
-              </w:rPr>
-              <w:t>Cerrar sesión</w:t>
-            </w:r>
-          </w:p>
-        </w:tc>
-        <w:tc>
-          <w:tcPr>
-            <w:tcW w:type="dxa" w:w="1871"/>
-            <w:shd w:val="clear" w:color="auto" w:fill="F2F0F0"/>
-          </w:tcPr>
-          <w:p>
-            <w:pPr>
-              <w:jc w:val="left"/>
-            </w:pPr>
-            <w:r/>
-            <w:r>
-              <w:rPr>
-                <w:sz w:val="21"/>
-              </w:rPr>
-              <w:t>Todos</w:t>
-            </w:r>
-          </w:p>
-        </w:tc>
-        <w:tc>
-          <w:tcPr>
-            <w:tcW w:type="dxa" w:w="4365"/>
-            <w:shd w:val="clear" w:color="auto" w:fill="F2F0F0"/>
-          </w:tcPr>
-          <w:p>
-            <w:pPr>
-              <w:jc w:val="left"/>
-            </w:pPr>
-            <w:r/>
-            <w:r>
-              <w:rPr>
-                <w:sz w:val="21"/>
-              </w:rPr>
-              <w:t>Regresa a la pantalla de inicio de sesión.</w:t>
-            </w:r>
-          </w:p>
-        </w:tc>
-      </w:tr>
-      <w:tr>
-        <w:trPr>
-          <w:cantSplit/>
-        </w:trPr>
-        <w:tc>
-          <w:tcPr>
-            <w:tcW w:type="dxa" w:w="907"/>
-          </w:tcPr>
-          <w:p>
-            <w:pPr>
-              <w:jc w:val="left"/>
-            </w:pPr>
-            <w:r/>
-            <w:r>
-              <w:rPr>
-                <w:sz w:val="21"/>
-              </w:rPr>
-              <w:t>CU-03</w:t>
-            </w:r>
-          </w:p>
-        </w:tc>
-        <w:tc>
-          <w:tcPr>
-            <w:tcW w:type="dxa" w:w="1928"/>
-          </w:tcPr>
-          <w:p>
-            <w:pPr>
-              <w:jc w:val="left"/>
-            </w:pPr>
-            <w:r/>
-            <w:r>
-              <w:rPr>
-                <w:sz w:val="21"/>
-              </w:rPr>
-              <w:t>Gestionar pacientes</w:t>
-            </w:r>
-          </w:p>
-        </w:tc>
-        <w:tc>
-          <w:tcPr>
-            <w:tcW w:type="dxa" w:w="1871"/>
-          </w:tcPr>
-          <w:p>
-            <w:pPr>
-              <w:jc w:val="left"/>
-            </w:pPr>
-            <w:r/>
-            <w:r>
-              <w:rPr>
-                <w:sz w:val="21"/>
-              </w:rPr>
-              <w:t>Recepcionista, Admin</w:t>
-            </w:r>
-          </w:p>
-        </w:tc>
-        <w:tc>
-          <w:tcPr>
-            <w:tcW w:type="dxa" w:w="4365"/>
-          </w:tcPr>
-          <w:p>
-            <w:pPr>
-              <w:jc w:val="left"/>
-            </w:pPr>
-            <w:r/>
-            <w:r>
-              <w:rPr>
-                <w:sz w:val="21"/>
-              </w:rPr>
-              <w:t>Registrar, buscar, actualizar y eliminar pacientes.</w:t>
-            </w:r>
-          </w:p>
-        </w:tc>
-      </w:tr>
-      <w:tr>
-        <w:trPr>
-          <w:cantSplit/>
-        </w:trPr>
-        <w:tc>
-          <w:tcPr>
-            <w:tcW w:type="dxa" w:w="907"/>
-            <w:shd w:val="clear" w:color="auto" w:fill="F2F0F0"/>
-          </w:tcPr>
-          <w:p>
-            <w:pPr>
-              <w:jc w:val="left"/>
-            </w:pPr>
-            <w:r/>
-            <w:r>
-              <w:rPr>
-                <w:sz w:val="21"/>
-              </w:rPr>
-              <w:t>CU-04</w:t>
-            </w:r>
-          </w:p>
-        </w:tc>
-        <w:tc>
-          <w:tcPr>
-            <w:tcW w:type="dxa" w:w="1928"/>
-            <w:shd w:val="clear" w:color="auto" w:fill="F2F0F0"/>
-          </w:tcPr>
-          <w:p>
-            <w:pPr>
-              <w:jc w:val="left"/>
-            </w:pPr>
-            <w:r/>
-            <w:r>
-              <w:rPr>
-                <w:sz w:val="21"/>
-              </w:rPr>
-              <w:t>Agendar citas</w:t>
-            </w:r>
-          </w:p>
-        </w:tc>
-        <w:tc>
-          <w:tcPr>
-            <w:tcW w:type="dxa" w:w="1871"/>
-            <w:shd w:val="clear" w:color="auto" w:fill="F2F0F0"/>
-          </w:tcPr>
-          <w:p>
-            <w:pPr>
-              <w:jc w:val="left"/>
-            </w:pPr>
-            <w:r/>
-            <w:r>
-              <w:rPr>
-                <w:sz w:val="21"/>
-              </w:rPr>
-              <w:t>Recepcionista, Admin</w:t>
-            </w:r>
-          </w:p>
-        </w:tc>
-        <w:tc>
-          <w:tcPr>
-            <w:tcW w:type="dxa" w:w="4365"/>
-            <w:shd w:val="clear" w:color="auto" w:fill="F2F0F0"/>
-          </w:tcPr>
-          <w:p>
-            <w:pPr>
-              <w:jc w:val="left"/>
-            </w:pPr>
-            <w:r/>
-            <w:r>
-              <w:rPr>
-                <w:sz w:val="21"/>
-              </w:rPr>
-              <w:t>Crear, reprogramar o cancelar citas; incluye validar el horario.</w:t>
-            </w:r>
-          </w:p>
-        </w:tc>
-      </w:tr>
-      <w:tr>
-        <w:trPr>
-          <w:cantSplit/>
-        </w:trPr>
-        <w:tc>
-          <w:tcPr>
-            <w:tcW w:type="dxa" w:w="907"/>
-          </w:tcPr>
-          <w:p>
-            <w:pPr>
-              <w:jc w:val="left"/>
-            </w:pPr>
-            <w:r/>
-            <w:r>
-              <w:rPr>
-                <w:sz w:val="21"/>
-              </w:rPr>
-              <w:t>CU-05</w:t>
-            </w:r>
-          </w:p>
-        </w:tc>
-        <w:tc>
-          <w:tcPr>
-            <w:tcW w:type="dxa" w:w="1928"/>
-          </w:tcPr>
-          <w:p>
-            <w:pPr>
-              <w:jc w:val="left"/>
-            </w:pPr>
-            <w:r/>
-            <w:r>
-              <w:rPr>
-                <w:sz w:val="21"/>
-              </w:rPr>
-              <w:t>Consultar agenda</w:t>
-            </w:r>
-          </w:p>
-        </w:tc>
-        <w:tc>
-          <w:tcPr>
-            <w:tcW w:type="dxa" w:w="1871"/>
-          </w:tcPr>
-          <w:p>
-            <w:pPr>
-              <w:jc w:val="left"/>
-            </w:pPr>
-            <w:r/>
-            <w:r>
-              <w:rPr>
-                <w:sz w:val="21"/>
-              </w:rPr>
-              <w:t>Recepcionista, Admin</w:t>
-            </w:r>
-          </w:p>
-        </w:tc>
-        <w:tc>
-          <w:tcPr>
-            <w:tcW w:type="dxa" w:w="4365"/>
-          </w:tcPr>
-          <w:p>
-            <w:pPr>
-              <w:jc w:val="left"/>
-            </w:pPr>
-            <w:r/>
-            <w:r>
-              <w:rPr>
-                <w:sz w:val="21"/>
-              </w:rPr>
-              <w:t>Ver y buscar todas las citas.</w:t>
-            </w:r>
-          </w:p>
-        </w:tc>
-      </w:tr>
-      <w:tr>
-        <w:trPr>
-          <w:cantSplit/>
-        </w:trPr>
-        <w:tc>
-          <w:tcPr>
-            <w:tcW w:type="dxa" w:w="907"/>
-            <w:shd w:val="clear" w:color="auto" w:fill="F2F0F0"/>
-          </w:tcPr>
-          <w:p>
-            <w:pPr>
-              <w:jc w:val="left"/>
-            </w:pPr>
-            <w:r/>
-            <w:r>
-              <w:rPr>
-                <w:sz w:val="21"/>
-              </w:rPr>
-              <w:t>CU-06</w:t>
-            </w:r>
-          </w:p>
-        </w:tc>
-        <w:tc>
-          <w:tcPr>
-            <w:tcW w:type="dxa" w:w="1928"/>
-            <w:shd w:val="clear" w:color="auto" w:fill="F2F0F0"/>
-          </w:tcPr>
-          <w:p>
-            <w:pPr>
-              <w:jc w:val="left"/>
-            </w:pPr>
-            <w:r/>
-            <w:r>
-              <w:rPr>
-                <w:sz w:val="21"/>
-              </w:rPr>
-              <w:t>Ver mis citas</w:t>
-            </w:r>
-          </w:p>
-        </w:tc>
-        <w:tc>
-          <w:tcPr>
-            <w:tcW w:type="dxa" w:w="1871"/>
-            <w:shd w:val="clear" w:color="auto" w:fill="F2F0F0"/>
-          </w:tcPr>
-          <w:p>
-            <w:pPr>
-              <w:jc w:val="left"/>
-            </w:pPr>
-            <w:r/>
-            <w:r>
-              <w:rPr>
-                <w:sz w:val="21"/>
-              </w:rPr>
-              <w:t>Médico</w:t>
-            </w:r>
-          </w:p>
-        </w:tc>
-        <w:tc>
-          <w:tcPr>
-            <w:tcW w:type="dxa" w:w="4365"/>
-            <w:shd w:val="clear" w:color="auto" w:fill="F2F0F0"/>
-          </w:tcPr>
-          <w:p>
-            <w:pPr>
-              <w:jc w:val="left"/>
-            </w:pPr>
-            <w:r/>
-            <w:r>
-              <w:rPr>
-                <w:sz w:val="21"/>
-              </w:rPr>
-              <w:t>El médico ve solo sus citas.</w:t>
-            </w:r>
-          </w:p>
-        </w:tc>
-      </w:tr>
-      <w:tr>
-        <w:trPr>
-          <w:cantSplit/>
-        </w:trPr>
-        <w:tc>
-          <w:tcPr>
-            <w:tcW w:type="dxa" w:w="907"/>
-          </w:tcPr>
-          <w:p>
-            <w:pPr>
-              <w:jc w:val="left"/>
-            </w:pPr>
-            <w:r/>
-            <w:r>
-              <w:rPr>
-                <w:sz w:val="21"/>
-              </w:rPr>
-              <w:t>CU-07</w:t>
-            </w:r>
-          </w:p>
-        </w:tc>
-        <w:tc>
-          <w:tcPr>
-            <w:tcW w:type="dxa" w:w="1928"/>
-          </w:tcPr>
-          <w:p>
-            <w:pPr>
-              <w:jc w:val="left"/>
-            </w:pPr>
-            <w:r/>
-            <w:r>
-              <w:rPr>
-                <w:sz w:val="21"/>
-              </w:rPr>
-              <w:t>Atender cita</w:t>
-            </w:r>
-          </w:p>
-        </w:tc>
-        <w:tc>
-          <w:tcPr>
-            <w:tcW w:type="dxa" w:w="1871"/>
-          </w:tcPr>
-          <w:p>
-            <w:pPr>
-              <w:jc w:val="left"/>
-            </w:pPr>
-            <w:r/>
-            <w:r>
-              <w:rPr>
-                <w:sz w:val="21"/>
-              </w:rPr>
-              <w:t>Médico</w:t>
-            </w:r>
-          </w:p>
-        </w:tc>
-        <w:tc>
-          <w:tcPr>
-            <w:tcW w:type="dxa" w:w="4365"/>
-          </w:tcPr>
-          <w:p>
-            <w:pPr>
-              <w:jc w:val="left"/>
-            </w:pPr>
-            <w:r/>
-            <w:r>
-              <w:rPr>
-                <w:sz w:val="21"/>
-              </w:rPr>
-              <w:t>Cambiar el estado de la cita.</w:t>
-            </w:r>
-          </w:p>
-        </w:tc>
-      </w:tr>
-      <w:tr>
-        <w:trPr>
-          <w:cantSplit/>
-        </w:trPr>
-        <w:tc>
-          <w:tcPr>
-            <w:tcW w:type="dxa" w:w="907"/>
-            <w:shd w:val="clear" w:color="auto" w:fill="F2F0F0"/>
-          </w:tcPr>
-          <w:p>
-            <w:pPr>
-              <w:jc w:val="left"/>
-            </w:pPr>
-            <w:r/>
-            <w:r>
-              <w:rPr>
-                <w:sz w:val="21"/>
-              </w:rPr>
-              <w:t>CU-08</w:t>
-            </w:r>
-          </w:p>
-        </w:tc>
-        <w:tc>
-          <w:tcPr>
-            <w:tcW w:type="dxa" w:w="1928"/>
-            <w:shd w:val="clear" w:color="auto" w:fill="F2F0F0"/>
-          </w:tcPr>
-          <w:p>
-            <w:pPr>
-              <w:jc w:val="left"/>
-            </w:pPr>
-            <w:r/>
-            <w:r>
-              <w:rPr>
-                <w:sz w:val="21"/>
-              </w:rPr>
-              <w:t>Registrar historial</w:t>
-            </w:r>
-          </w:p>
-        </w:tc>
-        <w:tc>
-          <w:tcPr>
-            <w:tcW w:type="dxa" w:w="1871"/>
-            <w:shd w:val="clear" w:color="auto" w:fill="F2F0F0"/>
-          </w:tcPr>
-          <w:p>
-            <w:pPr>
-              <w:jc w:val="left"/>
-            </w:pPr>
-            <w:r/>
-            <w:r>
-              <w:rPr>
-                <w:sz w:val="21"/>
-              </w:rPr>
-              <w:t>Médico, Admin</w:t>
-            </w:r>
-          </w:p>
-        </w:tc>
-        <w:tc>
-          <w:tcPr>
-            <w:tcW w:type="dxa" w:w="4365"/>
-            <w:shd w:val="clear" w:color="auto" w:fill="F2F0F0"/>
-          </w:tcPr>
-          <w:p>
-            <w:pPr>
-              <w:jc w:val="left"/>
-            </w:pPr>
-            <w:r/>
-            <w:r>
-              <w:rPr>
-                <w:sz w:val="21"/>
-              </w:rPr>
-              <w:t>Registrar el diagnóstico y el tratamiento.</w:t>
-            </w:r>
-          </w:p>
-        </w:tc>
-      </w:tr>
-      <w:tr>
-        <w:trPr>
-          <w:cantSplit/>
-        </w:trPr>
-        <w:tc>
-          <w:tcPr>
-            <w:tcW w:type="dxa" w:w="907"/>
-          </w:tcPr>
-          <w:p>
-            <w:pPr>
-              <w:jc w:val="left"/>
-            </w:pPr>
-            <w:r/>
-            <w:r>
-              <w:rPr>
-                <w:sz w:val="21"/>
-              </w:rPr>
-              <w:t>CU-09</w:t>
-            </w:r>
-          </w:p>
-        </w:tc>
-        <w:tc>
-          <w:tcPr>
-            <w:tcW w:type="dxa" w:w="1928"/>
-          </w:tcPr>
-          <w:p>
-            <w:pPr>
-              <w:jc w:val="left"/>
-            </w:pPr>
-            <w:r/>
-            <w:r>
-              <w:rPr>
-                <w:sz w:val="21"/>
-              </w:rPr>
-              <w:t>Consultar historial</w:t>
-            </w:r>
-          </w:p>
-        </w:tc>
-        <w:tc>
-          <w:tcPr>
-            <w:tcW w:type="dxa" w:w="1871"/>
-          </w:tcPr>
-          <w:p>
-            <w:pPr>
-              <w:jc w:val="left"/>
-            </w:pPr>
-            <w:r/>
-            <w:r>
-              <w:rPr>
-                <w:sz w:val="21"/>
-              </w:rPr>
-              <w:t>Médico, Admin</w:t>
-            </w:r>
-          </w:p>
-        </w:tc>
-        <w:tc>
-          <w:tcPr>
-            <w:tcW w:type="dxa" w:w="4365"/>
-          </w:tcPr>
-          <w:p>
-            <w:pPr>
-              <w:jc w:val="left"/>
-            </w:pPr>
-            <w:r/>
-            <w:r>
-              <w:rPr>
-                <w:sz w:val="21"/>
-              </w:rPr>
-              <w:t>Ver las consultas anteriores del paciente.</w:t>
-            </w:r>
-          </w:p>
-        </w:tc>
-      </w:tr>
-      <w:tr>
-        <w:trPr>
-          <w:cantSplit/>
-        </w:trPr>
-        <w:tc>
-          <w:tcPr>
-            <w:tcW w:type="dxa" w:w="907"/>
-            <w:shd w:val="clear" w:color="auto" w:fill="F2F0F0"/>
-          </w:tcPr>
-          <w:p>
-            <w:pPr>
-              <w:jc w:val="left"/>
-            </w:pPr>
-            <w:r/>
-            <w:r>
-              <w:rPr>
-                <w:sz w:val="21"/>
-              </w:rPr>
-              <w:t>CU-10</w:t>
-            </w:r>
-          </w:p>
-        </w:tc>
-        <w:tc>
-          <w:tcPr>
-            <w:tcW w:type="dxa" w:w="1928"/>
-            <w:shd w:val="clear" w:color="auto" w:fill="F2F0F0"/>
-          </w:tcPr>
-          <w:p>
-            <w:pPr>
-              <w:jc w:val="left"/>
-            </w:pPr>
-            <w:r/>
-            <w:r>
-              <w:rPr>
-                <w:sz w:val="21"/>
-              </w:rPr>
-              <w:t>Gestionar médicos</w:t>
-            </w:r>
-          </w:p>
-        </w:tc>
-        <w:tc>
-          <w:tcPr>
-            <w:tcW w:type="dxa" w:w="1871"/>
-            <w:shd w:val="clear" w:color="auto" w:fill="F2F0F0"/>
-          </w:tcPr>
-          <w:p>
-            <w:pPr>
-              <w:jc w:val="left"/>
-            </w:pPr>
-            <w:r/>
-            <w:r>
-              <w:rPr>
-                <w:sz w:val="21"/>
-              </w:rPr>
-              <w:t>Admin</w:t>
-            </w:r>
-          </w:p>
-        </w:tc>
-        <w:tc>
-          <w:tcPr>
-            <w:tcW w:type="dxa" w:w="4365"/>
-            <w:shd w:val="clear" w:color="auto" w:fill="F2F0F0"/>
-          </w:tcPr>
-          <w:p>
-            <w:pPr>
-              <w:jc w:val="left"/>
-            </w:pPr>
-            <w:r/>
-            <w:r>
-              <w:rPr>
-                <w:sz w:val="21"/>
-              </w:rPr>
-              <w:t>CRUD de médicos y su usuario del sistema.</w:t>
-            </w:r>
-          </w:p>
-        </w:tc>
-      </w:tr>
-      <w:tr>
-        <w:trPr>
-          <w:cantSplit/>
-        </w:trPr>
-        <w:tc>
-          <w:tcPr>
-            <w:tcW w:type="dxa" w:w="907"/>
-          </w:tcPr>
-          <w:p>
-            <w:pPr>
-              <w:jc w:val="left"/>
-            </w:pPr>
-            <w:r/>
-            <w:r>
-              <w:rPr>
-                <w:sz w:val="21"/>
-              </w:rPr>
-              <w:t>CU-11</w:t>
-            </w:r>
-          </w:p>
-        </w:tc>
-        <w:tc>
-          <w:tcPr>
-            <w:tcW w:type="dxa" w:w="1928"/>
-          </w:tcPr>
-          <w:p>
-            <w:pPr>
-              <w:jc w:val="left"/>
-            </w:pPr>
-            <w:r/>
-            <w:r>
-              <w:rPr>
-                <w:sz w:val="21"/>
-              </w:rPr>
-              <w:t>Gestionar especialidades</w:t>
-            </w:r>
-          </w:p>
-        </w:tc>
-        <w:tc>
-          <w:tcPr>
-            <w:tcW w:type="dxa" w:w="1871"/>
-          </w:tcPr>
-          <w:p>
-            <w:pPr>
-              <w:jc w:val="left"/>
-            </w:pPr>
-            <w:r/>
-            <w:r>
-              <w:rPr>
-                <w:sz w:val="21"/>
-              </w:rPr>
-              <w:t>Admin</w:t>
-            </w:r>
-          </w:p>
-        </w:tc>
-        <w:tc>
-          <w:tcPr>
-            <w:tcW w:type="dxa" w:w="4365"/>
-          </w:tcPr>
-          <w:p>
-            <w:pPr>
-              <w:jc w:val="left"/>
-            </w:pPr>
-            <w:r/>
-            <w:r>
-              <w:rPr>
-                <w:sz w:val="21"/>
-              </w:rPr>
-              <w:t>CRUD de especialidades.</w:t>
-            </w:r>
-          </w:p>
-        </w:tc>
-      </w:tr>
-      <w:tr>
-        <w:trPr>
-          <w:cantSplit/>
-        </w:trPr>
-        <w:tc>
-          <w:tcPr>
-            <w:tcW w:type="dxa" w:w="907"/>
-            <w:shd w:val="clear" w:color="auto" w:fill="F2F0F0"/>
-          </w:tcPr>
-          <w:p>
-            <w:pPr>
-              <w:jc w:val="left"/>
-            </w:pPr>
-            <w:r/>
-            <w:r>
-              <w:rPr>
-                <w:sz w:val="21"/>
-              </w:rPr>
-              <w:t>CU-12</w:t>
-            </w:r>
-          </w:p>
-        </w:tc>
-        <w:tc>
-          <w:tcPr>
-            <w:tcW w:type="dxa" w:w="1928"/>
-            <w:shd w:val="clear" w:color="auto" w:fill="F2F0F0"/>
-          </w:tcPr>
-          <w:p>
-            <w:pPr>
-              <w:jc w:val="left"/>
-            </w:pPr>
-            <w:r/>
-            <w:r>
-              <w:rPr>
-                <w:sz w:val="21"/>
-              </w:rPr>
-              <w:t>Gestionar usuarios</w:t>
-            </w:r>
-          </w:p>
-        </w:tc>
-        <w:tc>
-          <w:tcPr>
-            <w:tcW w:type="dxa" w:w="1871"/>
-            <w:shd w:val="clear" w:color="auto" w:fill="F2F0F0"/>
-          </w:tcPr>
-          <w:p>
-            <w:pPr>
-              <w:jc w:val="left"/>
-            </w:pPr>
-            <w:r/>
-            <w:r>
-              <w:rPr>
-                <w:sz w:val="21"/>
-              </w:rPr>
-              <w:t>Admin</w:t>
-            </w:r>
-          </w:p>
-        </w:tc>
-        <w:tc>
-          <w:tcPr>
-            <w:tcW w:type="dxa" w:w="4365"/>
-            <w:shd w:val="clear" w:color="auto" w:fill="F2F0F0"/>
-          </w:tcPr>
-          <w:p>
-            <w:pPr>
-              <w:jc w:val="left"/>
-            </w:pPr>
-            <w:r/>
-            <w:r>
-              <w:rPr>
-                <w:sz w:val="21"/>
-              </w:rPr>
-              <w:t>CRUD de usuarios y asignación de rol.</w:t>
-            </w:r>
-          </w:p>
-        </w:tc>
-      </w:tr>
-      <w:tr>
-        <w:trPr>
-          <w:cantSplit/>
-        </w:trPr>
-        <w:tc>
-          <w:tcPr>
-            <w:tcW w:type="dxa" w:w="907"/>
-          </w:tcPr>
-          <w:p>
-            <w:pPr>
-              <w:jc w:val="left"/>
-            </w:pPr>
-            <w:r/>
-            <w:r>
-              <w:rPr>
-                <w:sz w:val="21"/>
-              </w:rPr>
-              <w:t>CU-13</w:t>
-            </w:r>
-          </w:p>
-        </w:tc>
-        <w:tc>
-          <w:tcPr>
-            <w:tcW w:type="dxa" w:w="1928"/>
-          </w:tcPr>
-          <w:p>
-            <w:pPr>
-              <w:jc w:val="left"/>
-            </w:pPr>
-            <w:r/>
-            <w:r>
-              <w:rPr>
-                <w:sz w:val="21"/>
-              </w:rPr>
-              <w:t>Gestionar permisos</w:t>
-            </w:r>
-          </w:p>
-        </w:tc>
-        <w:tc>
-          <w:tcPr>
-            <w:tcW w:type="dxa" w:w="1871"/>
-          </w:tcPr>
-          <w:p>
-            <w:pPr>
-              <w:jc w:val="left"/>
-            </w:pPr>
-            <w:r/>
-            <w:r>
-              <w:rPr>
-                <w:sz w:val="21"/>
-              </w:rPr>
-              <w:t>Admin</w:t>
-            </w:r>
-          </w:p>
-        </w:tc>
-        <w:tc>
-          <w:tcPr>
-            <w:tcW w:type="dxa" w:w="4365"/>
-          </w:tcPr>
-          <w:p>
-            <w:pPr>
-              <w:jc w:val="left"/>
-            </w:pPr>
-            <w:r/>
-            <w:r>
-              <w:rPr>
-                <w:sz w:val="21"/>
-              </w:rPr>
-              <w:t>Marcar las pantallas de cada rol.</w:t>
-            </w:r>
-          </w:p>
-        </w:tc>
-      </w:tr>
-      <w:tr>
-        <w:trPr>
-          <w:cantSplit/>
-        </w:trPr>
-        <w:tc>
-          <w:tcPr>
-            <w:tcW w:type="dxa" w:w="907"/>
-            <w:shd w:val="clear" w:color="auto" w:fill="F2F0F0"/>
-          </w:tcPr>
-          <w:p>
-            <w:pPr>
-              <w:jc w:val="left"/>
-            </w:pPr>
-            <w:r/>
-            <w:r>
-              <w:rPr>
-                <w:sz w:val="21"/>
-              </w:rPr>
-              <w:t>CU-14</w:t>
-            </w:r>
-          </w:p>
-        </w:tc>
-        <w:tc>
-          <w:tcPr>
-            <w:tcW w:type="dxa" w:w="1928"/>
-            <w:shd w:val="clear" w:color="auto" w:fill="F2F0F0"/>
-          </w:tcPr>
-          <w:p>
-            <w:pPr>
-              <w:jc w:val="left"/>
-            </w:pPr>
-            <w:r/>
-            <w:r>
-              <w:rPr>
-                <w:sz w:val="21"/>
-              </w:rPr>
-              <w:t>Consultar bitácora</w:t>
-            </w:r>
-          </w:p>
-        </w:tc>
-        <w:tc>
-          <w:tcPr>
-            <w:tcW w:type="dxa" w:w="1871"/>
-            <w:shd w:val="clear" w:color="auto" w:fill="F2F0F0"/>
-          </w:tcPr>
-          <w:p>
-            <w:pPr>
-              <w:jc w:val="left"/>
-            </w:pPr>
-            <w:r/>
-            <w:r>
-              <w:rPr>
-                <w:sz w:val="21"/>
-              </w:rPr>
-              <w:t>Admin</w:t>
-            </w:r>
-          </w:p>
-        </w:tc>
-        <w:tc>
-          <w:tcPr>
-            <w:tcW w:type="dxa" w:w="4365"/>
-            <w:shd w:val="clear" w:color="auto" w:fill="F2F0F0"/>
-          </w:tcPr>
-          <w:p>
-            <w:pPr>
-              <w:jc w:val="left"/>
-            </w:pPr>
-            <w:r/>
-            <w:r>
-              <w:rPr>
-                <w:sz w:val="21"/>
-              </w:rPr>
-              <w:t>Ver el registro de actividades.</w:t>
-            </w:r>
-          </w:p>
-        </w:tc>
-      </w:tr>
-    </w:tbl>
-    <w:p/>
     <w:p>
       <w:r>
         <w:br w:type="page"/>

</xml_diff>

<commit_message>
Documentación en blanco y negro, diseño sencillo
Co-Authored-By: Claude Opus 5.5 <noreply@anthropic.com>
Claude-Session: https://claude.ai/code/session_01WUZ6iRk4AHLpaQU9ro5Qut
</commit_message>
<xml_diff>
--- a/ClinicaMiniPtc/Documentacion/Documentacion_ClinicaMiniPtc.docx
+++ b/ClinicaMiniPtc/Documentacion/Documentacion_ClinicaMiniPtc.docx
@@ -2,64 +2,35 @@
 <file path=word/document.xml><?xml version="1.0" encoding="utf-8"?>
 <w:document xmlns:wpc="http://schemas.microsoft.com/office/word/2010/wordprocessingCanvas" xmlns:mo="http://schemas.microsoft.com/office/mac/office/2008/main" xmlns:mc="http://schemas.openxmlformats.org/markup-compatibility/2006" xmlns:mv="urn:schemas-microsoft-com:mac:vml" xmlns:o="urn:schemas-microsoft-com:office:office" xmlns:r="http://schemas.openxmlformats.org/officeDocument/2006/relationships" xmlns:m="http://schemas.openxmlformats.org/officeDocument/2006/math" xmlns:v="urn:schemas-microsoft-com:vml" xmlns:wp14="http://schemas.microsoft.com/office/word/2010/wordprocessingDrawing" xmlns:wp="http://schemas.openxmlformats.org/drawingml/2006/wordprocessingDrawing" xmlns:w10="urn:schemas-microsoft-com:office:word" xmlns:w="http://schemas.openxmlformats.org/wordprocessingml/2006/main" xmlns:w14="http://schemas.microsoft.com/office/word/2010/wordml" xmlns:wpg="http://schemas.microsoft.com/office/word/2010/wordprocessingGroup" xmlns:wpi="http://schemas.microsoft.com/office/word/2010/wordprocessingInk" xmlns:wne="http://schemas.microsoft.com/office/word/2006/wordml" xmlns:wps="http://schemas.microsoft.com/office/word/2010/wordprocessingShape" mc:Ignorable="w14 wp14">
   <w:body>
-    <w:tbl>
-      <w:tblPr>
-        <w:tblW w:type="auto" w:w="0"/>
+    <w:p>
+      <w:pPr>
+        <w:spacing w:after="40"/>
         <w:jc w:val="center"/>
-        <w:tblLook w:firstColumn="1" w:firstRow="1" w:lastColumn="0" w:lastRow="0" w:noHBand="0" w:noVBand="1" w:val="04A0"/>
-        <w:tblLayout w:type="fixed"/>
-        <w:tblCellMar>
-          <w:top w:w="260" w:type="dxa"/>
-          <w:bottom w:w="260" w:type="dxa"/>
-          <w:left w:w="200" w:type="dxa"/>
-          <w:right w:w="200" w:type="dxa"/>
-        </w:tblCellMar>
-      </w:tblPr>
-      <w:tblGrid>
-        <w:gridCol w:w="9406"/>
-      </w:tblGrid>
-      <w:tr>
-        <w:tc>
-          <w:tcPr>
-            <w:tcW w:type="dxa" w:w="9405"/>
-            <w:shd w:val="clear" w:color="auto" w:fill="1F4E79"/>
-            <w:tcBorders>
-              <w:top w:val="nil"/>
-              <w:left w:val="nil"/>
-              <w:bottom w:val="nil"/>
-              <w:right w:val="nil"/>
-            </w:tcBorders>
-          </w:tcPr>
-          <w:p>
-            <w:pPr>
-              <w:spacing w:after="40"/>
-              <w:jc w:val="center"/>
-            </w:pPr>
-            <w:r>
-              <w:rPr>
-                <w:b/>
-                <w:color w:val="FFFFFF"/>
-                <w:sz w:val="36"/>
-              </w:rPr>
-              <w:t>INSTITUTO TÉCNICO RICALDONE</w:t>
-            </w:r>
-          </w:p>
-          <w:p>
-            <w:pPr>
-              <w:spacing w:after="0"/>
-              <w:jc w:val="center"/>
-            </w:pPr>
-            <w:r>
-              <w:rPr>
-                <w:color w:val="DEEBF7"/>
-                <w:sz w:val="24"/>
-              </w:rPr>
-              <w:t>Especialidad de Desarrollo de Software</w:t>
-            </w:r>
-          </w:p>
-        </w:tc>
-      </w:tr>
-    </w:tbl>
+      </w:pPr>
+      <w:r>
+        <w:rPr>
+          <w:b/>
+          <w:i w:val="0"/>
+          <w:sz w:val="34"/>
+        </w:rPr>
+        <w:t>INSTITUTO TÉCNICO RICALDONE</w:t>
+      </w:r>
+    </w:p>
+    <w:p>
+      <w:pPr>
+        <w:spacing w:after="0"/>
+        <w:jc w:val="center"/>
+      </w:pPr>
+      <w:r>
+        <w:rPr>
+          <w:b w:val="0"/>
+          <w:i w:val="0"/>
+          <w:color w:val="595959"/>
+          <w:sz w:val="24"/>
+        </w:rPr>
+        <w:t>Especialidad de Desarrollo de Software</w:t>
+      </w:r>
+    </w:p>
     <w:p>
       <w:pPr>
         <w:spacing w:after="600"/>
@@ -120,7 +91,7 @@
         <w:rPr>
           <w:b/>
           <w:i w:val="0"/>
-          <w:color w:val="2E75B6"/>
+          <w:color w:val="595959"/>
           <w:sz w:val="22"/>
         </w:rPr>
         <w:t>D O C U M E N T A C I Ó N   D E L   P R O Y E C T O</w:t>
@@ -135,7 +106,7 @@
         <w:rPr>
           <w:b/>
           <w:i w:val="0"/>
-          <w:color w:val="1F4E79"/>
+          <w:color w:val="111111"/>
           <w:sz w:val="76"/>
         </w:rPr>
         <w:t>Clínica MiniPtc</w:t>
@@ -163,10 +134,10 @@
       </w:pPr>
       <w:r>
         <w:rPr>
-          <w:color w:val="2E75B6"/>
+          <w:color w:val="111111"/>
           <w:sz w:val="28"/>
         </w:rPr>
-        <w:t>━━━━━━━━</w:t>
+        <w:t>———</w:t>
       </w:r>
     </w:p>
     <w:tbl>
@@ -190,11 +161,10 @@
         <w:tc>
           <w:tcPr>
             <w:tcW w:type="dxa" w:w="2381"/>
-            <w:shd w:val="clear" w:color="auto" w:fill="EAF1FB"/>
             <w:tcBorders>
               <w:top w:val="nil"/>
               <w:left w:val="nil"/>
-              <w:bottom w:val="single" w:sz="8" w:color="FFFFFF"/>
+              <w:bottom w:val="single" w:sz="4" w:color="D9D9D9"/>
               <w:right w:val="nil"/>
             </w:tcBorders>
             <w:vAlign w:val="center"/>
@@ -206,7 +176,7 @@
             <w:r>
               <w:rPr>
                 <w:b/>
-                <w:color w:val="1F4E79"/>
+                <w:color w:val="111111"/>
                 <w:sz w:val="21"/>
               </w:rPr>
               <w:t>Módulo</w:t>
@@ -219,7 +189,7 @@
             <w:tcBorders>
               <w:top w:val="nil"/>
               <w:left w:val="nil"/>
-              <w:bottom w:val="single" w:sz="4" w:color="D9E2F3"/>
+              <w:bottom w:val="single" w:sz="4" w:color="D9D9D9"/>
               <w:right w:val="nil"/>
             </w:tcBorders>
             <w:vAlign w:val="center"/>
@@ -241,11 +211,10 @@
         <w:tc>
           <w:tcPr>
             <w:tcW w:type="dxa" w:w="2381"/>
-            <w:shd w:val="clear" w:color="auto" w:fill="EAF1FB"/>
             <w:tcBorders>
               <w:top w:val="nil"/>
               <w:left w:val="nil"/>
-              <w:bottom w:val="single" w:sz="8" w:color="FFFFFF"/>
+              <w:bottom w:val="single" w:sz="4" w:color="D9D9D9"/>
               <w:right w:val="nil"/>
             </w:tcBorders>
             <w:vAlign w:val="center"/>
@@ -257,7 +226,7 @@
             <w:r>
               <w:rPr>
                 <w:b/>
-                <w:color w:val="1F4E79"/>
+                <w:color w:val="111111"/>
                 <w:sz w:val="21"/>
               </w:rPr>
               <w:t>Docente</w:t>
@@ -270,7 +239,7 @@
             <w:tcBorders>
               <w:top w:val="nil"/>
               <w:left w:val="nil"/>
-              <w:bottom w:val="single" w:sz="4" w:color="D9E2F3"/>
+              <w:bottom w:val="single" w:sz="4" w:color="D9D9D9"/>
               <w:right w:val="nil"/>
             </w:tcBorders>
             <w:vAlign w:val="center"/>
@@ -292,11 +261,10 @@
         <w:tc>
           <w:tcPr>
             <w:tcW w:type="dxa" w:w="2381"/>
-            <w:shd w:val="clear" w:color="auto" w:fill="EAF1FB"/>
             <w:tcBorders>
               <w:top w:val="nil"/>
               <w:left w:val="nil"/>
-              <w:bottom w:val="single" w:sz="8" w:color="FFFFFF"/>
+              <w:bottom w:val="single" w:sz="4" w:color="D9D9D9"/>
               <w:right w:val="nil"/>
             </w:tcBorders>
             <w:vAlign w:val="center"/>
@@ -308,7 +276,7 @@
             <w:r>
               <w:rPr>
                 <w:b/>
-                <w:color w:val="1F4E79"/>
+                <w:color w:val="111111"/>
                 <w:sz w:val="21"/>
               </w:rPr>
               <w:t>Integrantes</w:t>
@@ -321,7 +289,7 @@
             <w:tcBorders>
               <w:top w:val="nil"/>
               <w:left w:val="nil"/>
-              <w:bottom w:val="single" w:sz="4" w:color="D9E2F3"/>
+              <w:bottom w:val="single" w:sz="4" w:color="D9D9D9"/>
               <w:right w:val="nil"/>
             </w:tcBorders>
             <w:vAlign w:val="center"/>
@@ -365,11 +333,10 @@
         <w:tc>
           <w:tcPr>
             <w:tcW w:type="dxa" w:w="2381"/>
-            <w:shd w:val="clear" w:color="auto" w:fill="EAF1FB"/>
             <w:tcBorders>
               <w:top w:val="nil"/>
               <w:left w:val="nil"/>
-              <w:bottom w:val="single" w:sz="8" w:color="FFFFFF"/>
+              <w:bottom w:val="single" w:sz="4" w:color="D9D9D9"/>
               <w:right w:val="nil"/>
             </w:tcBorders>
             <w:vAlign w:val="center"/>
@@ -381,7 +348,7 @@
             <w:r>
               <w:rPr>
                 <w:b/>
-                <w:color w:val="1F4E79"/>
+                <w:color w:val="111111"/>
                 <w:sz w:val="21"/>
               </w:rPr>
               <w:t>Sección</w:t>
@@ -394,7 +361,7 @@
             <w:tcBorders>
               <w:top w:val="nil"/>
               <w:left w:val="nil"/>
-              <w:bottom w:val="single" w:sz="4" w:color="D9E2F3"/>
+              <w:bottom w:val="single" w:sz="4" w:color="D9D9D9"/>
               <w:right w:val="nil"/>
             </w:tcBorders>
             <w:vAlign w:val="center"/>
@@ -416,11 +383,10 @@
         <w:tc>
           <w:tcPr>
             <w:tcW w:type="dxa" w:w="2381"/>
-            <w:shd w:val="clear" w:color="auto" w:fill="EAF1FB"/>
             <w:tcBorders>
               <w:top w:val="nil"/>
               <w:left w:val="nil"/>
-              <w:bottom w:val="single" w:sz="8" w:color="FFFFFF"/>
+              <w:bottom w:val="single" w:sz="4" w:color="D9D9D9"/>
               <w:right w:val="nil"/>
             </w:tcBorders>
             <w:vAlign w:val="center"/>
@@ -432,7 +398,7 @@
             <w:r>
               <w:rPr>
                 <w:b/>
-                <w:color w:val="1F4E79"/>
+                <w:color w:val="111111"/>
                 <w:sz w:val="21"/>
               </w:rPr>
               <w:t>Fecha de entrega</w:t>
@@ -445,7 +411,7 @@
             <w:tcBorders>
               <w:top w:val="nil"/>
               <w:left w:val="nil"/>
-              <w:bottom w:val="single" w:sz="4" w:color="D9E2F3"/>
+              <w:bottom w:val="single" w:sz="4" w:color="D9D9D9"/>
               <w:right w:val="nil"/>
             </w:tcBorders>
             <w:vAlign w:val="center"/>
@@ -468,14 +434,14 @@
       <w:pPr>
         <w:pageBreakBefore/>
         <w:pBdr>
-          <w:bottom w:val="single" w:sz="12" w:space="8" w:color="2E75B6"/>
+          <w:bottom w:val="single" w:sz="8" w:space="8" w:color="111111"/>
         </w:pBdr>
         <w:spacing w:after="320"/>
       </w:pPr>
       <w:r>
         <w:rPr>
           <w:b/>
-          <w:color w:val="1F4E79"/>
+          <w:color w:val="111111"/>
           <w:sz w:val="44"/>
         </w:rPr>
         <w:t>Índice</w:t>
@@ -495,13 +461,13 @@
         <w:pStyle w:val="Heading1"/>
         <w:pageBreakBefore/>
         <w:pBdr>
-          <w:bottom w:val="single" w:sz="12" w:space="8" w:color="2E75B6"/>
+          <w:bottom w:val="single" w:sz="8" w:space="8" w:color="111111"/>
         </w:pBdr>
         <w:spacing w:after="320"/>
       </w:pPr>
       <w:r>
         <w:rPr>
-          <w:color w:val="2E75B6"/>
+          <w:color w:val="595959"/>
         </w:rPr>
         <w:t xml:space="preserve">1.  </w:t>
       </w:r>
@@ -562,13 +528,13 @@
         <w:pStyle w:val="Heading1"/>
         <w:pageBreakBefore/>
         <w:pBdr>
-          <w:bottom w:val="single" w:sz="12" w:space="8" w:color="2E75B6"/>
+          <w:bottom w:val="single" w:sz="8" w:space="8" w:color="111111"/>
         </w:pBdr>
         <w:spacing w:after="320"/>
       </w:pPr>
       <w:r>
         <w:rPr>
-          <w:color w:val="2E75B6"/>
+          <w:color w:val="595959"/>
         </w:rPr>
         <w:t xml:space="preserve">2.  </w:t>
       </w:r>
@@ -633,7 +599,7 @@
       <w:r>
         <w:rPr>
           <w:b/>
-          <w:color w:val="1F4E79"/>
+          <w:color w:val="111111"/>
           <w:sz w:val="19"/>
         </w:rPr>
         <w:t xml:space="preserve">Figura 1. </w:t>
@@ -704,7 +670,7 @@
       <w:r>
         <w:rPr>
           <w:b/>
-          <w:color w:val="1F4E79"/>
+          <w:color w:val="111111"/>
           <w:sz w:val="19"/>
         </w:rPr>
         <w:t xml:space="preserve">Figura 2. </w:t>
@@ -775,7 +741,7 @@
       <w:r>
         <w:rPr>
           <w:b/>
-          <w:color w:val="1F4E79"/>
+          <w:color w:val="111111"/>
           <w:sz w:val="19"/>
         </w:rPr>
         <w:t xml:space="preserve">Figura 3. </w:t>
@@ -794,13 +760,13 @@
         <w:pStyle w:val="Heading1"/>
         <w:pageBreakBefore/>
         <w:pBdr>
-          <w:bottom w:val="single" w:sz="12" w:space="8" w:color="2E75B6"/>
+          <w:bottom w:val="single" w:sz="8" w:space="8" w:color="111111"/>
         </w:pBdr>
         <w:spacing w:after="320"/>
       </w:pPr>
       <w:r>
         <w:rPr>
-          <w:color w:val="2E75B6"/>
+          <w:color w:val="595959"/>
         </w:rPr>
         <w:t xml:space="preserve">3.  </w:t>
       </w:r>
@@ -869,7 +835,7 @@
       <w:r>
         <w:rPr>
           <w:b/>
-          <w:color w:val="1F4E79"/>
+          <w:color w:val="111111"/>
           <w:sz w:val="19"/>
         </w:rPr>
         <w:t xml:space="preserve">Figura 4. </w:t>
@@ -888,13 +854,13 @@
         <w:pStyle w:val="Heading1"/>
         <w:pageBreakBefore/>
         <w:pBdr>
-          <w:bottom w:val="single" w:sz="12" w:space="8" w:color="2E75B6"/>
+          <w:bottom w:val="single" w:sz="8" w:space="8" w:color="111111"/>
         </w:pBdr>
         <w:spacing w:after="320"/>
       </w:pPr>
       <w:r>
         <w:rPr>
-          <w:color w:val="2E75B6"/>
+          <w:color w:val="595959"/>
         </w:rPr>
         <w:t xml:space="preserve">4.  </w:t>
       </w:r>
@@ -966,11 +932,10 @@
         <w:tc>
           <w:tcPr>
             <w:tcW w:type="dxa" w:w="2211"/>
-            <w:shd w:val="clear" w:color="auto" w:fill="1F4E79"/>
             <w:tcBorders>
-              <w:top w:val="nil"/>
+              <w:top w:val="single" w:sz="12" w:color="111111"/>
               <w:left w:val="nil"/>
-              <w:bottom w:val="nil"/>
+              <w:bottom w:val="single" w:sz="8" w:color="111111"/>
               <w:right w:val="nil"/>
             </w:tcBorders>
           </w:tcPr>
@@ -983,7 +948,6 @@
             <w:r>
               <w:rPr>
                 <w:b/>
-                <w:color w:val="FFFFFF"/>
                 <w:sz w:val="20"/>
               </w:rPr>
               <w:t>Campo</w:t>
@@ -993,11 +957,10 @@
         <w:tc>
           <w:tcPr>
             <w:tcW w:type="dxa" w:w="1304"/>
-            <w:shd w:val="clear" w:color="auto" w:fill="1F4E79"/>
             <w:tcBorders>
-              <w:top w:val="nil"/>
+              <w:top w:val="single" w:sz="12" w:color="111111"/>
               <w:left w:val="nil"/>
-              <w:bottom w:val="nil"/>
+              <w:bottom w:val="single" w:sz="8" w:color="111111"/>
               <w:right w:val="nil"/>
             </w:tcBorders>
           </w:tcPr>
@@ -1010,7 +973,6 @@
             <w:r>
               <w:rPr>
                 <w:b/>
-                <w:color w:val="FFFFFF"/>
                 <w:sz w:val="20"/>
               </w:rPr>
               <w:t>Tipo</w:t>
@@ -1020,11 +982,10 @@
         <w:tc>
           <w:tcPr>
             <w:tcW w:type="dxa" w:w="850"/>
-            <w:shd w:val="clear" w:color="auto" w:fill="1F4E79"/>
             <w:tcBorders>
-              <w:top w:val="nil"/>
+              <w:top w:val="single" w:sz="12" w:color="111111"/>
               <w:left w:val="nil"/>
-              <w:bottom w:val="nil"/>
+              <w:bottom w:val="single" w:sz="8" w:color="111111"/>
               <w:right w:val="nil"/>
             </w:tcBorders>
           </w:tcPr>
@@ -1037,7 +998,6 @@
             <w:r>
               <w:rPr>
                 <w:b/>
-                <w:color w:val="FFFFFF"/>
                 <w:sz w:val="20"/>
               </w:rPr>
               <w:t>Long.</w:t>
@@ -1047,11 +1007,10 @@
         <w:tc>
           <w:tcPr>
             <w:tcW w:type="dxa" w:w="2154"/>
-            <w:shd w:val="clear" w:color="auto" w:fill="1F4E79"/>
             <w:tcBorders>
-              <w:top w:val="nil"/>
+              <w:top w:val="single" w:sz="12" w:color="111111"/>
               <w:left w:val="nil"/>
-              <w:bottom w:val="nil"/>
+              <w:bottom w:val="single" w:sz="8" w:color="111111"/>
               <w:right w:val="nil"/>
             </w:tcBorders>
           </w:tcPr>
@@ -1064,7 +1023,6 @@
             <w:r>
               <w:rPr>
                 <w:b/>
-                <w:color w:val="FFFFFF"/>
                 <w:sz w:val="20"/>
               </w:rPr>
               <w:t>Restricciones</w:t>
@@ -1074,11 +1032,10 @@
         <w:tc>
           <w:tcPr>
             <w:tcW w:type="dxa" w:w="2835"/>
-            <w:shd w:val="clear" w:color="auto" w:fill="1F4E79"/>
             <w:tcBorders>
-              <w:top w:val="nil"/>
+              <w:top w:val="single" w:sz="12" w:color="111111"/>
               <w:left w:val="nil"/>
-              <w:bottom w:val="nil"/>
+              <w:bottom w:val="single" w:sz="8" w:color="111111"/>
               <w:right w:val="nil"/>
             </w:tcBorders>
           </w:tcPr>
@@ -1091,7 +1048,6 @@
             <w:r>
               <w:rPr>
                 <w:b/>
-                <w:color w:val="FFFFFF"/>
                 <w:sz w:val="20"/>
               </w:rPr>
               <w:t>Descripción</w:t>
@@ -1109,7 +1065,7 @@
             <w:tcBorders>
               <w:top w:val="nil"/>
               <w:left w:val="nil"/>
-              <w:bottom w:val="single" w:sz="4" w:color="BDD7EE"/>
+              <w:bottom w:val="single" w:sz="4" w:color="D9D9D9"/>
               <w:right w:val="nil"/>
             </w:tcBorders>
             <w:vAlign w:val="center"/>
@@ -1123,7 +1079,6 @@
             <w:r>
               <w:rPr>
                 <w:b/>
-                <w:color w:val="1F4E79"/>
                 <w:sz w:val="20"/>
               </w:rPr>
               <w:t>idRol</w:t>
@@ -1136,7 +1091,7 @@
             <w:tcBorders>
               <w:top w:val="nil"/>
               <w:left w:val="nil"/>
-              <w:bottom w:val="single" w:sz="4" w:color="BDD7EE"/>
+              <w:bottom w:val="single" w:sz="4" w:color="D9D9D9"/>
               <w:right w:val="nil"/>
             </w:tcBorders>
             <w:vAlign w:val="center"/>
@@ -1161,7 +1116,7 @@
             <w:tcBorders>
               <w:top w:val="nil"/>
               <w:left w:val="nil"/>
-              <w:bottom w:val="single" w:sz="4" w:color="BDD7EE"/>
+              <w:bottom w:val="single" w:sz="4" w:color="D9D9D9"/>
               <w:right w:val="nil"/>
             </w:tcBorders>
             <w:vAlign w:val="center"/>
@@ -1185,7 +1140,7 @@
             <w:tcBorders>
               <w:top w:val="nil"/>
               <w:left w:val="nil"/>
-              <w:bottom w:val="single" w:sz="4" w:color="BDD7EE"/>
+              <w:bottom w:val="single" w:sz="4" w:color="D9D9D9"/>
               <w:right w:val="nil"/>
             </w:tcBorders>
             <w:vAlign w:val="center"/>
@@ -1210,7 +1165,7 @@
             <w:tcBorders>
               <w:top w:val="nil"/>
               <w:left w:val="nil"/>
-              <w:bottom w:val="single" w:sz="4" w:color="BDD7EE"/>
+              <w:bottom w:val="single" w:sz="4" w:color="D9D9D9"/>
               <w:right w:val="nil"/>
             </w:tcBorders>
             <w:vAlign w:val="center"/>
@@ -1240,10 +1195,9 @@
             <w:tcBorders>
               <w:top w:val="nil"/>
               <w:left w:val="nil"/>
-              <w:bottom w:val="single" w:sz="4" w:color="BDD7EE"/>
+              <w:bottom w:val="single" w:sz="8" w:color="111111"/>
               <w:right w:val="nil"/>
             </w:tcBorders>
-            <w:shd w:val="clear" w:color="auto" w:fill="F2F7FC"/>
             <w:vAlign w:val="center"/>
           </w:tcPr>
           <w:p>
@@ -1254,7 +1208,6 @@
             <w:r>
               <w:rPr>
                 <w:b/>
-                <w:color w:val="1F4E79"/>
                 <w:sz w:val="20"/>
               </w:rPr>
               <w:t>nombreRol</w:t>
@@ -1267,10 +1220,9 @@
             <w:tcBorders>
               <w:top w:val="nil"/>
               <w:left w:val="nil"/>
-              <w:bottom w:val="single" w:sz="4" w:color="BDD7EE"/>
+              <w:bottom w:val="single" w:sz="8" w:color="111111"/>
               <w:right w:val="nil"/>
             </w:tcBorders>
-            <w:shd w:val="clear" w:color="auto" w:fill="F2F7FC"/>
             <w:vAlign w:val="center"/>
           </w:tcPr>
           <w:p>
@@ -1292,10 +1244,9 @@
             <w:tcBorders>
               <w:top w:val="nil"/>
               <w:left w:val="nil"/>
-              <w:bottom w:val="single" w:sz="4" w:color="BDD7EE"/>
+              <w:bottom w:val="single" w:sz="8" w:color="111111"/>
               <w:right w:val="nil"/>
             </w:tcBorders>
-            <w:shd w:val="clear" w:color="auto" w:fill="F2F7FC"/>
             <w:vAlign w:val="center"/>
           </w:tcPr>
           <w:p>
@@ -1317,10 +1268,9 @@
             <w:tcBorders>
               <w:top w:val="nil"/>
               <w:left w:val="nil"/>
-              <w:bottom w:val="single" w:sz="4" w:color="BDD7EE"/>
+              <w:bottom w:val="single" w:sz="8" w:color="111111"/>
               <w:right w:val="nil"/>
             </w:tcBorders>
-            <w:shd w:val="clear" w:color="auto" w:fill="F2F7FC"/>
             <w:vAlign w:val="center"/>
           </w:tcPr>
           <w:p>
@@ -1342,10 +1292,9 @@
             <w:tcBorders>
               <w:top w:val="nil"/>
               <w:left w:val="nil"/>
-              <w:bottom w:val="single" w:sz="4" w:color="BDD7EE"/>
+              <w:bottom w:val="single" w:sz="8" w:color="111111"/>
               <w:right w:val="nil"/>
             </w:tcBorders>
-            <w:shd w:val="clear" w:color="auto" w:fill="F2F7FC"/>
             <w:vAlign w:val="center"/>
           </w:tcPr>
           <w:p>
@@ -1421,11 +1370,10 @@
         <w:tc>
           <w:tcPr>
             <w:tcW w:type="dxa" w:w="2211"/>
-            <w:shd w:val="clear" w:color="auto" w:fill="1F4E79"/>
             <w:tcBorders>
-              <w:top w:val="nil"/>
+              <w:top w:val="single" w:sz="12" w:color="111111"/>
               <w:left w:val="nil"/>
-              <w:bottom w:val="nil"/>
+              <w:bottom w:val="single" w:sz="8" w:color="111111"/>
               <w:right w:val="nil"/>
             </w:tcBorders>
           </w:tcPr>
@@ -1438,7 +1386,6 @@
             <w:r>
               <w:rPr>
                 <w:b/>
-                <w:color w:val="FFFFFF"/>
                 <w:sz w:val="20"/>
               </w:rPr>
               <w:t>Campo</w:t>
@@ -1448,11 +1395,10 @@
         <w:tc>
           <w:tcPr>
             <w:tcW w:type="dxa" w:w="1304"/>
-            <w:shd w:val="clear" w:color="auto" w:fill="1F4E79"/>
             <w:tcBorders>
-              <w:top w:val="nil"/>
+              <w:top w:val="single" w:sz="12" w:color="111111"/>
               <w:left w:val="nil"/>
-              <w:bottom w:val="nil"/>
+              <w:bottom w:val="single" w:sz="8" w:color="111111"/>
               <w:right w:val="nil"/>
             </w:tcBorders>
           </w:tcPr>
@@ -1465,7 +1411,6 @@
             <w:r>
               <w:rPr>
                 <w:b/>
-                <w:color w:val="FFFFFF"/>
                 <w:sz w:val="20"/>
               </w:rPr>
               <w:t>Tipo</w:t>
@@ -1475,11 +1420,10 @@
         <w:tc>
           <w:tcPr>
             <w:tcW w:type="dxa" w:w="850"/>
-            <w:shd w:val="clear" w:color="auto" w:fill="1F4E79"/>
             <w:tcBorders>
-              <w:top w:val="nil"/>
+              <w:top w:val="single" w:sz="12" w:color="111111"/>
               <w:left w:val="nil"/>
-              <w:bottom w:val="nil"/>
+              <w:bottom w:val="single" w:sz="8" w:color="111111"/>
               <w:right w:val="nil"/>
             </w:tcBorders>
           </w:tcPr>
@@ -1492,7 +1436,6 @@
             <w:r>
               <w:rPr>
                 <w:b/>
-                <w:color w:val="FFFFFF"/>
                 <w:sz w:val="20"/>
               </w:rPr>
               <w:t>Long.</w:t>
@@ -1502,11 +1445,10 @@
         <w:tc>
           <w:tcPr>
             <w:tcW w:type="dxa" w:w="2154"/>
-            <w:shd w:val="clear" w:color="auto" w:fill="1F4E79"/>
             <w:tcBorders>
-              <w:top w:val="nil"/>
+              <w:top w:val="single" w:sz="12" w:color="111111"/>
               <w:left w:val="nil"/>
-              <w:bottom w:val="nil"/>
+              <w:bottom w:val="single" w:sz="8" w:color="111111"/>
               <w:right w:val="nil"/>
             </w:tcBorders>
           </w:tcPr>
@@ -1519,7 +1461,6 @@
             <w:r>
               <w:rPr>
                 <w:b/>
-                <w:color w:val="FFFFFF"/>
                 <w:sz w:val="20"/>
               </w:rPr>
               <w:t>Restricciones</w:t>
@@ -1529,11 +1470,10 @@
         <w:tc>
           <w:tcPr>
             <w:tcW w:type="dxa" w:w="2835"/>
-            <w:shd w:val="clear" w:color="auto" w:fill="1F4E79"/>
             <w:tcBorders>
-              <w:top w:val="nil"/>
+              <w:top w:val="single" w:sz="12" w:color="111111"/>
               <w:left w:val="nil"/>
-              <w:bottom w:val="nil"/>
+              <w:bottom w:val="single" w:sz="8" w:color="111111"/>
               <w:right w:val="nil"/>
             </w:tcBorders>
           </w:tcPr>
@@ -1546,7 +1486,6 @@
             <w:r>
               <w:rPr>
                 <w:b/>
-                <w:color w:val="FFFFFF"/>
                 <w:sz w:val="20"/>
               </w:rPr>
               <w:t>Descripción</w:t>
@@ -1564,7 +1503,7 @@
             <w:tcBorders>
               <w:top w:val="nil"/>
               <w:left w:val="nil"/>
-              <w:bottom w:val="single" w:sz="4" w:color="BDD7EE"/>
+              <w:bottom w:val="single" w:sz="4" w:color="D9D9D9"/>
               <w:right w:val="nil"/>
             </w:tcBorders>
             <w:vAlign w:val="center"/>
@@ -1578,7 +1517,6 @@
             <w:r>
               <w:rPr>
                 <w:b/>
-                <w:color w:val="1F4E79"/>
                 <w:sz w:val="20"/>
               </w:rPr>
               <w:t>idPermiso</w:t>
@@ -1591,7 +1529,7 @@
             <w:tcBorders>
               <w:top w:val="nil"/>
               <w:left w:val="nil"/>
-              <w:bottom w:val="single" w:sz="4" w:color="BDD7EE"/>
+              <w:bottom w:val="single" w:sz="4" w:color="D9D9D9"/>
               <w:right w:val="nil"/>
             </w:tcBorders>
             <w:vAlign w:val="center"/>
@@ -1616,7 +1554,7 @@
             <w:tcBorders>
               <w:top w:val="nil"/>
               <w:left w:val="nil"/>
-              <w:bottom w:val="single" w:sz="4" w:color="BDD7EE"/>
+              <w:bottom w:val="single" w:sz="4" w:color="D9D9D9"/>
               <w:right w:val="nil"/>
             </w:tcBorders>
             <w:vAlign w:val="center"/>
@@ -1640,7 +1578,7 @@
             <w:tcBorders>
               <w:top w:val="nil"/>
               <w:left w:val="nil"/>
-              <w:bottom w:val="single" w:sz="4" w:color="BDD7EE"/>
+              <w:bottom w:val="single" w:sz="4" w:color="D9D9D9"/>
               <w:right w:val="nil"/>
             </w:tcBorders>
             <w:vAlign w:val="center"/>
@@ -1665,7 +1603,7 @@
             <w:tcBorders>
               <w:top w:val="nil"/>
               <w:left w:val="nil"/>
-              <w:bottom w:val="single" w:sz="4" w:color="BDD7EE"/>
+              <w:bottom w:val="single" w:sz="4" w:color="D9D9D9"/>
               <w:right w:val="nil"/>
             </w:tcBorders>
             <w:vAlign w:val="center"/>
@@ -1695,10 +1633,9 @@
             <w:tcBorders>
               <w:top w:val="nil"/>
               <w:left w:val="nil"/>
-              <w:bottom w:val="single" w:sz="4" w:color="BDD7EE"/>
+              <w:bottom w:val="single" w:sz="8" w:color="111111"/>
               <w:right w:val="nil"/>
             </w:tcBorders>
-            <w:shd w:val="clear" w:color="auto" w:fill="F2F7FC"/>
             <w:vAlign w:val="center"/>
           </w:tcPr>
           <w:p>
@@ -1709,7 +1646,6 @@
             <w:r>
               <w:rPr>
                 <w:b/>
-                <w:color w:val="1F4E79"/>
                 <w:sz w:val="20"/>
               </w:rPr>
               <w:t>nombrePermiso</w:t>
@@ -1722,10 +1658,9 @@
             <w:tcBorders>
               <w:top w:val="nil"/>
               <w:left w:val="nil"/>
-              <w:bottom w:val="single" w:sz="4" w:color="BDD7EE"/>
+              <w:bottom w:val="single" w:sz="8" w:color="111111"/>
               <w:right w:val="nil"/>
             </w:tcBorders>
-            <w:shd w:val="clear" w:color="auto" w:fill="F2F7FC"/>
             <w:vAlign w:val="center"/>
           </w:tcPr>
           <w:p>
@@ -1747,10 +1682,9 @@
             <w:tcBorders>
               <w:top w:val="nil"/>
               <w:left w:val="nil"/>
-              <w:bottom w:val="single" w:sz="4" w:color="BDD7EE"/>
+              <w:bottom w:val="single" w:sz="8" w:color="111111"/>
               <w:right w:val="nil"/>
             </w:tcBorders>
-            <w:shd w:val="clear" w:color="auto" w:fill="F2F7FC"/>
             <w:vAlign w:val="center"/>
           </w:tcPr>
           <w:p>
@@ -1772,10 +1706,9 @@
             <w:tcBorders>
               <w:top w:val="nil"/>
               <w:left w:val="nil"/>
-              <w:bottom w:val="single" w:sz="4" w:color="BDD7EE"/>
+              <w:bottom w:val="single" w:sz="8" w:color="111111"/>
               <w:right w:val="nil"/>
             </w:tcBorders>
-            <w:shd w:val="clear" w:color="auto" w:fill="F2F7FC"/>
             <w:vAlign w:val="center"/>
           </w:tcPr>
           <w:p>
@@ -1797,10 +1730,9 @@
             <w:tcBorders>
               <w:top w:val="nil"/>
               <w:left w:val="nil"/>
-              <w:bottom w:val="single" w:sz="4" w:color="BDD7EE"/>
+              <w:bottom w:val="single" w:sz="8" w:color="111111"/>
               <w:right w:val="nil"/>
             </w:tcBorders>
-            <w:shd w:val="clear" w:color="auto" w:fill="F2F7FC"/>
             <w:vAlign w:val="center"/>
           </w:tcPr>
           <w:p>
@@ -1876,11 +1808,10 @@
         <w:tc>
           <w:tcPr>
             <w:tcW w:type="dxa" w:w="2211"/>
-            <w:shd w:val="clear" w:color="auto" w:fill="1F4E79"/>
             <w:tcBorders>
-              <w:top w:val="nil"/>
+              <w:top w:val="single" w:sz="12" w:color="111111"/>
               <w:left w:val="nil"/>
-              <w:bottom w:val="nil"/>
+              <w:bottom w:val="single" w:sz="8" w:color="111111"/>
               <w:right w:val="nil"/>
             </w:tcBorders>
           </w:tcPr>
@@ -1893,7 +1824,6 @@
             <w:r>
               <w:rPr>
                 <w:b/>
-                <w:color w:val="FFFFFF"/>
                 <w:sz w:val="20"/>
               </w:rPr>
               <w:t>Campo</w:t>
@@ -1903,11 +1833,10 @@
         <w:tc>
           <w:tcPr>
             <w:tcW w:type="dxa" w:w="1304"/>
-            <w:shd w:val="clear" w:color="auto" w:fill="1F4E79"/>
             <w:tcBorders>
-              <w:top w:val="nil"/>
+              <w:top w:val="single" w:sz="12" w:color="111111"/>
               <w:left w:val="nil"/>
-              <w:bottom w:val="nil"/>
+              <w:bottom w:val="single" w:sz="8" w:color="111111"/>
               <w:right w:val="nil"/>
             </w:tcBorders>
           </w:tcPr>
@@ -1920,7 +1849,6 @@
             <w:r>
               <w:rPr>
                 <w:b/>
-                <w:color w:val="FFFFFF"/>
                 <w:sz w:val="20"/>
               </w:rPr>
               <w:t>Tipo</w:t>
@@ -1930,11 +1858,10 @@
         <w:tc>
           <w:tcPr>
             <w:tcW w:type="dxa" w:w="850"/>
-            <w:shd w:val="clear" w:color="auto" w:fill="1F4E79"/>
             <w:tcBorders>
-              <w:top w:val="nil"/>
+              <w:top w:val="single" w:sz="12" w:color="111111"/>
               <w:left w:val="nil"/>
-              <w:bottom w:val="nil"/>
+              <w:bottom w:val="single" w:sz="8" w:color="111111"/>
               <w:right w:val="nil"/>
             </w:tcBorders>
           </w:tcPr>
@@ -1947,7 +1874,6 @@
             <w:r>
               <w:rPr>
                 <w:b/>
-                <w:color w:val="FFFFFF"/>
                 <w:sz w:val="20"/>
               </w:rPr>
               <w:t>Long.</w:t>
@@ -1957,11 +1883,10 @@
         <w:tc>
           <w:tcPr>
             <w:tcW w:type="dxa" w:w="2154"/>
-            <w:shd w:val="clear" w:color="auto" w:fill="1F4E79"/>
             <w:tcBorders>
-              <w:top w:val="nil"/>
+              <w:top w:val="single" w:sz="12" w:color="111111"/>
               <w:left w:val="nil"/>
-              <w:bottom w:val="nil"/>
+              <w:bottom w:val="single" w:sz="8" w:color="111111"/>
               <w:right w:val="nil"/>
             </w:tcBorders>
           </w:tcPr>
@@ -1974,7 +1899,6 @@
             <w:r>
               <w:rPr>
                 <w:b/>
-                <w:color w:val="FFFFFF"/>
                 <w:sz w:val="20"/>
               </w:rPr>
               <w:t>Restricciones</w:t>
@@ -1984,11 +1908,10 @@
         <w:tc>
           <w:tcPr>
             <w:tcW w:type="dxa" w:w="2835"/>
-            <w:shd w:val="clear" w:color="auto" w:fill="1F4E79"/>
             <w:tcBorders>
-              <w:top w:val="nil"/>
+              <w:top w:val="single" w:sz="12" w:color="111111"/>
               <w:left w:val="nil"/>
-              <w:bottom w:val="nil"/>
+              <w:bottom w:val="single" w:sz="8" w:color="111111"/>
               <w:right w:val="nil"/>
             </w:tcBorders>
           </w:tcPr>
@@ -2001,7 +1924,6 @@
             <w:r>
               <w:rPr>
                 <w:b/>
-                <w:color w:val="FFFFFF"/>
                 <w:sz w:val="20"/>
               </w:rPr>
               <w:t>Descripción</w:t>
@@ -2019,7 +1941,7 @@
             <w:tcBorders>
               <w:top w:val="nil"/>
               <w:left w:val="nil"/>
-              <w:bottom w:val="single" w:sz="4" w:color="BDD7EE"/>
+              <w:bottom w:val="single" w:sz="4" w:color="D9D9D9"/>
               <w:right w:val="nil"/>
             </w:tcBorders>
             <w:vAlign w:val="center"/>
@@ -2033,7 +1955,6 @@
             <w:r>
               <w:rPr>
                 <w:b/>
-                <w:color w:val="1F4E79"/>
                 <w:sz w:val="20"/>
               </w:rPr>
               <w:t>idRolPermiso</w:t>
@@ -2046,7 +1967,7 @@
             <w:tcBorders>
               <w:top w:val="nil"/>
               <w:left w:val="nil"/>
-              <w:bottom w:val="single" w:sz="4" w:color="BDD7EE"/>
+              <w:bottom w:val="single" w:sz="4" w:color="D9D9D9"/>
               <w:right w:val="nil"/>
             </w:tcBorders>
             <w:vAlign w:val="center"/>
@@ -2071,7 +1992,7 @@
             <w:tcBorders>
               <w:top w:val="nil"/>
               <w:left w:val="nil"/>
-              <w:bottom w:val="single" w:sz="4" w:color="BDD7EE"/>
+              <w:bottom w:val="single" w:sz="4" w:color="D9D9D9"/>
               <w:right w:val="nil"/>
             </w:tcBorders>
             <w:vAlign w:val="center"/>
@@ -2095,7 +2016,7 @@
             <w:tcBorders>
               <w:top w:val="nil"/>
               <w:left w:val="nil"/>
-              <w:bottom w:val="single" w:sz="4" w:color="BDD7EE"/>
+              <w:bottom w:val="single" w:sz="4" w:color="D9D9D9"/>
               <w:right w:val="nil"/>
             </w:tcBorders>
             <w:vAlign w:val="center"/>
@@ -2120,7 +2041,7 @@
             <w:tcBorders>
               <w:top w:val="nil"/>
               <w:left w:val="nil"/>
-              <w:bottom w:val="single" w:sz="4" w:color="BDD7EE"/>
+              <w:bottom w:val="single" w:sz="4" w:color="D9D9D9"/>
               <w:right w:val="nil"/>
             </w:tcBorders>
             <w:vAlign w:val="center"/>
@@ -2150,10 +2071,9 @@
             <w:tcBorders>
               <w:top w:val="nil"/>
               <w:left w:val="nil"/>
-              <w:bottom w:val="single" w:sz="4" w:color="BDD7EE"/>
+              <w:bottom w:val="single" w:sz="4" w:color="D9D9D9"/>
               <w:right w:val="nil"/>
             </w:tcBorders>
-            <w:shd w:val="clear" w:color="auto" w:fill="F2F7FC"/>
             <w:vAlign w:val="center"/>
           </w:tcPr>
           <w:p>
@@ -2165,7 +2085,6 @@
             <w:r>
               <w:rPr>
                 <w:b/>
-                <w:color w:val="1F4E79"/>
                 <w:sz w:val="20"/>
               </w:rPr>
               <w:t>id_Rol</w:t>
@@ -2178,10 +2097,9 @@
             <w:tcBorders>
               <w:top w:val="nil"/>
               <w:left w:val="nil"/>
-              <w:bottom w:val="single" w:sz="4" w:color="BDD7EE"/>
+              <w:bottom w:val="single" w:sz="4" w:color="D9D9D9"/>
               <w:right w:val="nil"/>
             </w:tcBorders>
-            <w:shd w:val="clear" w:color="auto" w:fill="F2F7FC"/>
             <w:vAlign w:val="center"/>
           </w:tcPr>
           <w:p>
@@ -2204,10 +2122,9 @@
             <w:tcBorders>
               <w:top w:val="nil"/>
               <w:left w:val="nil"/>
-              <w:bottom w:val="single" w:sz="4" w:color="BDD7EE"/>
+              <w:bottom w:val="single" w:sz="4" w:color="D9D9D9"/>
               <w:right w:val="nil"/>
             </w:tcBorders>
-            <w:shd w:val="clear" w:color="auto" w:fill="F2F7FC"/>
             <w:vAlign w:val="center"/>
           </w:tcPr>
           <w:p>
@@ -2229,10 +2146,9 @@
             <w:tcBorders>
               <w:top w:val="nil"/>
               <w:left w:val="nil"/>
-              <w:bottom w:val="single" w:sz="4" w:color="BDD7EE"/>
+              <w:bottom w:val="single" w:sz="4" w:color="D9D9D9"/>
               <w:right w:val="nil"/>
             </w:tcBorders>
-            <w:shd w:val="clear" w:color="auto" w:fill="F2F7FC"/>
             <w:vAlign w:val="center"/>
           </w:tcPr>
           <w:p>
@@ -2255,10 +2171,9 @@
             <w:tcBorders>
               <w:top w:val="nil"/>
               <w:left w:val="nil"/>
-              <w:bottom w:val="single" w:sz="4" w:color="BDD7EE"/>
+              <w:bottom w:val="single" w:sz="4" w:color="D9D9D9"/>
               <w:right w:val="nil"/>
             </w:tcBorders>
-            <w:shd w:val="clear" w:color="auto" w:fill="F2F7FC"/>
             <w:vAlign w:val="center"/>
           </w:tcPr>
           <w:p>
@@ -2286,7 +2201,7 @@
             <w:tcBorders>
               <w:top w:val="nil"/>
               <w:left w:val="nil"/>
-              <w:bottom w:val="single" w:sz="4" w:color="BDD7EE"/>
+              <w:bottom w:val="single" w:sz="8" w:color="111111"/>
               <w:right w:val="nil"/>
             </w:tcBorders>
             <w:vAlign w:val="center"/>
@@ -2299,7 +2214,6 @@
             <w:r>
               <w:rPr>
                 <w:b/>
-                <w:color w:val="1F4E79"/>
                 <w:sz w:val="20"/>
               </w:rPr>
               <w:t>id_Permiso</w:t>
@@ -2312,7 +2226,7 @@
             <w:tcBorders>
               <w:top w:val="nil"/>
               <w:left w:val="nil"/>
-              <w:bottom w:val="single" w:sz="4" w:color="BDD7EE"/>
+              <w:bottom w:val="single" w:sz="8" w:color="111111"/>
               <w:right w:val="nil"/>
             </w:tcBorders>
             <w:vAlign w:val="center"/>
@@ -2336,7 +2250,7 @@
             <w:tcBorders>
               <w:top w:val="nil"/>
               <w:left w:val="nil"/>
-              <w:bottom w:val="single" w:sz="4" w:color="BDD7EE"/>
+              <w:bottom w:val="single" w:sz="8" w:color="111111"/>
               <w:right w:val="nil"/>
             </w:tcBorders>
             <w:vAlign w:val="center"/>
@@ -2359,7 +2273,7 @@
             <w:tcBorders>
               <w:top w:val="nil"/>
               <w:left w:val="nil"/>
-              <w:bottom w:val="single" w:sz="4" w:color="BDD7EE"/>
+              <w:bottom w:val="single" w:sz="8" w:color="111111"/>
               <w:right w:val="nil"/>
             </w:tcBorders>
             <w:vAlign w:val="center"/>
@@ -2383,7 +2297,7 @@
             <w:tcBorders>
               <w:top w:val="nil"/>
               <w:left w:val="nil"/>
-              <w:bottom w:val="single" w:sz="4" w:color="BDD7EE"/>
+              <w:bottom w:val="single" w:sz="8" w:color="111111"/>
               <w:right w:val="nil"/>
             </w:tcBorders>
             <w:vAlign w:val="center"/>
@@ -2461,11 +2375,10 @@
         <w:tc>
           <w:tcPr>
             <w:tcW w:type="dxa" w:w="2211"/>
-            <w:shd w:val="clear" w:color="auto" w:fill="1F4E79"/>
             <w:tcBorders>
-              <w:top w:val="nil"/>
+              <w:top w:val="single" w:sz="12" w:color="111111"/>
               <w:left w:val="nil"/>
-              <w:bottom w:val="nil"/>
+              <w:bottom w:val="single" w:sz="8" w:color="111111"/>
               <w:right w:val="nil"/>
             </w:tcBorders>
           </w:tcPr>
@@ -2478,7 +2391,6 @@
             <w:r>
               <w:rPr>
                 <w:b/>
-                <w:color w:val="FFFFFF"/>
                 <w:sz w:val="20"/>
               </w:rPr>
               <w:t>Campo</w:t>
@@ -2488,11 +2400,10 @@
         <w:tc>
           <w:tcPr>
             <w:tcW w:type="dxa" w:w="1304"/>
-            <w:shd w:val="clear" w:color="auto" w:fill="1F4E79"/>
             <w:tcBorders>
-              <w:top w:val="nil"/>
+              <w:top w:val="single" w:sz="12" w:color="111111"/>
               <w:left w:val="nil"/>
-              <w:bottom w:val="nil"/>
+              <w:bottom w:val="single" w:sz="8" w:color="111111"/>
               <w:right w:val="nil"/>
             </w:tcBorders>
           </w:tcPr>
@@ -2505,7 +2416,6 @@
             <w:r>
               <w:rPr>
                 <w:b/>
-                <w:color w:val="FFFFFF"/>
                 <w:sz w:val="20"/>
               </w:rPr>
               <w:t>Tipo</w:t>
@@ -2515,11 +2425,10 @@
         <w:tc>
           <w:tcPr>
             <w:tcW w:type="dxa" w:w="850"/>
-            <w:shd w:val="clear" w:color="auto" w:fill="1F4E79"/>
             <w:tcBorders>
-              <w:top w:val="nil"/>
+              <w:top w:val="single" w:sz="12" w:color="111111"/>
               <w:left w:val="nil"/>
-              <w:bottom w:val="nil"/>
+              <w:bottom w:val="single" w:sz="8" w:color="111111"/>
               <w:right w:val="nil"/>
             </w:tcBorders>
           </w:tcPr>
@@ -2532,7 +2441,6 @@
             <w:r>
               <w:rPr>
                 <w:b/>
-                <w:color w:val="FFFFFF"/>
                 <w:sz w:val="20"/>
               </w:rPr>
               <w:t>Long.</w:t>
@@ -2542,11 +2450,10 @@
         <w:tc>
           <w:tcPr>
             <w:tcW w:type="dxa" w:w="2154"/>
-            <w:shd w:val="clear" w:color="auto" w:fill="1F4E79"/>
             <w:tcBorders>
-              <w:top w:val="nil"/>
+              <w:top w:val="single" w:sz="12" w:color="111111"/>
               <w:left w:val="nil"/>
-              <w:bottom w:val="nil"/>
+              <w:bottom w:val="single" w:sz="8" w:color="111111"/>
               <w:right w:val="nil"/>
             </w:tcBorders>
           </w:tcPr>
@@ -2559,7 +2466,6 @@
             <w:r>
               <w:rPr>
                 <w:b/>
-                <w:color w:val="FFFFFF"/>
                 <w:sz w:val="20"/>
               </w:rPr>
               <w:t>Restricciones</w:t>
@@ -2569,11 +2475,10 @@
         <w:tc>
           <w:tcPr>
             <w:tcW w:type="dxa" w:w="2835"/>
-            <w:shd w:val="clear" w:color="auto" w:fill="1F4E79"/>
             <w:tcBorders>
-              <w:top w:val="nil"/>
+              <w:top w:val="single" w:sz="12" w:color="111111"/>
               <w:left w:val="nil"/>
-              <w:bottom w:val="nil"/>
+              <w:bottom w:val="single" w:sz="8" w:color="111111"/>
               <w:right w:val="nil"/>
             </w:tcBorders>
           </w:tcPr>
@@ -2586,7 +2491,6 @@
             <w:r>
               <w:rPr>
                 <w:b/>
-                <w:color w:val="FFFFFF"/>
                 <w:sz w:val="20"/>
               </w:rPr>
               <w:t>Descripción</w:t>
@@ -2604,7 +2508,7 @@
             <w:tcBorders>
               <w:top w:val="nil"/>
               <w:left w:val="nil"/>
-              <w:bottom w:val="single" w:sz="4" w:color="BDD7EE"/>
+              <w:bottom w:val="single" w:sz="4" w:color="D9D9D9"/>
               <w:right w:val="nil"/>
             </w:tcBorders>
             <w:vAlign w:val="center"/>
@@ -2618,7 +2522,6 @@
             <w:r>
               <w:rPr>
                 <w:b/>
-                <w:color w:val="1F4E79"/>
                 <w:sz w:val="20"/>
               </w:rPr>
               <w:t>idUsuario</w:t>
@@ -2631,7 +2534,7 @@
             <w:tcBorders>
               <w:top w:val="nil"/>
               <w:left w:val="nil"/>
-              <w:bottom w:val="single" w:sz="4" w:color="BDD7EE"/>
+              <w:bottom w:val="single" w:sz="4" w:color="D9D9D9"/>
               <w:right w:val="nil"/>
             </w:tcBorders>
             <w:vAlign w:val="center"/>
@@ -2656,7 +2559,7 @@
             <w:tcBorders>
               <w:top w:val="nil"/>
               <w:left w:val="nil"/>
-              <w:bottom w:val="single" w:sz="4" w:color="BDD7EE"/>
+              <w:bottom w:val="single" w:sz="4" w:color="D9D9D9"/>
               <w:right w:val="nil"/>
             </w:tcBorders>
             <w:vAlign w:val="center"/>
@@ -2680,7 +2583,7 @@
             <w:tcBorders>
               <w:top w:val="nil"/>
               <w:left w:val="nil"/>
-              <w:bottom w:val="single" w:sz="4" w:color="BDD7EE"/>
+              <w:bottom w:val="single" w:sz="4" w:color="D9D9D9"/>
               <w:right w:val="nil"/>
             </w:tcBorders>
             <w:vAlign w:val="center"/>
@@ -2705,7 +2608,7 @@
             <w:tcBorders>
               <w:top w:val="nil"/>
               <w:left w:val="nil"/>
-              <w:bottom w:val="single" w:sz="4" w:color="BDD7EE"/>
+              <w:bottom w:val="single" w:sz="4" w:color="D9D9D9"/>
               <w:right w:val="nil"/>
             </w:tcBorders>
             <w:vAlign w:val="center"/>
@@ -2735,10 +2638,9 @@
             <w:tcBorders>
               <w:top w:val="nil"/>
               <w:left w:val="nil"/>
-              <w:bottom w:val="single" w:sz="4" w:color="BDD7EE"/>
+              <w:bottom w:val="single" w:sz="4" w:color="D9D9D9"/>
               <w:right w:val="nil"/>
             </w:tcBorders>
-            <w:shd w:val="clear" w:color="auto" w:fill="F2F7FC"/>
             <w:vAlign w:val="center"/>
           </w:tcPr>
           <w:p>
@@ -2750,7 +2652,6 @@
             <w:r>
               <w:rPr>
                 <w:b/>
-                <w:color w:val="1F4E79"/>
                 <w:sz w:val="20"/>
               </w:rPr>
               <w:t>nombreUsuario</w:t>
@@ -2763,10 +2664,9 @@
             <w:tcBorders>
               <w:top w:val="nil"/>
               <w:left w:val="nil"/>
-              <w:bottom w:val="single" w:sz="4" w:color="BDD7EE"/>
+              <w:bottom w:val="single" w:sz="4" w:color="D9D9D9"/>
               <w:right w:val="nil"/>
             </w:tcBorders>
-            <w:shd w:val="clear" w:color="auto" w:fill="F2F7FC"/>
             <w:vAlign w:val="center"/>
           </w:tcPr>
           <w:p>
@@ -2789,10 +2689,9 @@
             <w:tcBorders>
               <w:top w:val="nil"/>
               <w:left w:val="nil"/>
-              <w:bottom w:val="single" w:sz="4" w:color="BDD7EE"/>
+              <w:bottom w:val="single" w:sz="4" w:color="D9D9D9"/>
               <w:right w:val="nil"/>
             </w:tcBorders>
-            <w:shd w:val="clear" w:color="auto" w:fill="F2F7FC"/>
             <w:vAlign w:val="center"/>
           </w:tcPr>
           <w:p>
@@ -2815,10 +2714,9 @@
             <w:tcBorders>
               <w:top w:val="nil"/>
               <w:left w:val="nil"/>
-              <w:bottom w:val="single" w:sz="4" w:color="BDD7EE"/>
+              <w:bottom w:val="single" w:sz="4" w:color="D9D9D9"/>
               <w:right w:val="nil"/>
             </w:tcBorders>
-            <w:shd w:val="clear" w:color="auto" w:fill="F2F7FC"/>
             <w:vAlign w:val="center"/>
           </w:tcPr>
           <w:p>
@@ -2841,10 +2739,9 @@
             <w:tcBorders>
               <w:top w:val="nil"/>
               <w:left w:val="nil"/>
-              <w:bottom w:val="single" w:sz="4" w:color="BDD7EE"/>
+              <w:bottom w:val="single" w:sz="4" w:color="D9D9D9"/>
               <w:right w:val="nil"/>
             </w:tcBorders>
-            <w:shd w:val="clear" w:color="auto" w:fill="F2F7FC"/>
             <w:vAlign w:val="center"/>
           </w:tcPr>
           <w:p>
@@ -2872,7 +2769,7 @@
             <w:tcBorders>
               <w:top w:val="nil"/>
               <w:left w:val="nil"/>
-              <w:bottom w:val="single" w:sz="4" w:color="BDD7EE"/>
+              <w:bottom w:val="single" w:sz="4" w:color="D9D9D9"/>
               <w:right w:val="nil"/>
             </w:tcBorders>
             <w:vAlign w:val="center"/>
@@ -2886,7 +2783,6 @@
             <w:r>
               <w:rPr>
                 <w:b/>
-                <w:color w:val="1F4E79"/>
                 <w:sz w:val="20"/>
               </w:rPr>
               <w:t>clave</w:t>
@@ -2899,7 +2795,7 @@
             <w:tcBorders>
               <w:top w:val="nil"/>
               <w:left w:val="nil"/>
-              <w:bottom w:val="single" w:sz="4" w:color="BDD7EE"/>
+              <w:bottom w:val="single" w:sz="4" w:color="D9D9D9"/>
               <w:right w:val="nil"/>
             </w:tcBorders>
             <w:vAlign w:val="center"/>
@@ -2924,7 +2820,7 @@
             <w:tcBorders>
               <w:top w:val="nil"/>
               <w:left w:val="nil"/>
-              <w:bottom w:val="single" w:sz="4" w:color="BDD7EE"/>
+              <w:bottom w:val="single" w:sz="4" w:color="D9D9D9"/>
               <w:right w:val="nil"/>
             </w:tcBorders>
             <w:vAlign w:val="center"/>
@@ -2949,7 +2845,7 @@
             <w:tcBorders>
               <w:top w:val="nil"/>
               <w:left w:val="nil"/>
-              <w:bottom w:val="single" w:sz="4" w:color="BDD7EE"/>
+              <w:bottom w:val="single" w:sz="4" w:color="D9D9D9"/>
               <w:right w:val="nil"/>
             </w:tcBorders>
             <w:vAlign w:val="center"/>
@@ -2974,7 +2870,7 @@
             <w:tcBorders>
               <w:top w:val="nil"/>
               <w:left w:val="nil"/>
-              <w:bottom w:val="single" w:sz="4" w:color="BDD7EE"/>
+              <w:bottom w:val="single" w:sz="4" w:color="D9D9D9"/>
               <w:right w:val="nil"/>
             </w:tcBorders>
             <w:vAlign w:val="center"/>
@@ -3004,10 +2900,9 @@
             <w:tcBorders>
               <w:top w:val="nil"/>
               <w:left w:val="nil"/>
-              <w:bottom w:val="single" w:sz="4" w:color="BDD7EE"/>
+              <w:bottom w:val="single" w:sz="4" w:color="D9D9D9"/>
               <w:right w:val="nil"/>
             </w:tcBorders>
-            <w:shd w:val="clear" w:color="auto" w:fill="F2F7FC"/>
             <w:vAlign w:val="center"/>
           </w:tcPr>
           <w:p>
@@ -3019,7 +2914,6 @@
             <w:r>
               <w:rPr>
                 <w:b/>
-                <w:color w:val="1F4E79"/>
                 <w:sz w:val="20"/>
               </w:rPr>
               <w:t>nombreCompleto</w:t>
@@ -3032,10 +2926,9 @@
             <w:tcBorders>
               <w:top w:val="nil"/>
               <w:left w:val="nil"/>
-              <w:bottom w:val="single" w:sz="4" w:color="BDD7EE"/>
+              <w:bottom w:val="single" w:sz="4" w:color="D9D9D9"/>
               <w:right w:val="nil"/>
             </w:tcBorders>
-            <w:shd w:val="clear" w:color="auto" w:fill="F2F7FC"/>
             <w:vAlign w:val="center"/>
           </w:tcPr>
           <w:p>
@@ -3058,10 +2951,9 @@
             <w:tcBorders>
               <w:top w:val="nil"/>
               <w:left w:val="nil"/>
-              <w:bottom w:val="single" w:sz="4" w:color="BDD7EE"/>
+              <w:bottom w:val="single" w:sz="4" w:color="D9D9D9"/>
               <w:right w:val="nil"/>
             </w:tcBorders>
-            <w:shd w:val="clear" w:color="auto" w:fill="F2F7FC"/>
             <w:vAlign w:val="center"/>
           </w:tcPr>
           <w:p>
@@ -3084,10 +2976,9 @@
             <w:tcBorders>
               <w:top w:val="nil"/>
               <w:left w:val="nil"/>
-              <w:bottom w:val="single" w:sz="4" w:color="BDD7EE"/>
+              <w:bottom w:val="single" w:sz="4" w:color="D9D9D9"/>
               <w:right w:val="nil"/>
             </w:tcBorders>
-            <w:shd w:val="clear" w:color="auto" w:fill="F2F7FC"/>
             <w:vAlign w:val="center"/>
           </w:tcPr>
           <w:p>
@@ -3110,10 +3001,9 @@
             <w:tcBorders>
               <w:top w:val="nil"/>
               <w:left w:val="nil"/>
-              <w:bottom w:val="single" w:sz="4" w:color="BDD7EE"/>
+              <w:bottom w:val="single" w:sz="4" w:color="D9D9D9"/>
               <w:right w:val="nil"/>
             </w:tcBorders>
-            <w:shd w:val="clear" w:color="auto" w:fill="F2F7FC"/>
             <w:vAlign w:val="center"/>
           </w:tcPr>
           <w:p>
@@ -3141,7 +3031,7 @@
             <w:tcBorders>
               <w:top w:val="nil"/>
               <w:left w:val="nil"/>
-              <w:bottom w:val="single" w:sz="4" w:color="BDD7EE"/>
+              <w:bottom w:val="single" w:sz="4" w:color="D9D9D9"/>
               <w:right w:val="nil"/>
             </w:tcBorders>
             <w:vAlign w:val="center"/>
@@ -3155,7 +3045,6 @@
             <w:r>
               <w:rPr>
                 <w:b/>
-                <w:color w:val="1F4E79"/>
                 <w:sz w:val="20"/>
               </w:rPr>
               <w:t>id_Rol</w:t>
@@ -3168,7 +3057,7 @@
             <w:tcBorders>
               <w:top w:val="nil"/>
               <w:left w:val="nil"/>
-              <w:bottom w:val="single" w:sz="4" w:color="BDD7EE"/>
+              <w:bottom w:val="single" w:sz="4" w:color="D9D9D9"/>
               <w:right w:val="nil"/>
             </w:tcBorders>
             <w:vAlign w:val="center"/>
@@ -3193,7 +3082,7 @@
             <w:tcBorders>
               <w:top w:val="nil"/>
               <w:left w:val="nil"/>
-              <w:bottom w:val="single" w:sz="4" w:color="BDD7EE"/>
+              <w:bottom w:val="single" w:sz="4" w:color="D9D9D9"/>
               <w:right w:val="nil"/>
             </w:tcBorders>
             <w:vAlign w:val="center"/>
@@ -3217,7 +3106,7 @@
             <w:tcBorders>
               <w:top w:val="nil"/>
               <w:left w:val="nil"/>
-              <w:bottom w:val="single" w:sz="4" w:color="BDD7EE"/>
+              <w:bottom w:val="single" w:sz="4" w:color="D9D9D9"/>
               <w:right w:val="nil"/>
             </w:tcBorders>
             <w:vAlign w:val="center"/>
@@ -3242,7 +3131,7 @@
             <w:tcBorders>
               <w:top w:val="nil"/>
               <w:left w:val="nil"/>
-              <w:bottom w:val="single" w:sz="4" w:color="BDD7EE"/>
+              <w:bottom w:val="single" w:sz="4" w:color="D9D9D9"/>
               <w:right w:val="nil"/>
             </w:tcBorders>
             <w:vAlign w:val="center"/>
@@ -3272,10 +3161,9 @@
             <w:tcBorders>
               <w:top w:val="nil"/>
               <w:left w:val="nil"/>
-              <w:bottom w:val="single" w:sz="4" w:color="BDD7EE"/>
+              <w:bottom w:val="single" w:sz="8" w:color="111111"/>
               <w:right w:val="nil"/>
             </w:tcBorders>
-            <w:shd w:val="clear" w:color="auto" w:fill="F2F7FC"/>
             <w:vAlign w:val="center"/>
           </w:tcPr>
           <w:p>
@@ -3286,7 +3174,6 @@
             <w:r>
               <w:rPr>
                 <w:b/>
-                <w:color w:val="1F4E79"/>
                 <w:sz w:val="20"/>
               </w:rPr>
               <w:t>activo</w:t>
@@ -3299,10 +3186,9 @@
             <w:tcBorders>
               <w:top w:val="nil"/>
               <w:left w:val="nil"/>
-              <w:bottom w:val="single" w:sz="4" w:color="BDD7EE"/>
+              <w:bottom w:val="single" w:sz="8" w:color="111111"/>
               <w:right w:val="nil"/>
             </w:tcBorders>
-            <w:shd w:val="clear" w:color="auto" w:fill="F2F7FC"/>
             <w:vAlign w:val="center"/>
           </w:tcPr>
           <w:p>
@@ -3324,10 +3210,9 @@
             <w:tcBorders>
               <w:top w:val="nil"/>
               <w:left w:val="nil"/>
-              <w:bottom w:val="single" w:sz="4" w:color="BDD7EE"/>
+              <w:bottom w:val="single" w:sz="8" w:color="111111"/>
               <w:right w:val="nil"/>
             </w:tcBorders>
-            <w:shd w:val="clear" w:color="auto" w:fill="F2F7FC"/>
             <w:vAlign w:val="center"/>
           </w:tcPr>
           <w:p>
@@ -3348,10 +3233,9 @@
             <w:tcBorders>
               <w:top w:val="nil"/>
               <w:left w:val="nil"/>
-              <w:bottom w:val="single" w:sz="4" w:color="BDD7EE"/>
+              <w:bottom w:val="single" w:sz="8" w:color="111111"/>
               <w:right w:val="nil"/>
             </w:tcBorders>
-            <w:shd w:val="clear" w:color="auto" w:fill="F2F7FC"/>
             <w:vAlign w:val="center"/>
           </w:tcPr>
           <w:p>
@@ -3373,10 +3257,9 @@
             <w:tcBorders>
               <w:top w:val="nil"/>
               <w:left w:val="nil"/>
-              <w:bottom w:val="single" w:sz="4" w:color="BDD7EE"/>
+              <w:bottom w:val="single" w:sz="8" w:color="111111"/>
               <w:right w:val="nil"/>
             </w:tcBorders>
-            <w:shd w:val="clear" w:color="auto" w:fill="F2F7FC"/>
             <w:vAlign w:val="center"/>
           </w:tcPr>
           <w:p>
@@ -3452,11 +3335,10 @@
         <w:tc>
           <w:tcPr>
             <w:tcW w:type="dxa" w:w="2211"/>
-            <w:shd w:val="clear" w:color="auto" w:fill="1F4E79"/>
             <w:tcBorders>
-              <w:top w:val="nil"/>
+              <w:top w:val="single" w:sz="12" w:color="111111"/>
               <w:left w:val="nil"/>
-              <w:bottom w:val="nil"/>
+              <w:bottom w:val="single" w:sz="8" w:color="111111"/>
               <w:right w:val="nil"/>
             </w:tcBorders>
           </w:tcPr>
@@ -3469,7 +3351,6 @@
             <w:r>
               <w:rPr>
                 <w:b/>
-                <w:color w:val="FFFFFF"/>
                 <w:sz w:val="20"/>
               </w:rPr>
               <w:t>Campo</w:t>
@@ -3479,11 +3360,10 @@
         <w:tc>
           <w:tcPr>
             <w:tcW w:type="dxa" w:w="1304"/>
-            <w:shd w:val="clear" w:color="auto" w:fill="1F4E79"/>
             <w:tcBorders>
-              <w:top w:val="nil"/>
+              <w:top w:val="single" w:sz="12" w:color="111111"/>
               <w:left w:val="nil"/>
-              <w:bottom w:val="nil"/>
+              <w:bottom w:val="single" w:sz="8" w:color="111111"/>
               <w:right w:val="nil"/>
             </w:tcBorders>
           </w:tcPr>
@@ -3496,7 +3376,6 @@
             <w:r>
               <w:rPr>
                 <w:b/>
-                <w:color w:val="FFFFFF"/>
                 <w:sz w:val="20"/>
               </w:rPr>
               <w:t>Tipo</w:t>
@@ -3506,11 +3385,10 @@
         <w:tc>
           <w:tcPr>
             <w:tcW w:type="dxa" w:w="850"/>
-            <w:shd w:val="clear" w:color="auto" w:fill="1F4E79"/>
             <w:tcBorders>
-              <w:top w:val="nil"/>
+              <w:top w:val="single" w:sz="12" w:color="111111"/>
               <w:left w:val="nil"/>
-              <w:bottom w:val="nil"/>
+              <w:bottom w:val="single" w:sz="8" w:color="111111"/>
               <w:right w:val="nil"/>
             </w:tcBorders>
           </w:tcPr>
@@ -3523,7 +3401,6 @@
             <w:r>
               <w:rPr>
                 <w:b/>
-                <w:color w:val="FFFFFF"/>
                 <w:sz w:val="20"/>
               </w:rPr>
               <w:t>Long.</w:t>
@@ -3533,11 +3410,10 @@
         <w:tc>
           <w:tcPr>
             <w:tcW w:type="dxa" w:w="2154"/>
-            <w:shd w:val="clear" w:color="auto" w:fill="1F4E79"/>
             <w:tcBorders>
-              <w:top w:val="nil"/>
+              <w:top w:val="single" w:sz="12" w:color="111111"/>
               <w:left w:val="nil"/>
-              <w:bottom w:val="nil"/>
+              <w:bottom w:val="single" w:sz="8" w:color="111111"/>
               <w:right w:val="nil"/>
             </w:tcBorders>
           </w:tcPr>
@@ -3550,7 +3426,6 @@
             <w:r>
               <w:rPr>
                 <w:b/>
-                <w:color w:val="FFFFFF"/>
                 <w:sz w:val="20"/>
               </w:rPr>
               <w:t>Restricciones</w:t>
@@ -3560,11 +3435,10 @@
         <w:tc>
           <w:tcPr>
             <w:tcW w:type="dxa" w:w="2835"/>
-            <w:shd w:val="clear" w:color="auto" w:fill="1F4E79"/>
             <w:tcBorders>
-              <w:top w:val="nil"/>
+              <w:top w:val="single" w:sz="12" w:color="111111"/>
               <w:left w:val="nil"/>
-              <w:bottom w:val="nil"/>
+              <w:bottom w:val="single" w:sz="8" w:color="111111"/>
               <w:right w:val="nil"/>
             </w:tcBorders>
           </w:tcPr>
@@ -3577,7 +3451,6 @@
             <w:r>
               <w:rPr>
                 <w:b/>
-                <w:color w:val="FFFFFF"/>
                 <w:sz w:val="20"/>
               </w:rPr>
               <w:t>Descripción</w:t>
@@ -3595,7 +3468,7 @@
             <w:tcBorders>
               <w:top w:val="nil"/>
               <w:left w:val="nil"/>
-              <w:bottom w:val="single" w:sz="4" w:color="BDD7EE"/>
+              <w:bottom w:val="single" w:sz="4" w:color="D9D9D9"/>
               <w:right w:val="nil"/>
             </w:tcBorders>
             <w:vAlign w:val="center"/>
@@ -3609,7 +3482,6 @@
             <w:r>
               <w:rPr>
                 <w:b/>
-                <w:color w:val="1F4E79"/>
                 <w:sz w:val="20"/>
               </w:rPr>
               <w:t>idEspecialidad</w:t>
@@ -3622,7 +3494,7 @@
             <w:tcBorders>
               <w:top w:val="nil"/>
               <w:left w:val="nil"/>
-              <w:bottom w:val="single" w:sz="4" w:color="BDD7EE"/>
+              <w:bottom w:val="single" w:sz="4" w:color="D9D9D9"/>
               <w:right w:val="nil"/>
             </w:tcBorders>
             <w:vAlign w:val="center"/>
@@ -3647,7 +3519,7 @@
             <w:tcBorders>
               <w:top w:val="nil"/>
               <w:left w:val="nil"/>
-              <w:bottom w:val="single" w:sz="4" w:color="BDD7EE"/>
+              <w:bottom w:val="single" w:sz="4" w:color="D9D9D9"/>
               <w:right w:val="nil"/>
             </w:tcBorders>
             <w:vAlign w:val="center"/>
@@ -3671,7 +3543,7 @@
             <w:tcBorders>
               <w:top w:val="nil"/>
               <w:left w:val="nil"/>
-              <w:bottom w:val="single" w:sz="4" w:color="BDD7EE"/>
+              <w:bottom w:val="single" w:sz="4" w:color="D9D9D9"/>
               <w:right w:val="nil"/>
             </w:tcBorders>
             <w:vAlign w:val="center"/>
@@ -3696,7 +3568,7 @@
             <w:tcBorders>
               <w:top w:val="nil"/>
               <w:left w:val="nil"/>
-              <w:bottom w:val="single" w:sz="4" w:color="BDD7EE"/>
+              <w:bottom w:val="single" w:sz="4" w:color="D9D9D9"/>
               <w:right w:val="nil"/>
             </w:tcBorders>
             <w:vAlign w:val="center"/>
@@ -3726,10 +3598,9 @@
             <w:tcBorders>
               <w:top w:val="nil"/>
               <w:left w:val="nil"/>
-              <w:bottom w:val="single" w:sz="4" w:color="BDD7EE"/>
+              <w:bottom w:val="single" w:sz="8" w:color="111111"/>
               <w:right w:val="nil"/>
             </w:tcBorders>
-            <w:shd w:val="clear" w:color="auto" w:fill="F2F7FC"/>
             <w:vAlign w:val="center"/>
           </w:tcPr>
           <w:p>
@@ -3740,7 +3611,6 @@
             <w:r>
               <w:rPr>
                 <w:b/>
-                <w:color w:val="1F4E79"/>
                 <w:sz w:val="20"/>
               </w:rPr>
               <w:t>nombreEspecialidad</w:t>
@@ -3753,10 +3623,9 @@
             <w:tcBorders>
               <w:top w:val="nil"/>
               <w:left w:val="nil"/>
-              <w:bottom w:val="single" w:sz="4" w:color="BDD7EE"/>
+              <w:bottom w:val="single" w:sz="8" w:color="111111"/>
               <w:right w:val="nil"/>
             </w:tcBorders>
-            <w:shd w:val="clear" w:color="auto" w:fill="F2F7FC"/>
             <w:vAlign w:val="center"/>
           </w:tcPr>
           <w:p>
@@ -3778,10 +3647,9 @@
             <w:tcBorders>
               <w:top w:val="nil"/>
               <w:left w:val="nil"/>
-              <w:bottom w:val="single" w:sz="4" w:color="BDD7EE"/>
+              <w:bottom w:val="single" w:sz="8" w:color="111111"/>
               <w:right w:val="nil"/>
             </w:tcBorders>
-            <w:shd w:val="clear" w:color="auto" w:fill="F2F7FC"/>
             <w:vAlign w:val="center"/>
           </w:tcPr>
           <w:p>
@@ -3803,10 +3671,9 @@
             <w:tcBorders>
               <w:top w:val="nil"/>
               <w:left w:val="nil"/>
-              <w:bottom w:val="single" w:sz="4" w:color="BDD7EE"/>
+              <w:bottom w:val="single" w:sz="8" w:color="111111"/>
               <w:right w:val="nil"/>
             </w:tcBorders>
-            <w:shd w:val="clear" w:color="auto" w:fill="F2F7FC"/>
             <w:vAlign w:val="center"/>
           </w:tcPr>
           <w:p>
@@ -3828,10 +3695,9 @@
             <w:tcBorders>
               <w:top w:val="nil"/>
               <w:left w:val="nil"/>
-              <w:bottom w:val="single" w:sz="4" w:color="BDD7EE"/>
+              <w:bottom w:val="single" w:sz="8" w:color="111111"/>
               <w:right w:val="nil"/>
             </w:tcBorders>
-            <w:shd w:val="clear" w:color="auto" w:fill="F2F7FC"/>
             <w:vAlign w:val="center"/>
           </w:tcPr>
           <w:p>
@@ -3907,11 +3773,10 @@
         <w:tc>
           <w:tcPr>
             <w:tcW w:type="dxa" w:w="2211"/>
-            <w:shd w:val="clear" w:color="auto" w:fill="1F4E79"/>
             <w:tcBorders>
-              <w:top w:val="nil"/>
+              <w:top w:val="single" w:sz="12" w:color="111111"/>
               <w:left w:val="nil"/>
-              <w:bottom w:val="nil"/>
+              <w:bottom w:val="single" w:sz="8" w:color="111111"/>
               <w:right w:val="nil"/>
             </w:tcBorders>
           </w:tcPr>
@@ -3924,7 +3789,6 @@
             <w:r>
               <w:rPr>
                 <w:b/>
-                <w:color w:val="FFFFFF"/>
                 <w:sz w:val="20"/>
               </w:rPr>
               <w:t>Campo</w:t>
@@ -3934,11 +3798,10 @@
         <w:tc>
           <w:tcPr>
             <w:tcW w:type="dxa" w:w="1304"/>
-            <w:shd w:val="clear" w:color="auto" w:fill="1F4E79"/>
             <w:tcBorders>
-              <w:top w:val="nil"/>
+              <w:top w:val="single" w:sz="12" w:color="111111"/>
               <w:left w:val="nil"/>
-              <w:bottom w:val="nil"/>
+              <w:bottom w:val="single" w:sz="8" w:color="111111"/>
               <w:right w:val="nil"/>
             </w:tcBorders>
           </w:tcPr>
@@ -3951,7 +3814,6 @@
             <w:r>
               <w:rPr>
                 <w:b/>
-                <w:color w:val="FFFFFF"/>
                 <w:sz w:val="20"/>
               </w:rPr>
               <w:t>Tipo</w:t>
@@ -3961,11 +3823,10 @@
         <w:tc>
           <w:tcPr>
             <w:tcW w:type="dxa" w:w="850"/>
-            <w:shd w:val="clear" w:color="auto" w:fill="1F4E79"/>
             <w:tcBorders>
-              <w:top w:val="nil"/>
+              <w:top w:val="single" w:sz="12" w:color="111111"/>
               <w:left w:val="nil"/>
-              <w:bottom w:val="nil"/>
+              <w:bottom w:val="single" w:sz="8" w:color="111111"/>
               <w:right w:val="nil"/>
             </w:tcBorders>
           </w:tcPr>
@@ -3978,7 +3839,6 @@
             <w:r>
               <w:rPr>
                 <w:b/>
-                <w:color w:val="FFFFFF"/>
                 <w:sz w:val="20"/>
               </w:rPr>
               <w:t>Long.</w:t>
@@ -3988,11 +3848,10 @@
         <w:tc>
           <w:tcPr>
             <w:tcW w:type="dxa" w:w="2154"/>
-            <w:shd w:val="clear" w:color="auto" w:fill="1F4E79"/>
             <w:tcBorders>
-              <w:top w:val="nil"/>
+              <w:top w:val="single" w:sz="12" w:color="111111"/>
               <w:left w:val="nil"/>
-              <w:bottom w:val="nil"/>
+              <w:bottom w:val="single" w:sz="8" w:color="111111"/>
               <w:right w:val="nil"/>
             </w:tcBorders>
           </w:tcPr>
@@ -4005,7 +3864,6 @@
             <w:r>
               <w:rPr>
                 <w:b/>
-                <w:color w:val="FFFFFF"/>
                 <w:sz w:val="20"/>
               </w:rPr>
               <w:t>Restricciones</w:t>
@@ -4015,11 +3873,10 @@
         <w:tc>
           <w:tcPr>
             <w:tcW w:type="dxa" w:w="2835"/>
-            <w:shd w:val="clear" w:color="auto" w:fill="1F4E79"/>
             <w:tcBorders>
-              <w:top w:val="nil"/>
+              <w:top w:val="single" w:sz="12" w:color="111111"/>
               <w:left w:val="nil"/>
-              <w:bottom w:val="nil"/>
+              <w:bottom w:val="single" w:sz="8" w:color="111111"/>
               <w:right w:val="nil"/>
             </w:tcBorders>
           </w:tcPr>
@@ -4032,7 +3889,6 @@
             <w:r>
               <w:rPr>
                 <w:b/>
-                <w:color w:val="FFFFFF"/>
                 <w:sz w:val="20"/>
               </w:rPr>
               <w:t>Descripción</w:t>
@@ -4050,7 +3906,7 @@
             <w:tcBorders>
               <w:top w:val="nil"/>
               <w:left w:val="nil"/>
-              <w:bottom w:val="single" w:sz="4" w:color="BDD7EE"/>
+              <w:bottom w:val="single" w:sz="4" w:color="D9D9D9"/>
               <w:right w:val="nil"/>
             </w:tcBorders>
             <w:vAlign w:val="center"/>
@@ -4064,7 +3920,6 @@
             <w:r>
               <w:rPr>
                 <w:b/>
-                <w:color w:val="1F4E79"/>
                 <w:sz w:val="20"/>
               </w:rPr>
               <w:t>idMedico</w:t>
@@ -4077,7 +3932,7 @@
             <w:tcBorders>
               <w:top w:val="nil"/>
               <w:left w:val="nil"/>
-              <w:bottom w:val="single" w:sz="4" w:color="BDD7EE"/>
+              <w:bottom w:val="single" w:sz="4" w:color="D9D9D9"/>
               <w:right w:val="nil"/>
             </w:tcBorders>
             <w:vAlign w:val="center"/>
@@ -4102,7 +3957,7 @@
             <w:tcBorders>
               <w:top w:val="nil"/>
               <w:left w:val="nil"/>
-              <w:bottom w:val="single" w:sz="4" w:color="BDD7EE"/>
+              <w:bottom w:val="single" w:sz="4" w:color="D9D9D9"/>
               <w:right w:val="nil"/>
             </w:tcBorders>
             <w:vAlign w:val="center"/>
@@ -4126,7 +3981,7 @@
             <w:tcBorders>
               <w:top w:val="nil"/>
               <w:left w:val="nil"/>
-              <w:bottom w:val="single" w:sz="4" w:color="BDD7EE"/>
+              <w:bottom w:val="single" w:sz="4" w:color="D9D9D9"/>
               <w:right w:val="nil"/>
             </w:tcBorders>
             <w:vAlign w:val="center"/>
@@ -4151,7 +4006,7 @@
             <w:tcBorders>
               <w:top w:val="nil"/>
               <w:left w:val="nil"/>
-              <w:bottom w:val="single" w:sz="4" w:color="BDD7EE"/>
+              <w:bottom w:val="single" w:sz="4" w:color="D9D9D9"/>
               <w:right w:val="nil"/>
             </w:tcBorders>
             <w:vAlign w:val="center"/>
@@ -4181,10 +4036,9 @@
             <w:tcBorders>
               <w:top w:val="nil"/>
               <w:left w:val="nil"/>
-              <w:bottom w:val="single" w:sz="4" w:color="BDD7EE"/>
+              <w:bottom w:val="single" w:sz="4" w:color="D9D9D9"/>
               <w:right w:val="nil"/>
             </w:tcBorders>
-            <w:shd w:val="clear" w:color="auto" w:fill="F2F7FC"/>
             <w:vAlign w:val="center"/>
           </w:tcPr>
           <w:p>
@@ -4196,7 +4050,6 @@
             <w:r>
               <w:rPr>
                 <w:b/>
-                <w:color w:val="1F4E79"/>
                 <w:sz w:val="20"/>
               </w:rPr>
               <w:t>nombreMedico</w:t>
@@ -4209,10 +4062,9 @@
             <w:tcBorders>
               <w:top w:val="nil"/>
               <w:left w:val="nil"/>
-              <w:bottom w:val="single" w:sz="4" w:color="BDD7EE"/>
+              <w:bottom w:val="single" w:sz="4" w:color="D9D9D9"/>
               <w:right w:val="nil"/>
             </w:tcBorders>
-            <w:shd w:val="clear" w:color="auto" w:fill="F2F7FC"/>
             <w:vAlign w:val="center"/>
           </w:tcPr>
           <w:p>
@@ -4235,10 +4087,9 @@
             <w:tcBorders>
               <w:top w:val="nil"/>
               <w:left w:val="nil"/>
-              <w:bottom w:val="single" w:sz="4" w:color="BDD7EE"/>
+              <w:bottom w:val="single" w:sz="4" w:color="D9D9D9"/>
               <w:right w:val="nil"/>
             </w:tcBorders>
-            <w:shd w:val="clear" w:color="auto" w:fill="F2F7FC"/>
             <w:vAlign w:val="center"/>
           </w:tcPr>
           <w:p>
@@ -4261,10 +4112,9 @@
             <w:tcBorders>
               <w:top w:val="nil"/>
               <w:left w:val="nil"/>
-              <w:bottom w:val="single" w:sz="4" w:color="BDD7EE"/>
+              <w:bottom w:val="single" w:sz="4" w:color="D9D9D9"/>
               <w:right w:val="nil"/>
             </w:tcBorders>
-            <w:shd w:val="clear" w:color="auto" w:fill="F2F7FC"/>
             <w:vAlign w:val="center"/>
           </w:tcPr>
           <w:p>
@@ -4287,10 +4137,9 @@
             <w:tcBorders>
               <w:top w:val="nil"/>
               <w:left w:val="nil"/>
-              <w:bottom w:val="single" w:sz="4" w:color="BDD7EE"/>
+              <w:bottom w:val="single" w:sz="4" w:color="D9D9D9"/>
               <w:right w:val="nil"/>
             </w:tcBorders>
-            <w:shd w:val="clear" w:color="auto" w:fill="F2F7FC"/>
             <w:vAlign w:val="center"/>
           </w:tcPr>
           <w:p>
@@ -4318,7 +4167,7 @@
             <w:tcBorders>
               <w:top w:val="nil"/>
               <w:left w:val="nil"/>
-              <w:bottom w:val="single" w:sz="4" w:color="BDD7EE"/>
+              <w:bottom w:val="single" w:sz="4" w:color="D9D9D9"/>
               <w:right w:val="nil"/>
             </w:tcBorders>
             <w:vAlign w:val="center"/>
@@ -4332,7 +4181,6 @@
             <w:r>
               <w:rPr>
                 <w:b/>
-                <w:color w:val="1F4E79"/>
                 <w:sz w:val="20"/>
               </w:rPr>
               <w:t>telefono</w:t>
@@ -4345,7 +4193,7 @@
             <w:tcBorders>
               <w:top w:val="nil"/>
               <w:left w:val="nil"/>
-              <w:bottom w:val="single" w:sz="4" w:color="BDD7EE"/>
+              <w:bottom w:val="single" w:sz="4" w:color="D9D9D9"/>
               <w:right w:val="nil"/>
             </w:tcBorders>
             <w:vAlign w:val="center"/>
@@ -4370,7 +4218,7 @@
             <w:tcBorders>
               <w:top w:val="nil"/>
               <w:left w:val="nil"/>
-              <w:bottom w:val="single" w:sz="4" w:color="BDD7EE"/>
+              <w:bottom w:val="single" w:sz="4" w:color="D9D9D9"/>
               <w:right w:val="nil"/>
             </w:tcBorders>
             <w:vAlign w:val="center"/>
@@ -4395,7 +4243,7 @@
             <w:tcBorders>
               <w:top w:val="nil"/>
               <w:left w:val="nil"/>
-              <w:bottom w:val="single" w:sz="4" w:color="BDD7EE"/>
+              <w:bottom w:val="single" w:sz="4" w:color="D9D9D9"/>
               <w:right w:val="nil"/>
             </w:tcBorders>
             <w:vAlign w:val="center"/>
@@ -4420,7 +4268,7 @@
             <w:tcBorders>
               <w:top w:val="nil"/>
               <w:left w:val="nil"/>
-              <w:bottom w:val="single" w:sz="4" w:color="BDD7EE"/>
+              <w:bottom w:val="single" w:sz="4" w:color="D9D9D9"/>
               <w:right w:val="nil"/>
             </w:tcBorders>
             <w:vAlign w:val="center"/>
@@ -4450,10 +4298,9 @@
             <w:tcBorders>
               <w:top w:val="nil"/>
               <w:left w:val="nil"/>
-              <w:bottom w:val="single" w:sz="4" w:color="BDD7EE"/>
+              <w:bottom w:val="single" w:sz="4" w:color="D9D9D9"/>
               <w:right w:val="nil"/>
             </w:tcBorders>
-            <w:shd w:val="clear" w:color="auto" w:fill="F2F7FC"/>
             <w:vAlign w:val="center"/>
           </w:tcPr>
           <w:p>
@@ -4465,7 +4312,6 @@
             <w:r>
               <w:rPr>
                 <w:b/>
-                <w:color w:val="1F4E79"/>
                 <w:sz w:val="20"/>
               </w:rPr>
               <w:t>correo</w:t>
@@ -4478,10 +4324,9 @@
             <w:tcBorders>
               <w:top w:val="nil"/>
               <w:left w:val="nil"/>
-              <w:bottom w:val="single" w:sz="4" w:color="BDD7EE"/>
+              <w:bottom w:val="single" w:sz="4" w:color="D9D9D9"/>
               <w:right w:val="nil"/>
             </w:tcBorders>
-            <w:shd w:val="clear" w:color="auto" w:fill="F2F7FC"/>
             <w:vAlign w:val="center"/>
           </w:tcPr>
           <w:p>
@@ -4504,10 +4349,9 @@
             <w:tcBorders>
               <w:top w:val="nil"/>
               <w:left w:val="nil"/>
-              <w:bottom w:val="single" w:sz="4" w:color="BDD7EE"/>
+              <w:bottom w:val="single" w:sz="4" w:color="D9D9D9"/>
               <w:right w:val="nil"/>
             </w:tcBorders>
-            <w:shd w:val="clear" w:color="auto" w:fill="F2F7FC"/>
             <w:vAlign w:val="center"/>
           </w:tcPr>
           <w:p>
@@ -4530,10 +4374,9 @@
             <w:tcBorders>
               <w:top w:val="nil"/>
               <w:left w:val="nil"/>
-              <w:bottom w:val="single" w:sz="4" w:color="BDD7EE"/>
+              <w:bottom w:val="single" w:sz="4" w:color="D9D9D9"/>
               <w:right w:val="nil"/>
             </w:tcBorders>
-            <w:shd w:val="clear" w:color="auto" w:fill="F2F7FC"/>
             <w:vAlign w:val="center"/>
           </w:tcPr>
           <w:p>
@@ -4556,10 +4399,9 @@
             <w:tcBorders>
               <w:top w:val="nil"/>
               <w:left w:val="nil"/>
-              <w:bottom w:val="single" w:sz="4" w:color="BDD7EE"/>
+              <w:bottom w:val="single" w:sz="4" w:color="D9D9D9"/>
               <w:right w:val="nil"/>
             </w:tcBorders>
-            <w:shd w:val="clear" w:color="auto" w:fill="F2F7FC"/>
             <w:vAlign w:val="center"/>
           </w:tcPr>
           <w:p>
@@ -4587,7 +4429,7 @@
             <w:tcBorders>
               <w:top w:val="nil"/>
               <w:left w:val="nil"/>
-              <w:bottom w:val="single" w:sz="4" w:color="BDD7EE"/>
+              <w:bottom w:val="single" w:sz="4" w:color="D9D9D9"/>
               <w:right w:val="nil"/>
             </w:tcBorders>
             <w:vAlign w:val="center"/>
@@ -4601,7 +4443,6 @@
             <w:r>
               <w:rPr>
                 <w:b/>
-                <w:color w:val="1F4E79"/>
                 <w:sz w:val="20"/>
               </w:rPr>
               <w:t>id_Especialidad</w:t>
@@ -4614,7 +4455,7 @@
             <w:tcBorders>
               <w:top w:val="nil"/>
               <w:left w:val="nil"/>
-              <w:bottom w:val="single" w:sz="4" w:color="BDD7EE"/>
+              <w:bottom w:val="single" w:sz="4" w:color="D9D9D9"/>
               <w:right w:val="nil"/>
             </w:tcBorders>
             <w:vAlign w:val="center"/>
@@ -4639,7 +4480,7 @@
             <w:tcBorders>
               <w:top w:val="nil"/>
               <w:left w:val="nil"/>
-              <w:bottom w:val="single" w:sz="4" w:color="BDD7EE"/>
+              <w:bottom w:val="single" w:sz="4" w:color="D9D9D9"/>
               <w:right w:val="nil"/>
             </w:tcBorders>
             <w:vAlign w:val="center"/>
@@ -4663,7 +4504,7 @@
             <w:tcBorders>
               <w:top w:val="nil"/>
               <w:left w:val="nil"/>
-              <w:bottom w:val="single" w:sz="4" w:color="BDD7EE"/>
+              <w:bottom w:val="single" w:sz="4" w:color="D9D9D9"/>
               <w:right w:val="nil"/>
             </w:tcBorders>
             <w:vAlign w:val="center"/>
@@ -4688,7 +4529,7 @@
             <w:tcBorders>
               <w:top w:val="nil"/>
               <w:left w:val="nil"/>
-              <w:bottom w:val="single" w:sz="4" w:color="BDD7EE"/>
+              <w:bottom w:val="single" w:sz="4" w:color="D9D9D9"/>
               <w:right w:val="nil"/>
             </w:tcBorders>
             <w:vAlign w:val="center"/>
@@ -4718,10 +4559,9 @@
             <w:tcBorders>
               <w:top w:val="nil"/>
               <w:left w:val="nil"/>
-              <w:bottom w:val="single" w:sz="4" w:color="BDD7EE"/>
+              <w:bottom w:val="single" w:sz="8" w:color="111111"/>
               <w:right w:val="nil"/>
             </w:tcBorders>
-            <w:shd w:val="clear" w:color="auto" w:fill="F2F7FC"/>
             <w:vAlign w:val="center"/>
           </w:tcPr>
           <w:p>
@@ -4732,7 +4572,6 @@
             <w:r>
               <w:rPr>
                 <w:b/>
-                <w:color w:val="1F4E79"/>
                 <w:sz w:val="20"/>
               </w:rPr>
               <w:t>id_Usuario</w:t>
@@ -4745,10 +4584,9 @@
             <w:tcBorders>
               <w:top w:val="nil"/>
               <w:left w:val="nil"/>
-              <w:bottom w:val="single" w:sz="4" w:color="BDD7EE"/>
+              <w:bottom w:val="single" w:sz="8" w:color="111111"/>
               <w:right w:val="nil"/>
             </w:tcBorders>
-            <w:shd w:val="clear" w:color="auto" w:fill="F2F7FC"/>
             <w:vAlign w:val="center"/>
           </w:tcPr>
           <w:p>
@@ -4770,10 +4608,9 @@
             <w:tcBorders>
               <w:top w:val="nil"/>
               <w:left w:val="nil"/>
-              <w:bottom w:val="single" w:sz="4" w:color="BDD7EE"/>
+              <w:bottom w:val="single" w:sz="8" w:color="111111"/>
               <w:right w:val="nil"/>
             </w:tcBorders>
-            <w:shd w:val="clear" w:color="auto" w:fill="F2F7FC"/>
             <w:vAlign w:val="center"/>
           </w:tcPr>
           <w:p>
@@ -4794,10 +4631,9 @@
             <w:tcBorders>
               <w:top w:val="nil"/>
               <w:left w:val="nil"/>
-              <w:bottom w:val="single" w:sz="4" w:color="BDD7EE"/>
+              <w:bottom w:val="single" w:sz="8" w:color="111111"/>
               <w:right w:val="nil"/>
             </w:tcBorders>
-            <w:shd w:val="clear" w:color="auto" w:fill="F2F7FC"/>
             <w:vAlign w:val="center"/>
           </w:tcPr>
           <w:p>
@@ -4819,10 +4655,9 @@
             <w:tcBorders>
               <w:top w:val="nil"/>
               <w:left w:val="nil"/>
-              <w:bottom w:val="single" w:sz="4" w:color="BDD7EE"/>
+              <w:bottom w:val="single" w:sz="8" w:color="111111"/>
               <w:right w:val="nil"/>
             </w:tcBorders>
-            <w:shd w:val="clear" w:color="auto" w:fill="F2F7FC"/>
             <w:vAlign w:val="center"/>
           </w:tcPr>
           <w:p>
@@ -4898,11 +4733,10 @@
         <w:tc>
           <w:tcPr>
             <w:tcW w:type="dxa" w:w="2211"/>
-            <w:shd w:val="clear" w:color="auto" w:fill="1F4E79"/>
             <w:tcBorders>
-              <w:top w:val="nil"/>
+              <w:top w:val="single" w:sz="12" w:color="111111"/>
               <w:left w:val="nil"/>
-              <w:bottom w:val="nil"/>
+              <w:bottom w:val="single" w:sz="8" w:color="111111"/>
               <w:right w:val="nil"/>
             </w:tcBorders>
           </w:tcPr>
@@ -4915,7 +4749,6 @@
             <w:r>
               <w:rPr>
                 <w:b/>
-                <w:color w:val="FFFFFF"/>
                 <w:sz w:val="20"/>
               </w:rPr>
               <w:t>Campo</w:t>
@@ -4925,11 +4758,10 @@
         <w:tc>
           <w:tcPr>
             <w:tcW w:type="dxa" w:w="1304"/>
-            <w:shd w:val="clear" w:color="auto" w:fill="1F4E79"/>
             <w:tcBorders>
-              <w:top w:val="nil"/>
+              <w:top w:val="single" w:sz="12" w:color="111111"/>
               <w:left w:val="nil"/>
-              <w:bottom w:val="nil"/>
+              <w:bottom w:val="single" w:sz="8" w:color="111111"/>
               <w:right w:val="nil"/>
             </w:tcBorders>
           </w:tcPr>
@@ -4942,7 +4774,6 @@
             <w:r>
               <w:rPr>
                 <w:b/>
-                <w:color w:val="FFFFFF"/>
                 <w:sz w:val="20"/>
               </w:rPr>
               <w:t>Tipo</w:t>
@@ -4952,11 +4783,10 @@
         <w:tc>
           <w:tcPr>
             <w:tcW w:type="dxa" w:w="850"/>
-            <w:shd w:val="clear" w:color="auto" w:fill="1F4E79"/>
             <w:tcBorders>
-              <w:top w:val="nil"/>
+              <w:top w:val="single" w:sz="12" w:color="111111"/>
               <w:left w:val="nil"/>
-              <w:bottom w:val="nil"/>
+              <w:bottom w:val="single" w:sz="8" w:color="111111"/>
               <w:right w:val="nil"/>
             </w:tcBorders>
           </w:tcPr>
@@ -4969,7 +4799,6 @@
             <w:r>
               <w:rPr>
                 <w:b/>
-                <w:color w:val="FFFFFF"/>
                 <w:sz w:val="20"/>
               </w:rPr>
               <w:t>Long.</w:t>
@@ -4979,11 +4808,10 @@
         <w:tc>
           <w:tcPr>
             <w:tcW w:type="dxa" w:w="2154"/>
-            <w:shd w:val="clear" w:color="auto" w:fill="1F4E79"/>
             <w:tcBorders>
-              <w:top w:val="nil"/>
+              <w:top w:val="single" w:sz="12" w:color="111111"/>
               <w:left w:val="nil"/>
-              <w:bottom w:val="nil"/>
+              <w:bottom w:val="single" w:sz="8" w:color="111111"/>
               <w:right w:val="nil"/>
             </w:tcBorders>
           </w:tcPr>
@@ -4996,7 +4824,6 @@
             <w:r>
               <w:rPr>
                 <w:b/>
-                <w:color w:val="FFFFFF"/>
                 <w:sz w:val="20"/>
               </w:rPr>
               <w:t>Restricciones</w:t>
@@ -5006,11 +4833,10 @@
         <w:tc>
           <w:tcPr>
             <w:tcW w:type="dxa" w:w="2835"/>
-            <w:shd w:val="clear" w:color="auto" w:fill="1F4E79"/>
             <w:tcBorders>
-              <w:top w:val="nil"/>
+              <w:top w:val="single" w:sz="12" w:color="111111"/>
               <w:left w:val="nil"/>
-              <w:bottom w:val="nil"/>
+              <w:bottom w:val="single" w:sz="8" w:color="111111"/>
               <w:right w:val="nil"/>
             </w:tcBorders>
           </w:tcPr>
@@ -5023,7 +4849,6 @@
             <w:r>
               <w:rPr>
                 <w:b/>
-                <w:color w:val="FFFFFF"/>
                 <w:sz w:val="20"/>
               </w:rPr>
               <w:t>Descripción</w:t>
@@ -5041,7 +4866,7 @@
             <w:tcBorders>
               <w:top w:val="nil"/>
               <w:left w:val="nil"/>
-              <w:bottom w:val="single" w:sz="4" w:color="BDD7EE"/>
+              <w:bottom w:val="single" w:sz="4" w:color="D9D9D9"/>
               <w:right w:val="nil"/>
             </w:tcBorders>
             <w:vAlign w:val="center"/>
@@ -5055,7 +4880,6 @@
             <w:r>
               <w:rPr>
                 <w:b/>
-                <w:color w:val="1F4E79"/>
                 <w:sz w:val="20"/>
               </w:rPr>
               <w:t>idPaciente</w:t>
@@ -5068,7 +4892,7 @@
             <w:tcBorders>
               <w:top w:val="nil"/>
               <w:left w:val="nil"/>
-              <w:bottom w:val="single" w:sz="4" w:color="BDD7EE"/>
+              <w:bottom w:val="single" w:sz="4" w:color="D9D9D9"/>
               <w:right w:val="nil"/>
             </w:tcBorders>
             <w:vAlign w:val="center"/>
@@ -5093,7 +4917,7 @@
             <w:tcBorders>
               <w:top w:val="nil"/>
               <w:left w:val="nil"/>
-              <w:bottom w:val="single" w:sz="4" w:color="BDD7EE"/>
+              <w:bottom w:val="single" w:sz="4" w:color="D9D9D9"/>
               <w:right w:val="nil"/>
             </w:tcBorders>
             <w:vAlign w:val="center"/>
@@ -5117,7 +4941,7 @@
             <w:tcBorders>
               <w:top w:val="nil"/>
               <w:left w:val="nil"/>
-              <w:bottom w:val="single" w:sz="4" w:color="BDD7EE"/>
+              <w:bottom w:val="single" w:sz="4" w:color="D9D9D9"/>
               <w:right w:val="nil"/>
             </w:tcBorders>
             <w:vAlign w:val="center"/>
@@ -5142,7 +4966,7 @@
             <w:tcBorders>
               <w:top w:val="nil"/>
               <w:left w:val="nil"/>
-              <w:bottom w:val="single" w:sz="4" w:color="BDD7EE"/>
+              <w:bottom w:val="single" w:sz="4" w:color="D9D9D9"/>
               <w:right w:val="nil"/>
             </w:tcBorders>
             <w:vAlign w:val="center"/>
@@ -5172,10 +4996,9 @@
             <w:tcBorders>
               <w:top w:val="nil"/>
               <w:left w:val="nil"/>
-              <w:bottom w:val="single" w:sz="4" w:color="BDD7EE"/>
+              <w:bottom w:val="single" w:sz="4" w:color="D9D9D9"/>
               <w:right w:val="nil"/>
             </w:tcBorders>
-            <w:shd w:val="clear" w:color="auto" w:fill="F2F7FC"/>
             <w:vAlign w:val="center"/>
           </w:tcPr>
           <w:p>
@@ -5187,7 +5010,6 @@
             <w:r>
               <w:rPr>
                 <w:b/>
-                <w:color w:val="1F4E79"/>
                 <w:sz w:val="20"/>
               </w:rPr>
               <w:t>nombrePaciente</w:t>
@@ -5200,10 +5022,9 @@
             <w:tcBorders>
               <w:top w:val="nil"/>
               <w:left w:val="nil"/>
-              <w:bottom w:val="single" w:sz="4" w:color="BDD7EE"/>
+              <w:bottom w:val="single" w:sz="4" w:color="D9D9D9"/>
               <w:right w:val="nil"/>
             </w:tcBorders>
-            <w:shd w:val="clear" w:color="auto" w:fill="F2F7FC"/>
             <w:vAlign w:val="center"/>
           </w:tcPr>
           <w:p>
@@ -5226,10 +5047,9 @@
             <w:tcBorders>
               <w:top w:val="nil"/>
               <w:left w:val="nil"/>
-              <w:bottom w:val="single" w:sz="4" w:color="BDD7EE"/>
+              <w:bottom w:val="single" w:sz="4" w:color="D9D9D9"/>
               <w:right w:val="nil"/>
             </w:tcBorders>
-            <w:shd w:val="clear" w:color="auto" w:fill="F2F7FC"/>
             <w:vAlign w:val="center"/>
           </w:tcPr>
           <w:p>
@@ -5252,10 +5072,9 @@
             <w:tcBorders>
               <w:top w:val="nil"/>
               <w:left w:val="nil"/>
-              <w:bottom w:val="single" w:sz="4" w:color="BDD7EE"/>
+              <w:bottom w:val="single" w:sz="4" w:color="D9D9D9"/>
               <w:right w:val="nil"/>
             </w:tcBorders>
-            <w:shd w:val="clear" w:color="auto" w:fill="F2F7FC"/>
             <w:vAlign w:val="center"/>
           </w:tcPr>
           <w:p>
@@ -5278,10 +5097,9 @@
             <w:tcBorders>
               <w:top w:val="nil"/>
               <w:left w:val="nil"/>
-              <w:bottom w:val="single" w:sz="4" w:color="BDD7EE"/>
+              <w:bottom w:val="single" w:sz="4" w:color="D9D9D9"/>
               <w:right w:val="nil"/>
             </w:tcBorders>
-            <w:shd w:val="clear" w:color="auto" w:fill="F2F7FC"/>
             <w:vAlign w:val="center"/>
           </w:tcPr>
           <w:p>
@@ -5309,7 +5127,7 @@
             <w:tcBorders>
               <w:top w:val="nil"/>
               <w:left w:val="nil"/>
-              <w:bottom w:val="single" w:sz="4" w:color="BDD7EE"/>
+              <w:bottom w:val="single" w:sz="4" w:color="D9D9D9"/>
               <w:right w:val="nil"/>
             </w:tcBorders>
             <w:vAlign w:val="center"/>
@@ -5323,7 +5141,6 @@
             <w:r>
               <w:rPr>
                 <w:b/>
-                <w:color w:val="1F4E79"/>
                 <w:sz w:val="20"/>
               </w:rPr>
               <w:t>dui</w:t>
@@ -5336,7 +5153,7 @@
             <w:tcBorders>
               <w:top w:val="nil"/>
               <w:left w:val="nil"/>
-              <w:bottom w:val="single" w:sz="4" w:color="BDD7EE"/>
+              <w:bottom w:val="single" w:sz="4" w:color="D9D9D9"/>
               <w:right w:val="nil"/>
             </w:tcBorders>
             <w:vAlign w:val="center"/>
@@ -5361,7 +5178,7 @@
             <w:tcBorders>
               <w:top w:val="nil"/>
               <w:left w:val="nil"/>
-              <w:bottom w:val="single" w:sz="4" w:color="BDD7EE"/>
+              <w:bottom w:val="single" w:sz="4" w:color="D9D9D9"/>
               <w:right w:val="nil"/>
             </w:tcBorders>
             <w:vAlign w:val="center"/>
@@ -5386,7 +5203,7 @@
             <w:tcBorders>
               <w:top w:val="nil"/>
               <w:left w:val="nil"/>
-              <w:bottom w:val="single" w:sz="4" w:color="BDD7EE"/>
+              <w:bottom w:val="single" w:sz="4" w:color="D9D9D9"/>
               <w:right w:val="nil"/>
             </w:tcBorders>
             <w:vAlign w:val="center"/>
@@ -5411,7 +5228,7 @@
             <w:tcBorders>
               <w:top w:val="nil"/>
               <w:left w:val="nil"/>
-              <w:bottom w:val="single" w:sz="4" w:color="BDD7EE"/>
+              <w:bottom w:val="single" w:sz="4" w:color="D9D9D9"/>
               <w:right w:val="nil"/>
             </w:tcBorders>
             <w:vAlign w:val="center"/>
@@ -5441,10 +5258,9 @@
             <w:tcBorders>
               <w:top w:val="nil"/>
               <w:left w:val="nil"/>
-              <w:bottom w:val="single" w:sz="4" w:color="BDD7EE"/>
+              <w:bottom w:val="single" w:sz="4" w:color="D9D9D9"/>
               <w:right w:val="nil"/>
             </w:tcBorders>
-            <w:shd w:val="clear" w:color="auto" w:fill="F2F7FC"/>
             <w:vAlign w:val="center"/>
           </w:tcPr>
           <w:p>
@@ -5456,7 +5272,6 @@
             <w:r>
               <w:rPr>
                 <w:b/>
-                <w:color w:val="1F4E79"/>
                 <w:sz w:val="20"/>
               </w:rPr>
               <w:t>fechaNacimiento</w:t>
@@ -5469,10 +5284,9 @@
             <w:tcBorders>
               <w:top w:val="nil"/>
               <w:left w:val="nil"/>
-              <w:bottom w:val="single" w:sz="4" w:color="BDD7EE"/>
+              <w:bottom w:val="single" w:sz="4" w:color="D9D9D9"/>
               <w:right w:val="nil"/>
             </w:tcBorders>
-            <w:shd w:val="clear" w:color="auto" w:fill="F2F7FC"/>
             <w:vAlign w:val="center"/>
           </w:tcPr>
           <w:p>
@@ -5495,10 +5309,9 @@
             <w:tcBorders>
               <w:top w:val="nil"/>
               <w:left w:val="nil"/>
-              <w:bottom w:val="single" w:sz="4" w:color="BDD7EE"/>
+              <w:bottom w:val="single" w:sz="4" w:color="D9D9D9"/>
               <w:right w:val="nil"/>
             </w:tcBorders>
-            <w:shd w:val="clear" w:color="auto" w:fill="F2F7FC"/>
             <w:vAlign w:val="center"/>
           </w:tcPr>
           <w:p>
@@ -5520,10 +5333,9 @@
             <w:tcBorders>
               <w:top w:val="nil"/>
               <w:left w:val="nil"/>
-              <w:bottom w:val="single" w:sz="4" w:color="BDD7EE"/>
+              <w:bottom w:val="single" w:sz="4" w:color="D9D9D9"/>
               <w:right w:val="nil"/>
             </w:tcBorders>
-            <w:shd w:val="clear" w:color="auto" w:fill="F2F7FC"/>
             <w:vAlign w:val="center"/>
           </w:tcPr>
           <w:p>
@@ -5546,10 +5358,9 @@
             <w:tcBorders>
               <w:top w:val="nil"/>
               <w:left w:val="nil"/>
-              <w:bottom w:val="single" w:sz="4" w:color="BDD7EE"/>
+              <w:bottom w:val="single" w:sz="4" w:color="D9D9D9"/>
               <w:right w:val="nil"/>
             </w:tcBorders>
-            <w:shd w:val="clear" w:color="auto" w:fill="F2F7FC"/>
             <w:vAlign w:val="center"/>
           </w:tcPr>
           <w:p>
@@ -5577,7 +5388,7 @@
             <w:tcBorders>
               <w:top w:val="nil"/>
               <w:left w:val="nil"/>
-              <w:bottom w:val="single" w:sz="4" w:color="BDD7EE"/>
+              <w:bottom w:val="single" w:sz="4" w:color="D9D9D9"/>
               <w:right w:val="nil"/>
             </w:tcBorders>
             <w:vAlign w:val="center"/>
@@ -5591,7 +5402,6 @@
             <w:r>
               <w:rPr>
                 <w:b/>
-                <w:color w:val="1F4E79"/>
                 <w:sz w:val="20"/>
               </w:rPr>
               <w:t>genero</w:t>
@@ -5604,7 +5414,7 @@
             <w:tcBorders>
               <w:top w:val="nil"/>
               <w:left w:val="nil"/>
-              <w:bottom w:val="single" w:sz="4" w:color="BDD7EE"/>
+              <w:bottom w:val="single" w:sz="4" w:color="D9D9D9"/>
               <w:right w:val="nil"/>
             </w:tcBorders>
             <w:vAlign w:val="center"/>
@@ -5629,7 +5439,7 @@
             <w:tcBorders>
               <w:top w:val="nil"/>
               <w:left w:val="nil"/>
-              <w:bottom w:val="single" w:sz="4" w:color="BDD7EE"/>
+              <w:bottom w:val="single" w:sz="4" w:color="D9D9D9"/>
               <w:right w:val="nil"/>
             </w:tcBorders>
             <w:vAlign w:val="center"/>
@@ -5654,7 +5464,7 @@
             <w:tcBorders>
               <w:top w:val="nil"/>
               <w:left w:val="nil"/>
-              <w:bottom w:val="single" w:sz="4" w:color="BDD7EE"/>
+              <w:bottom w:val="single" w:sz="4" w:color="D9D9D9"/>
               <w:right w:val="nil"/>
             </w:tcBorders>
             <w:vAlign w:val="center"/>
@@ -5679,7 +5489,7 @@
             <w:tcBorders>
               <w:top w:val="nil"/>
               <w:left w:val="nil"/>
-              <w:bottom w:val="single" w:sz="4" w:color="BDD7EE"/>
+              <w:bottom w:val="single" w:sz="4" w:color="D9D9D9"/>
               <w:right w:val="nil"/>
             </w:tcBorders>
             <w:vAlign w:val="center"/>
@@ -5709,10 +5519,9 @@
             <w:tcBorders>
               <w:top w:val="nil"/>
               <w:left w:val="nil"/>
-              <w:bottom w:val="single" w:sz="4" w:color="BDD7EE"/>
+              <w:bottom w:val="single" w:sz="4" w:color="D9D9D9"/>
               <w:right w:val="nil"/>
             </w:tcBorders>
-            <w:shd w:val="clear" w:color="auto" w:fill="F2F7FC"/>
             <w:vAlign w:val="center"/>
           </w:tcPr>
           <w:p>
@@ -5724,7 +5533,6 @@
             <w:r>
               <w:rPr>
                 <w:b/>
-                <w:color w:val="1F4E79"/>
                 <w:sz w:val="20"/>
               </w:rPr>
               <w:t>telefono</w:t>
@@ -5737,10 +5545,9 @@
             <w:tcBorders>
               <w:top w:val="nil"/>
               <w:left w:val="nil"/>
-              <w:bottom w:val="single" w:sz="4" w:color="BDD7EE"/>
+              <w:bottom w:val="single" w:sz="4" w:color="D9D9D9"/>
               <w:right w:val="nil"/>
             </w:tcBorders>
-            <w:shd w:val="clear" w:color="auto" w:fill="F2F7FC"/>
             <w:vAlign w:val="center"/>
           </w:tcPr>
           <w:p>
@@ -5763,10 +5570,9 @@
             <w:tcBorders>
               <w:top w:val="nil"/>
               <w:left w:val="nil"/>
-              <w:bottom w:val="single" w:sz="4" w:color="BDD7EE"/>
+              <w:bottom w:val="single" w:sz="4" w:color="D9D9D9"/>
               <w:right w:val="nil"/>
             </w:tcBorders>
-            <w:shd w:val="clear" w:color="auto" w:fill="F2F7FC"/>
             <w:vAlign w:val="center"/>
           </w:tcPr>
           <w:p>
@@ -5789,10 +5595,9 @@
             <w:tcBorders>
               <w:top w:val="nil"/>
               <w:left w:val="nil"/>
-              <w:bottom w:val="single" w:sz="4" w:color="BDD7EE"/>
+              <w:bottom w:val="single" w:sz="4" w:color="D9D9D9"/>
               <w:right w:val="nil"/>
             </w:tcBorders>
-            <w:shd w:val="clear" w:color="auto" w:fill="F2F7FC"/>
             <w:vAlign w:val="center"/>
           </w:tcPr>
           <w:p>
@@ -5815,10 +5620,9 @@
             <w:tcBorders>
               <w:top w:val="nil"/>
               <w:left w:val="nil"/>
-              <w:bottom w:val="single" w:sz="4" w:color="BDD7EE"/>
+              <w:bottom w:val="single" w:sz="4" w:color="D9D9D9"/>
               <w:right w:val="nil"/>
             </w:tcBorders>
-            <w:shd w:val="clear" w:color="auto" w:fill="F2F7FC"/>
             <w:vAlign w:val="center"/>
           </w:tcPr>
           <w:p>
@@ -5846,7 +5650,7 @@
             <w:tcBorders>
               <w:top w:val="nil"/>
               <w:left w:val="nil"/>
-              <w:bottom w:val="single" w:sz="4" w:color="BDD7EE"/>
+              <w:bottom w:val="single" w:sz="8" w:color="111111"/>
               <w:right w:val="nil"/>
             </w:tcBorders>
             <w:vAlign w:val="center"/>
@@ -5859,7 +5663,6 @@
             <w:r>
               <w:rPr>
                 <w:b/>
-                <w:color w:val="1F4E79"/>
                 <w:sz w:val="20"/>
               </w:rPr>
               <w:t>direccion</w:t>
@@ -5872,7 +5675,7 @@
             <w:tcBorders>
               <w:top w:val="nil"/>
               <w:left w:val="nil"/>
-              <w:bottom w:val="single" w:sz="4" w:color="BDD7EE"/>
+              <w:bottom w:val="single" w:sz="8" w:color="111111"/>
               <w:right w:val="nil"/>
             </w:tcBorders>
             <w:vAlign w:val="center"/>
@@ -5896,7 +5699,7 @@
             <w:tcBorders>
               <w:top w:val="nil"/>
               <w:left w:val="nil"/>
-              <w:bottom w:val="single" w:sz="4" w:color="BDD7EE"/>
+              <w:bottom w:val="single" w:sz="8" w:color="111111"/>
               <w:right w:val="nil"/>
             </w:tcBorders>
             <w:vAlign w:val="center"/>
@@ -5920,7 +5723,7 @@
             <w:tcBorders>
               <w:top w:val="nil"/>
               <w:left w:val="nil"/>
-              <w:bottom w:val="single" w:sz="4" w:color="BDD7EE"/>
+              <w:bottom w:val="single" w:sz="8" w:color="111111"/>
               <w:right w:val="nil"/>
             </w:tcBorders>
             <w:vAlign w:val="center"/>
@@ -5944,7 +5747,7 @@
             <w:tcBorders>
               <w:top w:val="nil"/>
               <w:left w:val="nil"/>
-              <w:bottom w:val="single" w:sz="4" w:color="BDD7EE"/>
+              <w:bottom w:val="single" w:sz="8" w:color="111111"/>
               <w:right w:val="nil"/>
             </w:tcBorders>
             <w:vAlign w:val="center"/>
@@ -6022,11 +5825,10 @@
         <w:tc>
           <w:tcPr>
             <w:tcW w:type="dxa" w:w="2211"/>
-            <w:shd w:val="clear" w:color="auto" w:fill="1F4E79"/>
             <w:tcBorders>
-              <w:top w:val="nil"/>
+              <w:top w:val="single" w:sz="12" w:color="111111"/>
               <w:left w:val="nil"/>
-              <w:bottom w:val="nil"/>
+              <w:bottom w:val="single" w:sz="8" w:color="111111"/>
               <w:right w:val="nil"/>
             </w:tcBorders>
           </w:tcPr>
@@ -6039,7 +5841,6 @@
             <w:r>
               <w:rPr>
                 <w:b/>
-                <w:color w:val="FFFFFF"/>
                 <w:sz w:val="20"/>
               </w:rPr>
               <w:t>Campo</w:t>
@@ -6049,11 +5850,10 @@
         <w:tc>
           <w:tcPr>
             <w:tcW w:type="dxa" w:w="1304"/>
-            <w:shd w:val="clear" w:color="auto" w:fill="1F4E79"/>
             <w:tcBorders>
-              <w:top w:val="nil"/>
+              <w:top w:val="single" w:sz="12" w:color="111111"/>
               <w:left w:val="nil"/>
-              <w:bottom w:val="nil"/>
+              <w:bottom w:val="single" w:sz="8" w:color="111111"/>
               <w:right w:val="nil"/>
             </w:tcBorders>
           </w:tcPr>
@@ -6066,7 +5866,6 @@
             <w:r>
               <w:rPr>
                 <w:b/>
-                <w:color w:val="FFFFFF"/>
                 <w:sz w:val="20"/>
               </w:rPr>
               <w:t>Tipo</w:t>
@@ -6076,11 +5875,10 @@
         <w:tc>
           <w:tcPr>
             <w:tcW w:type="dxa" w:w="850"/>
-            <w:shd w:val="clear" w:color="auto" w:fill="1F4E79"/>
             <w:tcBorders>
-              <w:top w:val="nil"/>
+              <w:top w:val="single" w:sz="12" w:color="111111"/>
               <w:left w:val="nil"/>
-              <w:bottom w:val="nil"/>
+              <w:bottom w:val="single" w:sz="8" w:color="111111"/>
               <w:right w:val="nil"/>
             </w:tcBorders>
           </w:tcPr>
@@ -6093,7 +5891,6 @@
             <w:r>
               <w:rPr>
                 <w:b/>
-                <w:color w:val="FFFFFF"/>
                 <w:sz w:val="20"/>
               </w:rPr>
               <w:t>Long.</w:t>
@@ -6103,11 +5900,10 @@
         <w:tc>
           <w:tcPr>
             <w:tcW w:type="dxa" w:w="2154"/>
-            <w:shd w:val="clear" w:color="auto" w:fill="1F4E79"/>
             <w:tcBorders>
-              <w:top w:val="nil"/>
+              <w:top w:val="single" w:sz="12" w:color="111111"/>
               <w:left w:val="nil"/>
-              <w:bottom w:val="nil"/>
+              <w:bottom w:val="single" w:sz="8" w:color="111111"/>
               <w:right w:val="nil"/>
             </w:tcBorders>
           </w:tcPr>
@@ -6120,7 +5916,6 @@
             <w:r>
               <w:rPr>
                 <w:b/>
-                <w:color w:val="FFFFFF"/>
                 <w:sz w:val="20"/>
               </w:rPr>
               <w:t>Restricciones</w:t>
@@ -6130,11 +5925,10 @@
         <w:tc>
           <w:tcPr>
             <w:tcW w:type="dxa" w:w="2835"/>
-            <w:shd w:val="clear" w:color="auto" w:fill="1F4E79"/>
             <w:tcBorders>
-              <w:top w:val="nil"/>
+              <w:top w:val="single" w:sz="12" w:color="111111"/>
               <w:left w:val="nil"/>
-              <w:bottom w:val="nil"/>
+              <w:bottom w:val="single" w:sz="8" w:color="111111"/>
               <w:right w:val="nil"/>
             </w:tcBorders>
           </w:tcPr>
@@ -6147,7 +5941,6 @@
             <w:r>
               <w:rPr>
                 <w:b/>
-                <w:color w:val="FFFFFF"/>
                 <w:sz w:val="20"/>
               </w:rPr>
               <w:t>Descripción</w:t>
@@ -6165,7 +5958,7 @@
             <w:tcBorders>
               <w:top w:val="nil"/>
               <w:left w:val="nil"/>
-              <w:bottom w:val="single" w:sz="4" w:color="BDD7EE"/>
+              <w:bottom w:val="single" w:sz="4" w:color="D9D9D9"/>
               <w:right w:val="nil"/>
             </w:tcBorders>
             <w:vAlign w:val="center"/>
@@ -6179,7 +5972,6 @@
             <w:r>
               <w:rPr>
                 <w:b/>
-                <w:color w:val="1F4E79"/>
                 <w:sz w:val="20"/>
               </w:rPr>
               <w:t>idCita</w:t>
@@ -6192,7 +5984,7 @@
             <w:tcBorders>
               <w:top w:val="nil"/>
               <w:left w:val="nil"/>
-              <w:bottom w:val="single" w:sz="4" w:color="BDD7EE"/>
+              <w:bottom w:val="single" w:sz="4" w:color="D9D9D9"/>
               <w:right w:val="nil"/>
             </w:tcBorders>
             <w:vAlign w:val="center"/>
@@ -6217,7 +6009,7 @@
             <w:tcBorders>
               <w:top w:val="nil"/>
               <w:left w:val="nil"/>
-              <w:bottom w:val="single" w:sz="4" w:color="BDD7EE"/>
+              <w:bottom w:val="single" w:sz="4" w:color="D9D9D9"/>
               <w:right w:val="nil"/>
             </w:tcBorders>
             <w:vAlign w:val="center"/>
@@ -6241,7 +6033,7 @@
             <w:tcBorders>
               <w:top w:val="nil"/>
               <w:left w:val="nil"/>
-              <w:bottom w:val="single" w:sz="4" w:color="BDD7EE"/>
+              <w:bottom w:val="single" w:sz="4" w:color="D9D9D9"/>
               <w:right w:val="nil"/>
             </w:tcBorders>
             <w:vAlign w:val="center"/>
@@ -6266,7 +6058,7 @@
             <w:tcBorders>
               <w:top w:val="nil"/>
               <w:left w:val="nil"/>
-              <w:bottom w:val="single" w:sz="4" w:color="BDD7EE"/>
+              <w:bottom w:val="single" w:sz="4" w:color="D9D9D9"/>
               <w:right w:val="nil"/>
             </w:tcBorders>
             <w:vAlign w:val="center"/>
@@ -6296,10 +6088,9 @@
             <w:tcBorders>
               <w:top w:val="nil"/>
               <w:left w:val="nil"/>
-              <w:bottom w:val="single" w:sz="4" w:color="BDD7EE"/>
+              <w:bottom w:val="single" w:sz="4" w:color="D9D9D9"/>
               <w:right w:val="nil"/>
             </w:tcBorders>
-            <w:shd w:val="clear" w:color="auto" w:fill="F2F7FC"/>
             <w:vAlign w:val="center"/>
           </w:tcPr>
           <w:p>
@@ -6311,7 +6102,6 @@
             <w:r>
               <w:rPr>
                 <w:b/>
-                <w:color w:val="1F4E79"/>
                 <w:sz w:val="20"/>
               </w:rPr>
               <w:t>id_Paciente</w:t>
@@ -6324,10 +6114,9 @@
             <w:tcBorders>
               <w:top w:val="nil"/>
               <w:left w:val="nil"/>
-              <w:bottom w:val="single" w:sz="4" w:color="BDD7EE"/>
+              <w:bottom w:val="single" w:sz="4" w:color="D9D9D9"/>
               <w:right w:val="nil"/>
             </w:tcBorders>
-            <w:shd w:val="clear" w:color="auto" w:fill="F2F7FC"/>
             <w:vAlign w:val="center"/>
           </w:tcPr>
           <w:p>
@@ -6350,10 +6139,9 @@
             <w:tcBorders>
               <w:top w:val="nil"/>
               <w:left w:val="nil"/>
-              <w:bottom w:val="single" w:sz="4" w:color="BDD7EE"/>
+              <w:bottom w:val="single" w:sz="4" w:color="D9D9D9"/>
               <w:right w:val="nil"/>
             </w:tcBorders>
-            <w:shd w:val="clear" w:color="auto" w:fill="F2F7FC"/>
             <w:vAlign w:val="center"/>
           </w:tcPr>
           <w:p>
@@ -6375,10 +6163,9 @@
             <w:tcBorders>
               <w:top w:val="nil"/>
               <w:left w:val="nil"/>
-              <w:bottom w:val="single" w:sz="4" w:color="BDD7EE"/>
+              <w:bottom w:val="single" w:sz="4" w:color="D9D9D9"/>
               <w:right w:val="nil"/>
             </w:tcBorders>
-            <w:shd w:val="clear" w:color="auto" w:fill="F2F7FC"/>
             <w:vAlign w:val="center"/>
           </w:tcPr>
           <w:p>
@@ -6401,10 +6188,9 @@
             <w:tcBorders>
               <w:top w:val="nil"/>
               <w:left w:val="nil"/>
-              <w:bottom w:val="single" w:sz="4" w:color="BDD7EE"/>
+              <w:bottom w:val="single" w:sz="4" w:color="D9D9D9"/>
               <w:right w:val="nil"/>
             </w:tcBorders>
-            <w:shd w:val="clear" w:color="auto" w:fill="F2F7FC"/>
             <w:vAlign w:val="center"/>
           </w:tcPr>
           <w:p>
@@ -6432,7 +6218,7 @@
             <w:tcBorders>
               <w:top w:val="nil"/>
               <w:left w:val="nil"/>
-              <w:bottom w:val="single" w:sz="4" w:color="BDD7EE"/>
+              <w:bottom w:val="single" w:sz="4" w:color="D9D9D9"/>
               <w:right w:val="nil"/>
             </w:tcBorders>
             <w:vAlign w:val="center"/>
@@ -6446,7 +6232,6 @@
             <w:r>
               <w:rPr>
                 <w:b/>
-                <w:color w:val="1F4E79"/>
                 <w:sz w:val="20"/>
               </w:rPr>
               <w:t>id_Medico</w:t>
@@ -6459,7 +6244,7 @@
             <w:tcBorders>
               <w:top w:val="nil"/>
               <w:left w:val="nil"/>
-              <w:bottom w:val="single" w:sz="4" w:color="BDD7EE"/>
+              <w:bottom w:val="single" w:sz="4" w:color="D9D9D9"/>
               <w:right w:val="nil"/>
             </w:tcBorders>
             <w:vAlign w:val="center"/>
@@ -6484,7 +6269,7 @@
             <w:tcBorders>
               <w:top w:val="nil"/>
               <w:left w:val="nil"/>
-              <w:bottom w:val="single" w:sz="4" w:color="BDD7EE"/>
+              <w:bottom w:val="single" w:sz="4" w:color="D9D9D9"/>
               <w:right w:val="nil"/>
             </w:tcBorders>
             <w:vAlign w:val="center"/>
@@ -6508,7 +6293,7 @@
             <w:tcBorders>
               <w:top w:val="nil"/>
               <w:left w:val="nil"/>
-              <w:bottom w:val="single" w:sz="4" w:color="BDD7EE"/>
+              <w:bottom w:val="single" w:sz="4" w:color="D9D9D9"/>
               <w:right w:val="nil"/>
             </w:tcBorders>
             <w:vAlign w:val="center"/>
@@ -6533,7 +6318,7 @@
             <w:tcBorders>
               <w:top w:val="nil"/>
               <w:left w:val="nil"/>
-              <w:bottom w:val="single" w:sz="4" w:color="BDD7EE"/>
+              <w:bottom w:val="single" w:sz="4" w:color="D9D9D9"/>
               <w:right w:val="nil"/>
             </w:tcBorders>
             <w:vAlign w:val="center"/>
@@ -6563,10 +6348,9 @@
             <w:tcBorders>
               <w:top w:val="nil"/>
               <w:left w:val="nil"/>
-              <w:bottom w:val="single" w:sz="4" w:color="BDD7EE"/>
+              <w:bottom w:val="single" w:sz="4" w:color="D9D9D9"/>
               <w:right w:val="nil"/>
             </w:tcBorders>
-            <w:shd w:val="clear" w:color="auto" w:fill="F2F7FC"/>
             <w:vAlign w:val="center"/>
           </w:tcPr>
           <w:p>
@@ -6578,7 +6362,6 @@
             <w:r>
               <w:rPr>
                 <w:b/>
-                <w:color w:val="1F4E79"/>
                 <w:sz w:val="20"/>
               </w:rPr>
               <w:t>fecha</w:t>
@@ -6591,10 +6374,9 @@
             <w:tcBorders>
               <w:top w:val="nil"/>
               <w:left w:val="nil"/>
-              <w:bottom w:val="single" w:sz="4" w:color="BDD7EE"/>
+              <w:bottom w:val="single" w:sz="4" w:color="D9D9D9"/>
               <w:right w:val="nil"/>
             </w:tcBorders>
-            <w:shd w:val="clear" w:color="auto" w:fill="F2F7FC"/>
             <w:vAlign w:val="center"/>
           </w:tcPr>
           <w:p>
@@ -6617,10 +6399,9 @@
             <w:tcBorders>
               <w:top w:val="nil"/>
               <w:left w:val="nil"/>
-              <w:bottom w:val="single" w:sz="4" w:color="BDD7EE"/>
+              <w:bottom w:val="single" w:sz="4" w:color="D9D9D9"/>
               <w:right w:val="nil"/>
             </w:tcBorders>
-            <w:shd w:val="clear" w:color="auto" w:fill="F2F7FC"/>
             <w:vAlign w:val="center"/>
           </w:tcPr>
           <w:p>
@@ -6642,10 +6423,9 @@
             <w:tcBorders>
               <w:top w:val="nil"/>
               <w:left w:val="nil"/>
-              <w:bottom w:val="single" w:sz="4" w:color="BDD7EE"/>
+              <w:bottom w:val="single" w:sz="4" w:color="D9D9D9"/>
               <w:right w:val="nil"/>
             </w:tcBorders>
-            <w:shd w:val="clear" w:color="auto" w:fill="F2F7FC"/>
             <w:vAlign w:val="center"/>
           </w:tcPr>
           <w:p>
@@ -6668,10 +6448,9 @@
             <w:tcBorders>
               <w:top w:val="nil"/>
               <w:left w:val="nil"/>
-              <w:bottom w:val="single" w:sz="4" w:color="BDD7EE"/>
+              <w:bottom w:val="single" w:sz="4" w:color="D9D9D9"/>
               <w:right w:val="nil"/>
             </w:tcBorders>
-            <w:shd w:val="clear" w:color="auto" w:fill="F2F7FC"/>
             <w:vAlign w:val="center"/>
           </w:tcPr>
           <w:p>
@@ -6699,7 +6478,7 @@
             <w:tcBorders>
               <w:top w:val="nil"/>
               <w:left w:val="nil"/>
-              <w:bottom w:val="single" w:sz="4" w:color="BDD7EE"/>
+              <w:bottom w:val="single" w:sz="4" w:color="D9D9D9"/>
               <w:right w:val="nil"/>
             </w:tcBorders>
             <w:vAlign w:val="center"/>
@@ -6713,7 +6492,6 @@
             <w:r>
               <w:rPr>
                 <w:b/>
-                <w:color w:val="1F4E79"/>
                 <w:sz w:val="20"/>
               </w:rPr>
               <w:t>hora</w:t>
@@ -6726,7 +6504,7 @@
             <w:tcBorders>
               <w:top w:val="nil"/>
               <w:left w:val="nil"/>
-              <w:bottom w:val="single" w:sz="4" w:color="BDD7EE"/>
+              <w:bottom w:val="single" w:sz="4" w:color="D9D9D9"/>
               <w:right w:val="nil"/>
             </w:tcBorders>
             <w:vAlign w:val="center"/>
@@ -6751,7 +6529,7 @@
             <w:tcBorders>
               <w:top w:val="nil"/>
               <w:left w:val="nil"/>
-              <w:bottom w:val="single" w:sz="4" w:color="BDD7EE"/>
+              <w:bottom w:val="single" w:sz="4" w:color="D9D9D9"/>
               <w:right w:val="nil"/>
             </w:tcBorders>
             <w:vAlign w:val="center"/>
@@ -6776,7 +6554,7 @@
             <w:tcBorders>
               <w:top w:val="nil"/>
               <w:left w:val="nil"/>
-              <w:bottom w:val="single" w:sz="4" w:color="BDD7EE"/>
+              <w:bottom w:val="single" w:sz="4" w:color="D9D9D9"/>
               <w:right w:val="nil"/>
             </w:tcBorders>
             <w:vAlign w:val="center"/>
@@ -6801,7 +6579,7 @@
             <w:tcBorders>
               <w:top w:val="nil"/>
               <w:left w:val="nil"/>
-              <w:bottom w:val="single" w:sz="4" w:color="BDD7EE"/>
+              <w:bottom w:val="single" w:sz="4" w:color="D9D9D9"/>
               <w:right w:val="nil"/>
             </w:tcBorders>
             <w:vAlign w:val="center"/>
@@ -6831,10 +6609,9 @@
             <w:tcBorders>
               <w:top w:val="nil"/>
               <w:left w:val="nil"/>
-              <w:bottom w:val="single" w:sz="4" w:color="BDD7EE"/>
+              <w:bottom w:val="single" w:sz="4" w:color="D9D9D9"/>
               <w:right w:val="nil"/>
             </w:tcBorders>
-            <w:shd w:val="clear" w:color="auto" w:fill="F2F7FC"/>
             <w:vAlign w:val="center"/>
           </w:tcPr>
           <w:p>
@@ -6846,7 +6623,6 @@
             <w:r>
               <w:rPr>
                 <w:b/>
-                <w:color w:val="1F4E79"/>
                 <w:sz w:val="20"/>
               </w:rPr>
               <w:t>motivo</w:t>
@@ -6859,10 +6635,9 @@
             <w:tcBorders>
               <w:top w:val="nil"/>
               <w:left w:val="nil"/>
-              <w:bottom w:val="single" w:sz="4" w:color="BDD7EE"/>
+              <w:bottom w:val="single" w:sz="4" w:color="D9D9D9"/>
               <w:right w:val="nil"/>
             </w:tcBorders>
-            <w:shd w:val="clear" w:color="auto" w:fill="F2F7FC"/>
             <w:vAlign w:val="center"/>
           </w:tcPr>
           <w:p>
@@ -6885,10 +6660,9 @@
             <w:tcBorders>
               <w:top w:val="nil"/>
               <w:left w:val="nil"/>
-              <w:bottom w:val="single" w:sz="4" w:color="BDD7EE"/>
+              <w:bottom w:val="single" w:sz="4" w:color="D9D9D9"/>
               <w:right w:val="nil"/>
             </w:tcBorders>
-            <w:shd w:val="clear" w:color="auto" w:fill="F2F7FC"/>
             <w:vAlign w:val="center"/>
           </w:tcPr>
           <w:p>
@@ -6911,10 +6685,9 @@
             <w:tcBorders>
               <w:top w:val="nil"/>
               <w:left w:val="nil"/>
-              <w:bottom w:val="single" w:sz="4" w:color="BDD7EE"/>
+              <w:bottom w:val="single" w:sz="4" w:color="D9D9D9"/>
               <w:right w:val="nil"/>
             </w:tcBorders>
-            <w:shd w:val="clear" w:color="auto" w:fill="F2F7FC"/>
             <w:vAlign w:val="center"/>
           </w:tcPr>
           <w:p>
@@ -6937,10 +6710,9 @@
             <w:tcBorders>
               <w:top w:val="nil"/>
               <w:left w:val="nil"/>
-              <w:bottom w:val="single" w:sz="4" w:color="BDD7EE"/>
+              <w:bottom w:val="single" w:sz="4" w:color="D9D9D9"/>
               <w:right w:val="nil"/>
             </w:tcBorders>
-            <w:shd w:val="clear" w:color="auto" w:fill="F2F7FC"/>
             <w:vAlign w:val="center"/>
           </w:tcPr>
           <w:p>
@@ -6968,7 +6740,7 @@
             <w:tcBorders>
               <w:top w:val="nil"/>
               <w:left w:val="nil"/>
-              <w:bottom w:val="single" w:sz="4" w:color="BDD7EE"/>
+              <w:bottom w:val="single" w:sz="8" w:color="111111"/>
               <w:right w:val="nil"/>
             </w:tcBorders>
             <w:vAlign w:val="center"/>
@@ -6981,7 +6753,6 @@
             <w:r>
               <w:rPr>
                 <w:b/>
-                <w:color w:val="1F4E79"/>
                 <w:sz w:val="20"/>
               </w:rPr>
               <w:t>estado</w:t>
@@ -6994,7 +6765,7 @@
             <w:tcBorders>
               <w:top w:val="nil"/>
               <w:left w:val="nil"/>
-              <w:bottom w:val="single" w:sz="4" w:color="BDD7EE"/>
+              <w:bottom w:val="single" w:sz="8" w:color="111111"/>
               <w:right w:val="nil"/>
             </w:tcBorders>
             <w:vAlign w:val="center"/>
@@ -7018,7 +6789,7 @@
             <w:tcBorders>
               <w:top w:val="nil"/>
               <w:left w:val="nil"/>
-              <w:bottom w:val="single" w:sz="4" w:color="BDD7EE"/>
+              <w:bottom w:val="single" w:sz="8" w:color="111111"/>
               <w:right w:val="nil"/>
             </w:tcBorders>
             <w:vAlign w:val="center"/>
@@ -7042,7 +6813,7 @@
             <w:tcBorders>
               <w:top w:val="nil"/>
               <w:left w:val="nil"/>
-              <w:bottom w:val="single" w:sz="4" w:color="BDD7EE"/>
+              <w:bottom w:val="single" w:sz="8" w:color="111111"/>
               <w:right w:val="nil"/>
             </w:tcBorders>
             <w:vAlign w:val="center"/>
@@ -7066,7 +6837,7 @@
             <w:tcBorders>
               <w:top w:val="nil"/>
               <w:left w:val="nil"/>
-              <w:bottom w:val="single" w:sz="4" w:color="BDD7EE"/>
+              <w:bottom w:val="single" w:sz="8" w:color="111111"/>
               <w:right w:val="nil"/>
             </w:tcBorders>
             <w:vAlign w:val="center"/>
@@ -7144,11 +6915,10 @@
         <w:tc>
           <w:tcPr>
             <w:tcW w:type="dxa" w:w="2211"/>
-            <w:shd w:val="clear" w:color="auto" w:fill="1F4E79"/>
             <w:tcBorders>
-              <w:top w:val="nil"/>
+              <w:top w:val="single" w:sz="12" w:color="111111"/>
               <w:left w:val="nil"/>
-              <w:bottom w:val="nil"/>
+              <w:bottom w:val="single" w:sz="8" w:color="111111"/>
               <w:right w:val="nil"/>
             </w:tcBorders>
           </w:tcPr>
@@ -7161,7 +6931,6 @@
             <w:r>
               <w:rPr>
                 <w:b/>
-                <w:color w:val="FFFFFF"/>
                 <w:sz w:val="20"/>
               </w:rPr>
               <w:t>Campo</w:t>
@@ -7171,11 +6940,10 @@
         <w:tc>
           <w:tcPr>
             <w:tcW w:type="dxa" w:w="1304"/>
-            <w:shd w:val="clear" w:color="auto" w:fill="1F4E79"/>
             <w:tcBorders>
-              <w:top w:val="nil"/>
+              <w:top w:val="single" w:sz="12" w:color="111111"/>
               <w:left w:val="nil"/>
-              <w:bottom w:val="nil"/>
+              <w:bottom w:val="single" w:sz="8" w:color="111111"/>
               <w:right w:val="nil"/>
             </w:tcBorders>
           </w:tcPr>
@@ -7188,7 +6956,6 @@
             <w:r>
               <w:rPr>
                 <w:b/>
-                <w:color w:val="FFFFFF"/>
                 <w:sz w:val="20"/>
               </w:rPr>
               <w:t>Tipo</w:t>
@@ -7198,11 +6965,10 @@
         <w:tc>
           <w:tcPr>
             <w:tcW w:type="dxa" w:w="850"/>
-            <w:shd w:val="clear" w:color="auto" w:fill="1F4E79"/>
             <w:tcBorders>
-              <w:top w:val="nil"/>
+              <w:top w:val="single" w:sz="12" w:color="111111"/>
               <w:left w:val="nil"/>
-              <w:bottom w:val="nil"/>
+              <w:bottom w:val="single" w:sz="8" w:color="111111"/>
               <w:right w:val="nil"/>
             </w:tcBorders>
           </w:tcPr>
@@ -7215,7 +6981,6 @@
             <w:r>
               <w:rPr>
                 <w:b/>
-                <w:color w:val="FFFFFF"/>
                 <w:sz w:val="20"/>
               </w:rPr>
               <w:t>Long.</w:t>
@@ -7225,11 +6990,10 @@
         <w:tc>
           <w:tcPr>
             <w:tcW w:type="dxa" w:w="2154"/>
-            <w:shd w:val="clear" w:color="auto" w:fill="1F4E79"/>
             <w:tcBorders>
-              <w:top w:val="nil"/>
+              <w:top w:val="single" w:sz="12" w:color="111111"/>
               <w:left w:val="nil"/>
-              <w:bottom w:val="nil"/>
+              <w:bottom w:val="single" w:sz="8" w:color="111111"/>
               <w:right w:val="nil"/>
             </w:tcBorders>
           </w:tcPr>
@@ -7242,7 +7006,6 @@
             <w:r>
               <w:rPr>
                 <w:b/>
-                <w:color w:val="FFFFFF"/>
                 <w:sz w:val="20"/>
               </w:rPr>
               <w:t>Restricciones</w:t>
@@ -7252,11 +7015,10 @@
         <w:tc>
           <w:tcPr>
             <w:tcW w:type="dxa" w:w="2835"/>
-            <w:shd w:val="clear" w:color="auto" w:fill="1F4E79"/>
             <w:tcBorders>
-              <w:top w:val="nil"/>
+              <w:top w:val="single" w:sz="12" w:color="111111"/>
               <w:left w:val="nil"/>
-              <w:bottom w:val="nil"/>
+              <w:bottom w:val="single" w:sz="8" w:color="111111"/>
               <w:right w:val="nil"/>
             </w:tcBorders>
           </w:tcPr>
@@ -7269,7 +7031,6 @@
             <w:r>
               <w:rPr>
                 <w:b/>
-                <w:color w:val="FFFFFF"/>
                 <w:sz w:val="20"/>
               </w:rPr>
               <w:t>Descripción</w:t>
@@ -7287,7 +7048,7 @@
             <w:tcBorders>
               <w:top w:val="nil"/>
               <w:left w:val="nil"/>
-              <w:bottom w:val="single" w:sz="4" w:color="BDD7EE"/>
+              <w:bottom w:val="single" w:sz="4" w:color="D9D9D9"/>
               <w:right w:val="nil"/>
             </w:tcBorders>
             <w:vAlign w:val="center"/>
@@ -7301,7 +7062,6 @@
             <w:r>
               <w:rPr>
                 <w:b/>
-                <w:color w:val="1F4E79"/>
                 <w:sz w:val="20"/>
               </w:rPr>
               <w:t>idHistorial</w:t>
@@ -7314,7 +7074,7 @@
             <w:tcBorders>
               <w:top w:val="nil"/>
               <w:left w:val="nil"/>
-              <w:bottom w:val="single" w:sz="4" w:color="BDD7EE"/>
+              <w:bottom w:val="single" w:sz="4" w:color="D9D9D9"/>
               <w:right w:val="nil"/>
             </w:tcBorders>
             <w:vAlign w:val="center"/>
@@ -7339,7 +7099,7 @@
             <w:tcBorders>
               <w:top w:val="nil"/>
               <w:left w:val="nil"/>
-              <w:bottom w:val="single" w:sz="4" w:color="BDD7EE"/>
+              <w:bottom w:val="single" w:sz="4" w:color="D9D9D9"/>
               <w:right w:val="nil"/>
             </w:tcBorders>
             <w:vAlign w:val="center"/>
@@ -7363,7 +7123,7 @@
             <w:tcBorders>
               <w:top w:val="nil"/>
               <w:left w:val="nil"/>
-              <w:bottom w:val="single" w:sz="4" w:color="BDD7EE"/>
+              <w:bottom w:val="single" w:sz="4" w:color="D9D9D9"/>
               <w:right w:val="nil"/>
             </w:tcBorders>
             <w:vAlign w:val="center"/>
@@ -7388,7 +7148,7 @@
             <w:tcBorders>
               <w:top w:val="nil"/>
               <w:left w:val="nil"/>
-              <w:bottom w:val="single" w:sz="4" w:color="BDD7EE"/>
+              <w:bottom w:val="single" w:sz="4" w:color="D9D9D9"/>
               <w:right w:val="nil"/>
             </w:tcBorders>
             <w:vAlign w:val="center"/>
@@ -7418,10 +7178,9 @@
             <w:tcBorders>
               <w:top w:val="nil"/>
               <w:left w:val="nil"/>
-              <w:bottom w:val="single" w:sz="4" w:color="BDD7EE"/>
+              <w:bottom w:val="single" w:sz="4" w:color="D9D9D9"/>
               <w:right w:val="nil"/>
             </w:tcBorders>
-            <w:shd w:val="clear" w:color="auto" w:fill="F2F7FC"/>
             <w:vAlign w:val="center"/>
           </w:tcPr>
           <w:p>
@@ -7433,7 +7192,6 @@
             <w:r>
               <w:rPr>
                 <w:b/>
-                <w:color w:val="1F4E79"/>
                 <w:sz w:val="20"/>
               </w:rPr>
               <w:t>id_Paciente</w:t>
@@ -7446,10 +7204,9 @@
             <w:tcBorders>
               <w:top w:val="nil"/>
               <w:left w:val="nil"/>
-              <w:bottom w:val="single" w:sz="4" w:color="BDD7EE"/>
+              <w:bottom w:val="single" w:sz="4" w:color="D9D9D9"/>
               <w:right w:val="nil"/>
             </w:tcBorders>
-            <w:shd w:val="clear" w:color="auto" w:fill="F2F7FC"/>
             <w:vAlign w:val="center"/>
           </w:tcPr>
           <w:p>
@@ -7472,10 +7229,9 @@
             <w:tcBorders>
               <w:top w:val="nil"/>
               <w:left w:val="nil"/>
-              <w:bottom w:val="single" w:sz="4" w:color="BDD7EE"/>
+              <w:bottom w:val="single" w:sz="4" w:color="D9D9D9"/>
               <w:right w:val="nil"/>
             </w:tcBorders>
-            <w:shd w:val="clear" w:color="auto" w:fill="F2F7FC"/>
             <w:vAlign w:val="center"/>
           </w:tcPr>
           <w:p>
@@ -7497,10 +7253,9 @@
             <w:tcBorders>
               <w:top w:val="nil"/>
               <w:left w:val="nil"/>
-              <w:bottom w:val="single" w:sz="4" w:color="BDD7EE"/>
+              <w:bottom w:val="single" w:sz="4" w:color="D9D9D9"/>
               <w:right w:val="nil"/>
             </w:tcBorders>
-            <w:shd w:val="clear" w:color="auto" w:fill="F2F7FC"/>
             <w:vAlign w:val="center"/>
           </w:tcPr>
           <w:p>
@@ -7523,10 +7278,9 @@
             <w:tcBorders>
               <w:top w:val="nil"/>
               <w:left w:val="nil"/>
-              <w:bottom w:val="single" w:sz="4" w:color="BDD7EE"/>
+              <w:bottom w:val="single" w:sz="4" w:color="D9D9D9"/>
               <w:right w:val="nil"/>
             </w:tcBorders>
-            <w:shd w:val="clear" w:color="auto" w:fill="F2F7FC"/>
             <w:vAlign w:val="center"/>
           </w:tcPr>
           <w:p>
@@ -7554,7 +7308,7 @@
             <w:tcBorders>
               <w:top w:val="nil"/>
               <w:left w:val="nil"/>
-              <w:bottom w:val="single" w:sz="4" w:color="BDD7EE"/>
+              <w:bottom w:val="single" w:sz="4" w:color="D9D9D9"/>
               <w:right w:val="nil"/>
             </w:tcBorders>
             <w:vAlign w:val="center"/>
@@ -7568,7 +7322,6 @@
             <w:r>
               <w:rPr>
                 <w:b/>
-                <w:color w:val="1F4E79"/>
                 <w:sz w:val="20"/>
               </w:rPr>
               <w:t>id_Medico</w:t>
@@ -7581,7 +7334,7 @@
             <w:tcBorders>
               <w:top w:val="nil"/>
               <w:left w:val="nil"/>
-              <w:bottom w:val="single" w:sz="4" w:color="BDD7EE"/>
+              <w:bottom w:val="single" w:sz="4" w:color="D9D9D9"/>
               <w:right w:val="nil"/>
             </w:tcBorders>
             <w:vAlign w:val="center"/>
@@ -7606,7 +7359,7 @@
             <w:tcBorders>
               <w:top w:val="nil"/>
               <w:left w:val="nil"/>
-              <w:bottom w:val="single" w:sz="4" w:color="BDD7EE"/>
+              <w:bottom w:val="single" w:sz="4" w:color="D9D9D9"/>
               <w:right w:val="nil"/>
             </w:tcBorders>
             <w:vAlign w:val="center"/>
@@ -7630,7 +7383,7 @@
             <w:tcBorders>
               <w:top w:val="nil"/>
               <w:left w:val="nil"/>
-              <w:bottom w:val="single" w:sz="4" w:color="BDD7EE"/>
+              <w:bottom w:val="single" w:sz="4" w:color="D9D9D9"/>
               <w:right w:val="nil"/>
             </w:tcBorders>
             <w:vAlign w:val="center"/>
@@ -7655,7 +7408,7 @@
             <w:tcBorders>
               <w:top w:val="nil"/>
               <w:left w:val="nil"/>
-              <w:bottom w:val="single" w:sz="4" w:color="BDD7EE"/>
+              <w:bottom w:val="single" w:sz="4" w:color="D9D9D9"/>
               <w:right w:val="nil"/>
             </w:tcBorders>
             <w:vAlign w:val="center"/>
@@ -7685,10 +7438,9 @@
             <w:tcBorders>
               <w:top w:val="nil"/>
               <w:left w:val="nil"/>
-              <w:bottom w:val="single" w:sz="4" w:color="BDD7EE"/>
+              <w:bottom w:val="single" w:sz="4" w:color="D9D9D9"/>
               <w:right w:val="nil"/>
             </w:tcBorders>
-            <w:shd w:val="clear" w:color="auto" w:fill="F2F7FC"/>
             <w:vAlign w:val="center"/>
           </w:tcPr>
           <w:p>
@@ -7700,7 +7452,6 @@
             <w:r>
               <w:rPr>
                 <w:b/>
-                <w:color w:val="1F4E79"/>
                 <w:sz w:val="20"/>
               </w:rPr>
               <w:t>fecha</w:t>
@@ -7713,10 +7464,9 @@
             <w:tcBorders>
               <w:top w:val="nil"/>
               <w:left w:val="nil"/>
-              <w:bottom w:val="single" w:sz="4" w:color="BDD7EE"/>
+              <w:bottom w:val="single" w:sz="4" w:color="D9D9D9"/>
               <w:right w:val="nil"/>
             </w:tcBorders>
-            <w:shd w:val="clear" w:color="auto" w:fill="F2F7FC"/>
             <w:vAlign w:val="center"/>
           </w:tcPr>
           <w:p>
@@ -7739,10 +7489,9 @@
             <w:tcBorders>
               <w:top w:val="nil"/>
               <w:left w:val="nil"/>
-              <w:bottom w:val="single" w:sz="4" w:color="BDD7EE"/>
+              <w:bottom w:val="single" w:sz="4" w:color="D9D9D9"/>
               <w:right w:val="nil"/>
             </w:tcBorders>
-            <w:shd w:val="clear" w:color="auto" w:fill="F2F7FC"/>
             <w:vAlign w:val="center"/>
           </w:tcPr>
           <w:p>
@@ -7764,10 +7513,9 @@
             <w:tcBorders>
               <w:top w:val="nil"/>
               <w:left w:val="nil"/>
-              <w:bottom w:val="single" w:sz="4" w:color="BDD7EE"/>
+              <w:bottom w:val="single" w:sz="4" w:color="D9D9D9"/>
               <w:right w:val="nil"/>
             </w:tcBorders>
-            <w:shd w:val="clear" w:color="auto" w:fill="F2F7FC"/>
             <w:vAlign w:val="center"/>
           </w:tcPr>
           <w:p>
@@ -7790,10 +7538,9 @@
             <w:tcBorders>
               <w:top w:val="nil"/>
               <w:left w:val="nil"/>
-              <w:bottom w:val="single" w:sz="4" w:color="BDD7EE"/>
+              <w:bottom w:val="single" w:sz="4" w:color="D9D9D9"/>
               <w:right w:val="nil"/>
             </w:tcBorders>
-            <w:shd w:val="clear" w:color="auto" w:fill="F2F7FC"/>
             <w:vAlign w:val="center"/>
           </w:tcPr>
           <w:p>
@@ -7821,7 +7568,7 @@
             <w:tcBorders>
               <w:top w:val="nil"/>
               <w:left w:val="nil"/>
-              <w:bottom w:val="single" w:sz="4" w:color="BDD7EE"/>
+              <w:bottom w:val="single" w:sz="4" w:color="D9D9D9"/>
               <w:right w:val="nil"/>
             </w:tcBorders>
             <w:vAlign w:val="center"/>
@@ -7835,7 +7582,6 @@
             <w:r>
               <w:rPr>
                 <w:b/>
-                <w:color w:val="1F4E79"/>
                 <w:sz w:val="20"/>
               </w:rPr>
               <w:t>diagnostico</w:t>
@@ -7848,7 +7594,7 @@
             <w:tcBorders>
               <w:top w:val="nil"/>
               <w:left w:val="nil"/>
-              <w:bottom w:val="single" w:sz="4" w:color="BDD7EE"/>
+              <w:bottom w:val="single" w:sz="4" w:color="D9D9D9"/>
               <w:right w:val="nil"/>
             </w:tcBorders>
             <w:vAlign w:val="center"/>
@@ -7873,7 +7619,7 @@
             <w:tcBorders>
               <w:top w:val="nil"/>
               <w:left w:val="nil"/>
-              <w:bottom w:val="single" w:sz="4" w:color="BDD7EE"/>
+              <w:bottom w:val="single" w:sz="4" w:color="D9D9D9"/>
               <w:right w:val="nil"/>
             </w:tcBorders>
             <w:vAlign w:val="center"/>
@@ -7898,7 +7644,7 @@
             <w:tcBorders>
               <w:top w:val="nil"/>
               <w:left w:val="nil"/>
-              <w:bottom w:val="single" w:sz="4" w:color="BDD7EE"/>
+              <w:bottom w:val="single" w:sz="4" w:color="D9D9D9"/>
               <w:right w:val="nil"/>
             </w:tcBorders>
             <w:vAlign w:val="center"/>
@@ -7923,7 +7669,7 @@
             <w:tcBorders>
               <w:top w:val="nil"/>
               <w:left w:val="nil"/>
-              <w:bottom w:val="single" w:sz="4" w:color="BDD7EE"/>
+              <w:bottom w:val="single" w:sz="4" w:color="D9D9D9"/>
               <w:right w:val="nil"/>
             </w:tcBorders>
             <w:vAlign w:val="center"/>
@@ -7953,10 +7699,9 @@
             <w:tcBorders>
               <w:top w:val="nil"/>
               <w:left w:val="nil"/>
-              <w:bottom w:val="single" w:sz="4" w:color="BDD7EE"/>
+              <w:bottom w:val="single" w:sz="8" w:color="111111"/>
               <w:right w:val="nil"/>
             </w:tcBorders>
-            <w:shd w:val="clear" w:color="auto" w:fill="F2F7FC"/>
             <w:vAlign w:val="center"/>
           </w:tcPr>
           <w:p>
@@ -7967,7 +7712,6 @@
             <w:r>
               <w:rPr>
                 <w:b/>
-                <w:color w:val="1F4E79"/>
                 <w:sz w:val="20"/>
               </w:rPr>
               <w:t>tratamiento</w:t>
@@ -7980,10 +7724,9 @@
             <w:tcBorders>
               <w:top w:val="nil"/>
               <w:left w:val="nil"/>
-              <w:bottom w:val="single" w:sz="4" w:color="BDD7EE"/>
+              <w:bottom w:val="single" w:sz="8" w:color="111111"/>
               <w:right w:val="nil"/>
             </w:tcBorders>
-            <w:shd w:val="clear" w:color="auto" w:fill="F2F7FC"/>
             <w:vAlign w:val="center"/>
           </w:tcPr>
           <w:p>
@@ -8005,10 +7748,9 @@
             <w:tcBorders>
               <w:top w:val="nil"/>
               <w:left w:val="nil"/>
-              <w:bottom w:val="single" w:sz="4" w:color="BDD7EE"/>
+              <w:bottom w:val="single" w:sz="8" w:color="111111"/>
               <w:right w:val="nil"/>
             </w:tcBorders>
-            <w:shd w:val="clear" w:color="auto" w:fill="F2F7FC"/>
             <w:vAlign w:val="center"/>
           </w:tcPr>
           <w:p>
@@ -8030,10 +7772,9 @@
             <w:tcBorders>
               <w:top w:val="nil"/>
               <w:left w:val="nil"/>
-              <w:bottom w:val="single" w:sz="4" w:color="BDD7EE"/>
+              <w:bottom w:val="single" w:sz="8" w:color="111111"/>
               <w:right w:val="nil"/>
             </w:tcBorders>
-            <w:shd w:val="clear" w:color="auto" w:fill="F2F7FC"/>
             <w:vAlign w:val="center"/>
           </w:tcPr>
           <w:p>
@@ -8055,10 +7796,9 @@
             <w:tcBorders>
               <w:top w:val="nil"/>
               <w:left w:val="nil"/>
-              <w:bottom w:val="single" w:sz="4" w:color="BDD7EE"/>
+              <w:bottom w:val="single" w:sz="8" w:color="111111"/>
               <w:right w:val="nil"/>
             </w:tcBorders>
-            <w:shd w:val="clear" w:color="auto" w:fill="F2F7FC"/>
             <w:vAlign w:val="center"/>
           </w:tcPr>
           <w:p>
@@ -8134,11 +7874,10 @@
         <w:tc>
           <w:tcPr>
             <w:tcW w:type="dxa" w:w="2211"/>
-            <w:shd w:val="clear" w:color="auto" w:fill="1F4E79"/>
             <w:tcBorders>
-              <w:top w:val="nil"/>
+              <w:top w:val="single" w:sz="12" w:color="111111"/>
               <w:left w:val="nil"/>
-              <w:bottom w:val="nil"/>
+              <w:bottom w:val="single" w:sz="8" w:color="111111"/>
               <w:right w:val="nil"/>
             </w:tcBorders>
           </w:tcPr>
@@ -8151,7 +7890,6 @@
             <w:r>
               <w:rPr>
                 <w:b/>
-                <w:color w:val="FFFFFF"/>
                 <w:sz w:val="20"/>
               </w:rPr>
               <w:t>Campo</w:t>
@@ -8161,11 +7899,10 @@
         <w:tc>
           <w:tcPr>
             <w:tcW w:type="dxa" w:w="1304"/>
-            <w:shd w:val="clear" w:color="auto" w:fill="1F4E79"/>
             <w:tcBorders>
-              <w:top w:val="nil"/>
+              <w:top w:val="single" w:sz="12" w:color="111111"/>
               <w:left w:val="nil"/>
-              <w:bottom w:val="nil"/>
+              <w:bottom w:val="single" w:sz="8" w:color="111111"/>
               <w:right w:val="nil"/>
             </w:tcBorders>
           </w:tcPr>
@@ -8178,7 +7915,6 @@
             <w:r>
               <w:rPr>
                 <w:b/>
-                <w:color w:val="FFFFFF"/>
                 <w:sz w:val="20"/>
               </w:rPr>
               <w:t>Tipo</w:t>
@@ -8188,11 +7924,10 @@
         <w:tc>
           <w:tcPr>
             <w:tcW w:type="dxa" w:w="850"/>
-            <w:shd w:val="clear" w:color="auto" w:fill="1F4E79"/>
             <w:tcBorders>
-              <w:top w:val="nil"/>
+              <w:top w:val="single" w:sz="12" w:color="111111"/>
               <w:left w:val="nil"/>
-              <w:bottom w:val="nil"/>
+              <w:bottom w:val="single" w:sz="8" w:color="111111"/>
               <w:right w:val="nil"/>
             </w:tcBorders>
           </w:tcPr>
@@ -8205,7 +7940,6 @@
             <w:r>
               <w:rPr>
                 <w:b/>
-                <w:color w:val="FFFFFF"/>
                 <w:sz w:val="20"/>
               </w:rPr>
               <w:t>Long.</w:t>
@@ -8215,11 +7949,10 @@
         <w:tc>
           <w:tcPr>
             <w:tcW w:type="dxa" w:w="2154"/>
-            <w:shd w:val="clear" w:color="auto" w:fill="1F4E79"/>
             <w:tcBorders>
-              <w:top w:val="nil"/>
+              <w:top w:val="single" w:sz="12" w:color="111111"/>
               <w:left w:val="nil"/>
-              <w:bottom w:val="nil"/>
+              <w:bottom w:val="single" w:sz="8" w:color="111111"/>
               <w:right w:val="nil"/>
             </w:tcBorders>
           </w:tcPr>
@@ -8232,7 +7965,6 @@
             <w:r>
               <w:rPr>
                 <w:b/>
-                <w:color w:val="FFFFFF"/>
                 <w:sz w:val="20"/>
               </w:rPr>
               <w:t>Restricciones</w:t>
@@ -8242,11 +7974,10 @@
         <w:tc>
           <w:tcPr>
             <w:tcW w:type="dxa" w:w="2835"/>
-            <w:shd w:val="clear" w:color="auto" w:fill="1F4E79"/>
             <w:tcBorders>
-              <w:top w:val="nil"/>
+              <w:top w:val="single" w:sz="12" w:color="111111"/>
               <w:left w:val="nil"/>
-              <w:bottom w:val="nil"/>
+              <w:bottom w:val="single" w:sz="8" w:color="111111"/>
               <w:right w:val="nil"/>
             </w:tcBorders>
           </w:tcPr>
@@ -8259,7 +7990,6 @@
             <w:r>
               <w:rPr>
                 <w:b/>
-                <w:color w:val="FFFFFF"/>
                 <w:sz w:val="20"/>
               </w:rPr>
               <w:t>Descripción</w:t>
@@ -8277,7 +8007,7 @@
             <w:tcBorders>
               <w:top w:val="nil"/>
               <w:left w:val="nil"/>
-              <w:bottom w:val="single" w:sz="4" w:color="BDD7EE"/>
+              <w:bottom w:val="single" w:sz="4" w:color="D9D9D9"/>
               <w:right w:val="nil"/>
             </w:tcBorders>
             <w:vAlign w:val="center"/>
@@ -8291,7 +8021,6 @@
             <w:r>
               <w:rPr>
                 <w:b/>
-                <w:color w:val="1F4E79"/>
                 <w:sz w:val="20"/>
               </w:rPr>
               <w:t>idBitacora</w:t>
@@ -8304,7 +8033,7 @@
             <w:tcBorders>
               <w:top w:val="nil"/>
               <w:left w:val="nil"/>
-              <w:bottom w:val="single" w:sz="4" w:color="BDD7EE"/>
+              <w:bottom w:val="single" w:sz="4" w:color="D9D9D9"/>
               <w:right w:val="nil"/>
             </w:tcBorders>
             <w:vAlign w:val="center"/>
@@ -8329,7 +8058,7 @@
             <w:tcBorders>
               <w:top w:val="nil"/>
               <w:left w:val="nil"/>
-              <w:bottom w:val="single" w:sz="4" w:color="BDD7EE"/>
+              <w:bottom w:val="single" w:sz="4" w:color="D9D9D9"/>
               <w:right w:val="nil"/>
             </w:tcBorders>
             <w:vAlign w:val="center"/>
@@ -8353,7 +8082,7 @@
             <w:tcBorders>
               <w:top w:val="nil"/>
               <w:left w:val="nil"/>
-              <w:bottom w:val="single" w:sz="4" w:color="BDD7EE"/>
+              <w:bottom w:val="single" w:sz="4" w:color="D9D9D9"/>
               <w:right w:val="nil"/>
             </w:tcBorders>
             <w:vAlign w:val="center"/>
@@ -8378,7 +8107,7 @@
             <w:tcBorders>
               <w:top w:val="nil"/>
               <w:left w:val="nil"/>
-              <w:bottom w:val="single" w:sz="4" w:color="BDD7EE"/>
+              <w:bottom w:val="single" w:sz="4" w:color="D9D9D9"/>
               <w:right w:val="nil"/>
             </w:tcBorders>
             <w:vAlign w:val="center"/>
@@ -8408,10 +8137,9 @@
             <w:tcBorders>
               <w:top w:val="nil"/>
               <w:left w:val="nil"/>
-              <w:bottom w:val="single" w:sz="4" w:color="BDD7EE"/>
+              <w:bottom w:val="single" w:sz="4" w:color="D9D9D9"/>
               <w:right w:val="nil"/>
             </w:tcBorders>
-            <w:shd w:val="clear" w:color="auto" w:fill="F2F7FC"/>
             <w:vAlign w:val="center"/>
           </w:tcPr>
           <w:p>
@@ -8423,7 +8151,6 @@
             <w:r>
               <w:rPr>
                 <w:b/>
-                <w:color w:val="1F4E79"/>
                 <w:sz w:val="20"/>
               </w:rPr>
               <w:t>usuario</w:t>
@@ -8436,10 +8163,9 @@
             <w:tcBorders>
               <w:top w:val="nil"/>
               <w:left w:val="nil"/>
-              <w:bottom w:val="single" w:sz="4" w:color="BDD7EE"/>
+              <w:bottom w:val="single" w:sz="4" w:color="D9D9D9"/>
               <w:right w:val="nil"/>
             </w:tcBorders>
-            <w:shd w:val="clear" w:color="auto" w:fill="F2F7FC"/>
             <w:vAlign w:val="center"/>
           </w:tcPr>
           <w:p>
@@ -8462,10 +8188,9 @@
             <w:tcBorders>
               <w:top w:val="nil"/>
               <w:left w:val="nil"/>
-              <w:bottom w:val="single" w:sz="4" w:color="BDD7EE"/>
+              <w:bottom w:val="single" w:sz="4" w:color="D9D9D9"/>
               <w:right w:val="nil"/>
             </w:tcBorders>
-            <w:shd w:val="clear" w:color="auto" w:fill="F2F7FC"/>
             <w:vAlign w:val="center"/>
           </w:tcPr>
           <w:p>
@@ -8488,10 +8213,9 @@
             <w:tcBorders>
               <w:top w:val="nil"/>
               <w:left w:val="nil"/>
-              <w:bottom w:val="single" w:sz="4" w:color="BDD7EE"/>
+              <w:bottom w:val="single" w:sz="4" w:color="D9D9D9"/>
               <w:right w:val="nil"/>
             </w:tcBorders>
-            <w:shd w:val="clear" w:color="auto" w:fill="F2F7FC"/>
             <w:vAlign w:val="center"/>
           </w:tcPr>
           <w:p>
@@ -8514,10 +8238,9 @@
             <w:tcBorders>
               <w:top w:val="nil"/>
               <w:left w:val="nil"/>
-              <w:bottom w:val="single" w:sz="4" w:color="BDD7EE"/>
+              <w:bottom w:val="single" w:sz="4" w:color="D9D9D9"/>
               <w:right w:val="nil"/>
             </w:tcBorders>
-            <w:shd w:val="clear" w:color="auto" w:fill="F2F7FC"/>
             <w:vAlign w:val="center"/>
           </w:tcPr>
           <w:p>
@@ -8545,7 +8268,7 @@
             <w:tcBorders>
               <w:top w:val="nil"/>
               <w:left w:val="nil"/>
-              <w:bottom w:val="single" w:sz="4" w:color="BDD7EE"/>
+              <w:bottom w:val="single" w:sz="4" w:color="D9D9D9"/>
               <w:right w:val="nil"/>
             </w:tcBorders>
             <w:vAlign w:val="center"/>
@@ -8559,7 +8282,6 @@
             <w:r>
               <w:rPr>
                 <w:b/>
-                <w:color w:val="1F4E79"/>
                 <w:sz w:val="20"/>
               </w:rPr>
               <w:t>accion</w:t>
@@ -8572,7 +8294,7 @@
             <w:tcBorders>
               <w:top w:val="nil"/>
               <w:left w:val="nil"/>
-              <w:bottom w:val="single" w:sz="4" w:color="BDD7EE"/>
+              <w:bottom w:val="single" w:sz="4" w:color="D9D9D9"/>
               <w:right w:val="nil"/>
             </w:tcBorders>
             <w:vAlign w:val="center"/>
@@ -8597,7 +8319,7 @@
             <w:tcBorders>
               <w:top w:val="nil"/>
               <w:left w:val="nil"/>
-              <w:bottom w:val="single" w:sz="4" w:color="BDD7EE"/>
+              <w:bottom w:val="single" w:sz="4" w:color="D9D9D9"/>
               <w:right w:val="nil"/>
             </w:tcBorders>
             <w:vAlign w:val="center"/>
@@ -8622,7 +8344,7 @@
             <w:tcBorders>
               <w:top w:val="nil"/>
               <w:left w:val="nil"/>
-              <w:bottom w:val="single" w:sz="4" w:color="BDD7EE"/>
+              <w:bottom w:val="single" w:sz="4" w:color="D9D9D9"/>
               <w:right w:val="nil"/>
             </w:tcBorders>
             <w:vAlign w:val="center"/>
@@ -8647,7 +8369,7 @@
             <w:tcBorders>
               <w:top w:val="nil"/>
               <w:left w:val="nil"/>
-              <w:bottom w:val="single" w:sz="4" w:color="BDD7EE"/>
+              <w:bottom w:val="single" w:sz="4" w:color="D9D9D9"/>
               <w:right w:val="nil"/>
             </w:tcBorders>
             <w:vAlign w:val="center"/>
@@ -8677,10 +8399,9 @@
             <w:tcBorders>
               <w:top w:val="nil"/>
               <w:left w:val="nil"/>
-              <w:bottom w:val="single" w:sz="4" w:color="BDD7EE"/>
+              <w:bottom w:val="single" w:sz="8" w:color="111111"/>
               <w:right w:val="nil"/>
             </w:tcBorders>
-            <w:shd w:val="clear" w:color="auto" w:fill="F2F7FC"/>
             <w:vAlign w:val="center"/>
           </w:tcPr>
           <w:p>
@@ -8691,7 +8412,6 @@
             <w:r>
               <w:rPr>
                 <w:b/>
-                <w:color w:val="1F4E79"/>
                 <w:sz w:val="20"/>
               </w:rPr>
               <w:t>fecha</w:t>
@@ -8704,10 +8424,9 @@
             <w:tcBorders>
               <w:top w:val="nil"/>
               <w:left w:val="nil"/>
-              <w:bottom w:val="single" w:sz="4" w:color="BDD7EE"/>
+              <w:bottom w:val="single" w:sz="8" w:color="111111"/>
               <w:right w:val="nil"/>
             </w:tcBorders>
-            <w:shd w:val="clear" w:color="auto" w:fill="F2F7FC"/>
             <w:vAlign w:val="center"/>
           </w:tcPr>
           <w:p>
@@ -8729,10 +8448,9 @@
             <w:tcBorders>
               <w:top w:val="nil"/>
               <w:left w:val="nil"/>
-              <w:bottom w:val="single" w:sz="4" w:color="BDD7EE"/>
+              <w:bottom w:val="single" w:sz="8" w:color="111111"/>
               <w:right w:val="nil"/>
             </w:tcBorders>
-            <w:shd w:val="clear" w:color="auto" w:fill="F2F7FC"/>
             <w:vAlign w:val="center"/>
           </w:tcPr>
           <w:p>
@@ -8753,10 +8471,9 @@
             <w:tcBorders>
               <w:top w:val="nil"/>
               <w:left w:val="nil"/>
-              <w:bottom w:val="single" w:sz="4" w:color="BDD7EE"/>
+              <w:bottom w:val="single" w:sz="8" w:color="111111"/>
               <w:right w:val="nil"/>
             </w:tcBorders>
-            <w:shd w:val="clear" w:color="auto" w:fill="F2F7FC"/>
             <w:vAlign w:val="center"/>
           </w:tcPr>
           <w:p>
@@ -8778,10 +8495,9 @@
             <w:tcBorders>
               <w:top w:val="nil"/>
               <w:left w:val="nil"/>
-              <w:bottom w:val="single" w:sz="4" w:color="BDD7EE"/>
+              <w:bottom w:val="single" w:sz="8" w:color="111111"/>
               <w:right w:val="nil"/>
             </w:tcBorders>
-            <w:shd w:val="clear" w:color="auto" w:fill="F2F7FC"/>
             <w:vAlign w:val="center"/>
           </w:tcPr>
           <w:p>
@@ -8818,7 +8534,7 @@
     <w:pPr>
       <w:pStyle w:val="Footer"/>
       <w:pBdr>
-        <w:top w:val="single" w:sz="6" w:space="6" w:color="BDD7EE"/>
+        <w:top w:val="single" w:sz="4" w:space="6" w:color="BFBFBF"/>
       </w:pBdr>
     </w:pPr>
     <w:r>
@@ -8845,7 +8561,7 @@
     <w:r>
       <w:rPr>
         <w:b/>
-        <w:color w:val="1F4E79"/>
+        <w:color w:val="111111"/>
         <w:sz w:val="18"/>
       </w:rPr>
       <w:fldChar w:fldCharType="begin"/>
@@ -8864,13 +8580,13 @@
     <w:pPr>
       <w:pStyle w:val="Header"/>
       <w:pBdr>
-        <w:bottom w:val="single" w:sz="6" w:space="4" w:color="BDD7EE"/>
+        <w:bottom w:val="single" w:sz="4" w:space="4" w:color="BFBFBF"/>
       </w:pBdr>
     </w:pPr>
     <w:r>
       <w:rPr>
         <w:b/>
-        <w:color w:val="1F4E79"/>
+        <w:color w:val="111111"/>
         <w:sz w:val="18"/>
       </w:rPr>
       <w:t>Clínica MiniPtc</w:t>
@@ -9322,7 +9038,7 @@
       <w:rFonts w:ascii="Calibri" w:hAnsi="Calibri" w:cs="Calibri" w:eastAsia="Calibri"/>
       <w:b/>
       <w:bCs/>
-      <w:color w:val="1F4E79"/>
+      <w:color w:val="111111"/>
       <w:sz w:val="44"/>
       <w:szCs w:val="28"/>
     </w:rPr>
@@ -9346,7 +9062,7 @@
       <w:rFonts w:ascii="Calibri" w:hAnsi="Calibri" w:cs="Calibri" w:eastAsia="Calibri"/>
       <w:b/>
       <w:bCs/>
-      <w:color w:val="2E75B6"/>
+      <w:color w:val="595959"/>
       <w:sz w:val="27"/>
       <w:szCs w:val="26"/>
     </w:rPr>
@@ -9370,7 +9086,7 @@
       <w:rFonts w:ascii="Calibri" w:hAnsi="Calibri" w:cs="Calibri" w:eastAsia="Calibri"/>
       <w:b/>
       <w:bCs/>
-      <w:color w:val="1F4E79"/>
+      <w:color w:val="111111"/>
       <w:sz w:val="24"/>
     </w:rPr>
   </w:style>

</xml_diff>

<commit_message>
Quitar pies de figura de la documentación
Co-Authored-By: Claude Opus 5.5 <noreply@anthropic.com>
Claude-Session: https://claude.ai/code/session_01WUZ6iRk4AHLpaQU9ro5Qut
</commit_message>
<xml_diff>
--- a/ClinicaMiniPtc/Documentacion/Documentacion_ClinicaMiniPtc.docx
+++ b/ClinicaMiniPtc/Documentacion/Documentacion_ClinicaMiniPtc.docx
@@ -552,8 +552,7 @@
     </w:p>
     <w:p>
       <w:pPr>
-        <w:keepNext/>
-        <w:spacing w:after="80"/>
+        <w:spacing w:after="280"/>
         <w:jc w:val="center"/>
       </w:pPr>
       <w:r>
@@ -593,28 +592,6 @@
     </w:p>
     <w:p>
       <w:pPr>
-        <w:spacing w:after="280"/>
-        <w:jc w:val="center"/>
-      </w:pPr>
-      <w:r>
-        <w:rPr>
-          <w:b/>
-          <w:color w:val="111111"/>
-          <w:sz w:val="19"/>
-        </w:rPr>
-        <w:t xml:space="preserve">Figura 1. </w:t>
-      </w:r>
-      <w:r>
-        <w:rPr>
-          <w:i/>
-          <w:color w:val="595959"/>
-          <w:sz w:val="19"/>
-        </w:rPr>
-        <w:t>Casos de uso del rol Recepcionista.</w:t>
-      </w:r>
-    </w:p>
-    <w:p>
-      <w:pPr>
         <w:pStyle w:val="Heading2"/>
       </w:pPr>
       <w:r>
@@ -623,8 +600,7 @@
     </w:p>
     <w:p>
       <w:pPr>
-        <w:keepNext/>
-        <w:spacing w:after="80"/>
+        <w:spacing w:after="280"/>
         <w:jc w:val="center"/>
       </w:pPr>
       <w:r>
@@ -664,28 +640,6 @@
     </w:p>
     <w:p>
       <w:pPr>
-        <w:spacing w:after="280"/>
-        <w:jc w:val="center"/>
-      </w:pPr>
-      <w:r>
-        <w:rPr>
-          <w:b/>
-          <w:color w:val="111111"/>
-          <w:sz w:val="19"/>
-        </w:rPr>
-        <w:t xml:space="preserve">Figura 2. </w:t>
-      </w:r>
-      <w:r>
-        <w:rPr>
-          <w:i/>
-          <w:color w:val="595959"/>
-          <w:sz w:val="19"/>
-        </w:rPr>
-        <w:t>Casos de uso del rol Médico.</w:t>
-      </w:r>
-    </w:p>
-    <w:p>
-      <w:pPr>
         <w:pStyle w:val="Heading2"/>
       </w:pPr>
       <w:r>
@@ -694,8 +648,7 @@
     </w:p>
     <w:p>
       <w:pPr>
-        <w:keepNext/>
-        <w:spacing w:after="80"/>
+        <w:spacing w:after="280"/>
         <w:jc w:val="center"/>
       </w:pPr>
       <w:r>
@@ -735,28 +688,6 @@
     </w:p>
     <w:p>
       <w:pPr>
-        <w:spacing w:after="280"/>
-        <w:jc w:val="center"/>
-      </w:pPr>
-      <w:r>
-        <w:rPr>
-          <w:b/>
-          <w:color w:val="111111"/>
-          <w:sz w:val="19"/>
-        </w:rPr>
-        <w:t xml:space="preserve">Figura 3. </w:t>
-      </w:r>
-      <w:r>
-        <w:rPr>
-          <w:i/>
-          <w:color w:val="595959"/>
-          <w:sz w:val="19"/>
-        </w:rPr>
-        <w:t>Casos de uso del rol Administrador.</w:t>
-      </w:r>
-    </w:p>
-    <w:p>
-      <w:pPr>
         <w:pStyle w:val="Heading1"/>
         <w:pageBreakBefore/>
         <w:pBdr>
@@ -788,8 +719,7 @@
     </w:p>
     <w:p>
       <w:pPr>
-        <w:keepNext/>
-        <w:spacing w:after="80"/>
+        <w:spacing w:after="280"/>
         <w:jc w:val="center"/>
       </w:pPr>
       <w:r>
@@ -825,28 +755,6 @@
             </a:graphic>
           </wp:inline>
         </w:drawing>
-      </w:r>
-    </w:p>
-    <w:p>
-      <w:pPr>
-        <w:spacing w:after="280"/>
-        <w:jc w:val="center"/>
-      </w:pPr>
-      <w:r>
-        <w:rPr>
-          <w:b/>
-          <w:color w:val="111111"/>
-          <w:sz w:val="19"/>
-        </w:rPr>
-        <w:t xml:space="preserve">Figura 4. </w:t>
-      </w:r>
-      <w:r>
-        <w:rPr>
-          <w:i/>
-          <w:color w:val="595959"/>
-          <w:sz w:val="19"/>
-        </w:rPr>
-        <w:t>Diagrama Entidad-Relación de ClinicaMiniPtcDB.</w:t>
       </w:r>
     </w:p>
     <w:p>

</xml_diff>

<commit_message>
Casos de uso en draw.io en blanco y negro con notación UML
Co-Authored-By: Claude Opus 5.5 <noreply@anthropic.com>
Claude-Session: https://claude.ai/code/session_01WUZ6iRk4AHLpaQU9ro5Qut
</commit_message>
<xml_diff>
--- a/ClinicaMiniPtc/Documentacion/Documentacion_ClinicaMiniPtc.docx
+++ b/ClinicaMiniPtc/Documentacion/Documentacion_ClinicaMiniPtc.docx
@@ -558,7 +558,7 @@
       <w:r>
         <w:drawing>
           <wp:inline xmlns:a="http://schemas.openxmlformats.org/drawingml/2006/main" xmlns:pic="http://schemas.openxmlformats.org/drawingml/2006/picture">
-            <wp:extent cx="5040000" cy="3098572"/>
+            <wp:extent cx="5040000" cy="2638209"/>
             <wp:docPr id="2" name="Picture 2"/>
             <wp:cNvGraphicFramePr>
               <a:graphicFrameLocks noChangeAspect="1"/>
@@ -579,7 +579,7 @@
                   <pic:spPr>
                     <a:xfrm>
                       <a:off x="0" y="0"/>
-                      <a:ext cx="5040000" cy="3098572"/>
+                      <a:ext cx="5040000" cy="2638209"/>
                     </a:xfrm>
                     <a:prstGeom prst="rect"/>
                   </pic:spPr>
@@ -606,7 +606,7 @@
       <w:r>
         <w:drawing>
           <wp:inline xmlns:a="http://schemas.openxmlformats.org/drawingml/2006/main" xmlns:pic="http://schemas.openxmlformats.org/drawingml/2006/picture">
-            <wp:extent cx="4680000" cy="3301072"/>
+            <wp:extent cx="4680000" cy="2511344"/>
             <wp:docPr id="3" name="Picture 3"/>
             <wp:cNvGraphicFramePr>
               <a:graphicFrameLocks noChangeAspect="1"/>
@@ -627,7 +627,7 @@
                   <pic:spPr>
                     <a:xfrm>
                       <a:off x="0" y="0"/>
-                      <a:ext cx="4680000" cy="3301072"/>
+                      <a:ext cx="4680000" cy="2511344"/>
                     </a:xfrm>
                     <a:prstGeom prst="rect"/>
                   </pic:spPr>
@@ -654,7 +654,7 @@
       <w:r>
         <w:drawing>
           <wp:inline xmlns:a="http://schemas.openxmlformats.org/drawingml/2006/main" xmlns:pic="http://schemas.openxmlformats.org/drawingml/2006/picture">
-            <wp:extent cx="4500000" cy="5604950"/>
+            <wp:extent cx="4500000" cy="3959168"/>
             <wp:docPr id="4" name="Picture 4"/>
             <wp:cNvGraphicFramePr>
               <a:graphicFrameLocks noChangeAspect="1"/>
@@ -675,7 +675,7 @@
                   <pic:spPr>
                     <a:xfrm>
                       <a:off x="0" y="0"/>
-                      <a:ext cx="4500000" cy="5604950"/>
+                      <a:ext cx="4500000" cy="3959168"/>
                     </a:xfrm>
                     <a:prstGeom prst="rect"/>
                   </pic:spPr>

</xml_diff>

<commit_message>
Casos de uso en draw.io con el estilo del ejemplo (colores e include/extend)
Co-Authored-By: Claude Opus 5.5 <noreply@anthropic.com>
Claude-Session: https://claude.ai/code/session_01WUZ6iRk4AHLpaQU9ro5Qut
</commit_message>
<xml_diff>
--- a/ClinicaMiniPtc/Documentacion/Documentacion_ClinicaMiniPtc.docx
+++ b/ClinicaMiniPtc/Documentacion/Documentacion_ClinicaMiniPtc.docx
@@ -558,7 +558,7 @@
       <w:r>
         <w:drawing>
           <wp:inline xmlns:a="http://schemas.openxmlformats.org/drawingml/2006/main" xmlns:pic="http://schemas.openxmlformats.org/drawingml/2006/picture">
-            <wp:extent cx="5040000" cy="2638209"/>
+            <wp:extent cx="5400000" cy="3623301"/>
             <wp:docPr id="2" name="Picture 2"/>
             <wp:cNvGraphicFramePr>
               <a:graphicFrameLocks noChangeAspect="1"/>
@@ -579,7 +579,7 @@
                   <pic:spPr>
                     <a:xfrm>
                       <a:off x="0" y="0"/>
-                      <a:ext cx="5040000" cy="2638209"/>
+                      <a:ext cx="5400000" cy="3623301"/>
                     </a:xfrm>
                     <a:prstGeom prst="rect"/>
                   </pic:spPr>
@@ -606,7 +606,7 @@
       <w:r>
         <w:drawing>
           <wp:inline xmlns:a="http://schemas.openxmlformats.org/drawingml/2006/main" xmlns:pic="http://schemas.openxmlformats.org/drawingml/2006/picture">
-            <wp:extent cx="4680000" cy="2511344"/>
+            <wp:extent cx="5400000" cy="3121595"/>
             <wp:docPr id="3" name="Picture 3"/>
             <wp:cNvGraphicFramePr>
               <a:graphicFrameLocks noChangeAspect="1"/>
@@ -627,7 +627,7 @@
                   <pic:spPr>
                     <a:xfrm>
                       <a:off x="0" y="0"/>
-                      <a:ext cx="4680000" cy="2511344"/>
+                      <a:ext cx="5400000" cy="3121595"/>
                     </a:xfrm>
                     <a:prstGeom prst="rect"/>
                   </pic:spPr>
@@ -654,7 +654,7 @@
       <w:r>
         <w:drawing>
           <wp:inline xmlns:a="http://schemas.openxmlformats.org/drawingml/2006/main" xmlns:pic="http://schemas.openxmlformats.org/drawingml/2006/picture">
-            <wp:extent cx="4500000" cy="3959168"/>
+            <wp:extent cx="5400000" cy="4205825"/>
             <wp:docPr id="4" name="Picture 4"/>
             <wp:cNvGraphicFramePr>
               <a:graphicFrameLocks noChangeAspect="1"/>
@@ -675,7 +675,7 @@
                   <pic:spPr>
                     <a:xfrm>
                       <a:off x="0" y="0"/>
-                      <a:ext cx="4500000" cy="3959168"/>
+                      <a:ext cx="5400000" cy="4205825"/>
                     </a:xfrm>
                     <a:prstGeom prst="rect"/>
                   </pic:spPr>

</xml_diff>

<commit_message>
Un solo diagrama de casos de uso con todos los actores
Co-Authored-By: Claude Opus 5.5 <noreply@anthropic.com>
Claude-Session: https://claude.ai/code/session_01WUZ6iRk4AHLpaQU9ro5Qut
</commit_message>
<xml_diff>
--- a/ClinicaMiniPtc/Documentacion/Documentacion_ClinicaMiniPtc.docx
+++ b/ClinicaMiniPtc/Documentacion/Documentacion_ClinicaMiniPtc.docx
@@ -520,7 +520,7 @@
           <w:b w:val="0"/>
           <w:i w:val="0"/>
         </w:rPr>
-        <w:t>En las siguientes secciones se presentan los diagramas de casos de uso de cada rol, el diagrama entidad-relación de la base de datos ClinicaMiniPtcDB y el diccionario de datos con la descripción de cada tabla.</w:t>
+        <w:t>En las siguientes secciones se presentan el diagrama de casos de uso, el diagrama entidad-relación de la base de datos ClinicaMiniPtcDB y el diccionario de datos con la descripción de cada tabla.</w:t>
       </w:r>
     </w:p>
     <w:p>
@@ -539,15 +539,19 @@
         <w:t xml:space="preserve">2.  </w:t>
       </w:r>
       <w:r>
-        <w:t>Diagramas de casos de uso</w:t>
+        <w:t>Diagrama de casos de uso</w:t>
       </w:r>
     </w:p>
     <w:p>
       <w:pPr>
-        <w:pStyle w:val="Heading2"/>
+        <w:jc w:val="both"/>
       </w:pPr>
       <w:r>
-        <w:t>2.1 Recepcionista</w:t>
+        <w:rPr>
+          <w:b w:val="0"/>
+          <w:i w:val="0"/>
+        </w:rPr>
+        <w:t>El diagrama muestra qué puede hacer cada actor dentro del sistema. Recepcionista, Médico y Administrador heredan de Usuario, por lo que todos pueden iniciar y cerrar sesión.</w:t>
       </w:r>
     </w:p>
     <w:p>
@@ -558,7 +562,7 @@
       <w:r>
         <w:drawing>
           <wp:inline xmlns:a="http://schemas.openxmlformats.org/drawingml/2006/main" xmlns:pic="http://schemas.openxmlformats.org/drawingml/2006/picture">
-            <wp:extent cx="5400000" cy="3623301"/>
+            <wp:extent cx="5580000" cy="6291609"/>
             <wp:docPr id="2" name="Picture 2"/>
             <wp:cNvGraphicFramePr>
               <a:graphicFrameLocks noChangeAspect="1"/>
@@ -567,7 +571,7 @@
               <a:graphicData uri="http://schemas.openxmlformats.org/drawingml/2006/picture">
                 <pic:pic>
                   <pic:nvPicPr>
-                    <pic:cNvPr id="0" name="cu_recepcionista.png"/>
+                    <pic:cNvPr id="0" name="cu_unico.png"/>
                     <pic:cNvPicPr/>
                   </pic:nvPicPr>
                   <pic:blipFill>
@@ -579,103 +583,7 @@
                   <pic:spPr>
                     <a:xfrm>
                       <a:off x="0" y="0"/>
-                      <a:ext cx="5400000" cy="3623301"/>
-                    </a:xfrm>
-                    <a:prstGeom prst="rect"/>
-                  </pic:spPr>
-                </pic:pic>
-              </a:graphicData>
-            </a:graphic>
-          </wp:inline>
-        </w:drawing>
-      </w:r>
-    </w:p>
-    <w:p>
-      <w:pPr>
-        <w:pStyle w:val="Heading2"/>
-      </w:pPr>
-      <w:r>
-        <w:t>2.2 Médico</w:t>
-      </w:r>
-    </w:p>
-    <w:p>
-      <w:pPr>
-        <w:spacing w:after="280"/>
-        <w:jc w:val="center"/>
-      </w:pPr>
-      <w:r>
-        <w:drawing>
-          <wp:inline xmlns:a="http://schemas.openxmlformats.org/drawingml/2006/main" xmlns:pic="http://schemas.openxmlformats.org/drawingml/2006/picture">
-            <wp:extent cx="5400000" cy="3121595"/>
-            <wp:docPr id="3" name="Picture 3"/>
-            <wp:cNvGraphicFramePr>
-              <a:graphicFrameLocks noChangeAspect="1"/>
-            </wp:cNvGraphicFramePr>
-            <a:graphic>
-              <a:graphicData uri="http://schemas.openxmlformats.org/drawingml/2006/picture">
-                <pic:pic>
-                  <pic:nvPicPr>
-                    <pic:cNvPr id="0" name="cu_medico.png"/>
-                    <pic:cNvPicPr/>
-                  </pic:nvPicPr>
-                  <pic:blipFill>
-                    <a:blip r:embed="rId13"/>
-                    <a:stretch>
-                      <a:fillRect/>
-                    </a:stretch>
-                  </pic:blipFill>
-                  <pic:spPr>
-                    <a:xfrm>
-                      <a:off x="0" y="0"/>
-                      <a:ext cx="5400000" cy="3121595"/>
-                    </a:xfrm>
-                    <a:prstGeom prst="rect"/>
-                  </pic:spPr>
-                </pic:pic>
-              </a:graphicData>
-            </a:graphic>
-          </wp:inline>
-        </w:drawing>
-      </w:r>
-    </w:p>
-    <w:p>
-      <w:pPr>
-        <w:pStyle w:val="Heading2"/>
-      </w:pPr>
-      <w:r>
-        <w:t>2.3 Administrador</w:t>
-      </w:r>
-    </w:p>
-    <w:p>
-      <w:pPr>
-        <w:spacing w:after="280"/>
-        <w:jc w:val="center"/>
-      </w:pPr>
-      <w:r>
-        <w:drawing>
-          <wp:inline xmlns:a="http://schemas.openxmlformats.org/drawingml/2006/main" xmlns:pic="http://schemas.openxmlformats.org/drawingml/2006/picture">
-            <wp:extent cx="5400000" cy="4205825"/>
-            <wp:docPr id="4" name="Picture 4"/>
-            <wp:cNvGraphicFramePr>
-              <a:graphicFrameLocks noChangeAspect="1"/>
-            </wp:cNvGraphicFramePr>
-            <a:graphic>
-              <a:graphicData uri="http://schemas.openxmlformats.org/drawingml/2006/picture">
-                <pic:pic>
-                  <pic:nvPicPr>
-                    <pic:cNvPr id="0" name="cu_administrador.png"/>
-                    <pic:cNvPicPr/>
-                  </pic:nvPicPr>
-                  <pic:blipFill>
-                    <a:blip r:embed="rId14"/>
-                    <a:stretch>
-                      <a:fillRect/>
-                    </a:stretch>
-                  </pic:blipFill>
-                  <pic:spPr>
-                    <a:xfrm>
-                      <a:off x="0" y="0"/>
-                      <a:ext cx="5400000" cy="4205825"/>
+                      <a:ext cx="5580000" cy="6291609"/>
                     </a:xfrm>
                     <a:prstGeom prst="rect"/>
                   </pic:spPr>
@@ -726,7 +634,7 @@
         <w:drawing>
           <wp:inline xmlns:a="http://schemas.openxmlformats.org/drawingml/2006/main" xmlns:pic="http://schemas.openxmlformats.org/drawingml/2006/picture">
             <wp:extent cx="5760000" cy="6112653"/>
-            <wp:docPr id="5" name="Picture 5"/>
+            <wp:docPr id="3" name="Picture 3"/>
             <wp:cNvGraphicFramePr>
               <a:graphicFrameLocks noChangeAspect="1"/>
             </wp:cNvGraphicFramePr>
@@ -738,7 +646,7 @@
                     <pic:cNvPicPr/>
                   </pic:nvPicPr>
                   <pic:blipFill>
-                    <a:blip r:embed="rId15"/>
+                    <a:blip r:embed="rId13"/>
                     <a:stretch>
                       <a:fillRect/>
                     </a:stretch>

</xml_diff>